<commit_message>
Testplan aangemaakt en Requirement Analyse geupdate
</commit_message>
<xml_diff>
--- a/Opleverset_Project_5-6/Verslagen/Requirement analyse.docx
+++ b/Opleverset_Project_5-6/Verslagen/Requirement analyse.docx
@@ -38,6 +38,9 @@
     <w:p/>
     <w:p>
       <w:r>
+        <w:rPr>
+          <w:noProof/>
+        </w:rPr>
         <w:drawing>
           <wp:inline distT="0" distB="0" distL="0" distR="0" wp14:anchorId="129720BA" wp14:editId="445DCC66">
             <wp:extent cx="5247409" cy="3492667"/>
@@ -111,21 +114,10 @@
       </w:r>
     </w:p>
     <w:p>
-      <w:pPr>
-        <w:rPr>
-          <w:lang w:val="nl-NL"/>
-        </w:rPr>
-      </w:pPr>
-      <w:r>
-        <w:rPr>
-          <w:lang w:val="nl-NL"/>
-        </w:rPr>
+      <w:r>
         <w:t>Fabio Wolthuis</w:t>
       </w:r>
       <w:r>
-        <w:rPr>
-          <w:lang w:val="nl-NL"/>
-        </w:rPr>
         <w:tab/>
         <w:t>1093379</w:t>
       </w:r>
@@ -152,6 +144,16 @@
     </w:p>
     <w:sdt>
       <w:sdtPr>
+        <w:rPr>
+          <w:rFonts w:asciiTheme="minorHAnsi" w:eastAsiaTheme="minorHAnsi" w:hAnsiTheme="minorHAnsi" w:cstheme="minorBidi"/>
+          <w:b w:val="0"/>
+          <w:bCs w:val="0"/>
+          <w:color w:val="auto"/>
+          <w:kern w:val="2"/>
+          <w:sz w:val="24"/>
+          <w:szCs w:val="24"/>
+          <w14:ligatures w14:val="standardContextual"/>
+        </w:rPr>
         <w:id w:val="-770232012"/>
         <w:docPartObj>
           <w:docPartGallery w:val="Table of Contents"/>
@@ -160,19 +162,13 @@
       </w:sdtPr>
       <w:sdtEndPr>
         <w:rPr>
-          <w:rFonts w:asciiTheme="minorHAnsi" w:eastAsiaTheme="minorHAnsi" w:hAnsiTheme="minorHAnsi" w:cstheme="minorBidi"/>
           <w:noProof/>
-          <w:color w:val="auto"/>
-          <w:kern w:val="2"/>
-          <w:sz w:val="24"/>
-          <w:szCs w:val="24"/>
-          <w14:ligatures w14:val="standardContextual"/>
         </w:rPr>
       </w:sdtEndPr>
       <w:sdtContent>
         <w:p>
           <w:pPr>
-            <w:pStyle w:val="TOCHeading"/>
+            <w:pStyle w:val="Kopvaninhoudsopgave"/>
           </w:pPr>
           <w:proofErr w:type="spellStart"/>
           <w:r>
@@ -182,7 +178,7 @@
         </w:p>
         <w:p>
           <w:pPr>
-            <w:pStyle w:val="TOC1"/>
+            <w:pStyle w:val="Inhopg1"/>
             <w:tabs>
               <w:tab w:val="right" w:leader="dot" w:pos="9350"/>
             </w:tabs>
@@ -270,7 +266,7 @@
         </w:p>
         <w:p>
           <w:pPr>
-            <w:pStyle w:val="TOC1"/>
+            <w:pStyle w:val="Inhopg1"/>
             <w:tabs>
               <w:tab w:val="right" w:leader="dot" w:pos="9350"/>
             </w:tabs>
@@ -341,7 +337,7 @@
         </w:p>
         <w:p>
           <w:pPr>
-            <w:pStyle w:val="TOC1"/>
+            <w:pStyle w:val="Inhopg1"/>
             <w:tabs>
               <w:tab w:val="right" w:leader="dot" w:pos="9350"/>
             </w:tabs>
@@ -412,7 +408,7 @@
         </w:p>
         <w:p>
           <w:pPr>
-            <w:pStyle w:val="TOC2"/>
+            <w:pStyle w:val="Inhopg2"/>
             <w:tabs>
               <w:tab w:val="right" w:leader="dot" w:pos="9350"/>
             </w:tabs>
@@ -485,7 +481,7 @@
         </w:p>
         <w:p>
           <w:pPr>
-            <w:pStyle w:val="TOC2"/>
+            <w:pStyle w:val="Inhopg2"/>
             <w:tabs>
               <w:tab w:val="right" w:leader="dot" w:pos="9350"/>
             </w:tabs>
@@ -558,7 +554,7 @@
         </w:p>
         <w:p>
           <w:pPr>
-            <w:pStyle w:val="TOC2"/>
+            <w:pStyle w:val="Inhopg2"/>
             <w:tabs>
               <w:tab w:val="right" w:leader="dot" w:pos="9350"/>
             </w:tabs>
@@ -577,21 +573,7 @@
                 <w:rStyle w:val="Hyperlink"/>
                 <w:noProof/>
               </w:rPr>
-              <w:t>RQ03: Afsta</w:t>
-            </w:r>
-            <w:r>
-              <w:rPr>
-                <w:rStyle w:val="Hyperlink"/>
-                <w:noProof/>
-              </w:rPr>
-              <w:t>n</w:t>
-            </w:r>
-            <w:r>
-              <w:rPr>
-                <w:rStyle w:val="Hyperlink"/>
-                <w:noProof/>
-              </w:rPr>
-              <w:t>dsmeting (Functioneel (Prioriteit P1))</w:t>
+              <w:t>RQ03: Afstandsmeting (Functioneel (Prioriteit P1))</w:t>
             </w:r>
             <w:r>
               <w:rPr>
@@ -645,7 +627,7 @@
         </w:p>
         <w:p>
           <w:pPr>
-            <w:pStyle w:val="TOC2"/>
+            <w:pStyle w:val="Inhopg2"/>
             <w:tabs>
               <w:tab w:val="right" w:leader="dot" w:pos="9350"/>
             </w:tabs>
@@ -718,7 +700,7 @@
         </w:p>
         <w:p>
           <w:pPr>
-            <w:pStyle w:val="TOC2"/>
+            <w:pStyle w:val="Inhopg2"/>
             <w:tabs>
               <w:tab w:val="right" w:leader="dot" w:pos="9350"/>
             </w:tabs>
@@ -791,7 +773,7 @@
         </w:p>
         <w:p>
           <w:pPr>
-            <w:pStyle w:val="TOC2"/>
+            <w:pStyle w:val="Inhopg2"/>
             <w:tabs>
               <w:tab w:val="right" w:leader="dot" w:pos="9350"/>
             </w:tabs>
@@ -864,7 +846,7 @@
         </w:p>
         <w:p>
           <w:pPr>
-            <w:pStyle w:val="TOC2"/>
+            <w:pStyle w:val="Inhopg2"/>
             <w:tabs>
               <w:tab w:val="right" w:leader="dot" w:pos="9350"/>
             </w:tabs>
@@ -937,7 +919,7 @@
         </w:p>
         <w:p>
           <w:pPr>
-            <w:pStyle w:val="TOC2"/>
+            <w:pStyle w:val="Inhopg2"/>
             <w:tabs>
               <w:tab w:val="right" w:leader="dot" w:pos="9350"/>
             </w:tabs>
@@ -1010,7 +992,7 @@
         </w:p>
         <w:p>
           <w:pPr>
-            <w:pStyle w:val="TOC2"/>
+            <w:pStyle w:val="Inhopg2"/>
             <w:tabs>
               <w:tab w:val="right" w:leader="dot" w:pos="9350"/>
             </w:tabs>
@@ -1083,7 +1065,7 @@
         </w:p>
         <w:p>
           <w:pPr>
-            <w:pStyle w:val="TOC2"/>
+            <w:pStyle w:val="Inhopg2"/>
             <w:tabs>
               <w:tab w:val="right" w:leader="dot" w:pos="9350"/>
             </w:tabs>
@@ -1525,7 +1507,7 @@
     </w:p>
     <w:tbl>
       <w:tblPr>
-        <w:tblStyle w:val="TableGrid"/>
+        <w:tblStyle w:val="Tabelraster"/>
         <w:tblW w:w="0" w:type="auto"/>
         <w:tblLook w:val="04A0" w:firstRow="1" w:lastRow="0" w:firstColumn="1" w:lastColumn="0" w:noHBand="0" w:noVBand="1"/>
       </w:tblPr>
@@ -1539,7 +1521,7 @@
           </w:tcPr>
           <w:tbl>
             <w:tblPr>
-              <w:tblStyle w:val="TableGridLight"/>
+              <w:tblStyle w:val="Tabelrasterlicht"/>
               <w:tblW w:w="0" w:type="auto"/>
               <w:tblLook w:val="04A0" w:firstRow="1" w:lastRow="0" w:firstColumn="1" w:lastColumn="0" w:noHBand="0" w:noVBand="1"/>
             </w:tblPr>
@@ -1925,7 +1907,7 @@
     </w:p>
     <w:p>
       <w:pPr>
-        <w:pStyle w:val="ListParagraph"/>
+        <w:pStyle w:val="Lijstalinea"/>
         <w:numPr>
           <w:ilvl w:val="0"/>
           <w:numId w:val="19"/>
@@ -1938,7 +1920,7 @@
         <w:adjustRightInd w:val="0"/>
         <w:spacing w:after="0" w:line="240" w:lineRule="auto"/>
         <w:rPr>
-          <w:rFonts w:ascii="Helvetica Neue" w:hAnsi="Helvetica Neue" w:cs="Helvetica Neue"/>
+          <w:rFonts w:asciiTheme="majorHAnsi" w:hAnsiTheme="majorHAnsi" w:cs="Helvetica Neue"/>
           <w:b/>
           <w:bCs/>
           <w:color w:val="000000" w:themeColor="text1"/>
@@ -1950,7 +1932,7 @@
       </w:pPr>
       <w:r>
         <w:rPr>
-          <w:rFonts w:ascii="Helvetica Neue" w:hAnsi="Helvetica Neue" w:cs="Helvetica Neue"/>
+          <w:rFonts w:asciiTheme="majorHAnsi" w:hAnsiTheme="majorHAnsi" w:cs="Helvetica Neue"/>
           <w:b/>
           <w:bCs/>
           <w:color w:val="000000" w:themeColor="text1"/>
@@ -1963,7 +1945,7 @@
       </w:r>
       <w:r>
         <w:rPr>
-          <w:rFonts w:ascii="Helvetica Neue" w:hAnsi="Helvetica Neue" w:cs="Helvetica Neue"/>
+          <w:rFonts w:asciiTheme="majorHAnsi" w:hAnsiTheme="majorHAnsi" w:cs="Helvetica Neue"/>
           <w:b/>
           <w:bCs/>
           <w:color w:val="000000" w:themeColor="text1"/>
@@ -1985,7 +1967,7 @@
         <w:adjustRightInd w:val="0"/>
         <w:spacing w:after="0" w:line="240" w:lineRule="auto"/>
         <w:rPr>
-          <w:rFonts w:ascii="Helvetica Neue" w:hAnsi="Helvetica Neue" w:cs="Helvetica Neue"/>
+          <w:rFonts w:asciiTheme="majorHAnsi" w:hAnsiTheme="majorHAnsi" w:cs="Helvetica Neue"/>
           <w:b/>
           <w:bCs/>
           <w:color w:val="000000"/>
@@ -1996,34 +1978,16 @@
       </w:pPr>
       <w:r>
         <w:rPr>
-          <w:rFonts w:ascii="Helvetica Neue" w:hAnsi="Helvetica Neue" w:cs="Helvetica Neue"/>
-          <w:color w:val="000000"/>
-          <w:kern w:val="0"/>
-          <w:lang w:val="nl-NL"/>
-        </w:rPr>
-        <w:t>Er is nog geen definit</w:t>
-      </w:r>
-      <w:r>
-        <w:rPr>
-          <w:rFonts w:ascii="Helvetica Neue" w:hAnsi="Helvetica Neue" w:cs="Helvetica Neue"/>
-          <w:color w:val="000000"/>
-          <w:kern w:val="0"/>
-          <w:lang w:val="nl-NL"/>
-        </w:rPr>
-        <w:t>ieve keuze gemaakt uit de</w:t>
-      </w:r>
-      <w:r>
-        <w:rPr>
-          <w:rFonts w:ascii="Helvetica Neue" w:hAnsi="Helvetica Neue" w:cs="Helvetica Neue"/>
-          <w:color w:val="000000"/>
-          <w:kern w:val="0"/>
-          <w:lang w:val="nl-NL"/>
-        </w:rPr>
-        <w:t xml:space="preserve"> </w:t>
-      </w:r>
-      <w:r>
-        <w:rPr>
-          <w:rFonts w:ascii="Helvetica Neue" w:hAnsi="Helvetica Neue" w:cs="Helvetica Neue"/>
+          <w:rFonts w:asciiTheme="majorHAnsi" w:hAnsiTheme="majorHAnsi" w:cs="Helvetica Neue"/>
+          <w:color w:val="000000"/>
+          <w:kern w:val="0"/>
+          <w:lang w:val="nl-NL"/>
+        </w:rPr>
+        <w:t xml:space="preserve">Er is nog geen definitieve keuze gemaakt uit de </w:t>
+      </w:r>
+      <w:r>
+        <w:rPr>
+          <w:rFonts w:asciiTheme="majorHAnsi" w:hAnsiTheme="majorHAnsi" w:cs="Helvetica Neue"/>
           <w:b/>
           <w:bCs/>
           <w:color w:val="000000"/>
@@ -2035,7 +1999,7 @@
       <w:proofErr w:type="spellStart"/>
       <w:r>
         <w:rPr>
-          <w:rFonts w:ascii="Helvetica Neue" w:hAnsi="Helvetica Neue" w:cs="Helvetica Neue"/>
+          <w:rFonts w:asciiTheme="majorHAnsi" w:hAnsiTheme="majorHAnsi" w:cs="Helvetica Neue"/>
           <w:b/>
           <w:bCs/>
           <w:color w:val="000000"/>
@@ -2047,7 +2011,7 @@
       <w:proofErr w:type="spellEnd"/>
       <w:r>
         <w:rPr>
-          <w:rFonts w:ascii="Helvetica Neue" w:hAnsi="Helvetica Neue" w:cs="Helvetica Neue"/>
+          <w:rFonts w:asciiTheme="majorHAnsi" w:hAnsiTheme="majorHAnsi" w:cs="Helvetica Neue"/>
           <w:color w:val="000000"/>
           <w:kern w:val="0"/>
           <w:lang w:val="nl-NL"/>
@@ -2056,7 +2020,7 @@
       </w:r>
       <w:r>
         <w:rPr>
-          <w:rFonts w:ascii="Helvetica Neue" w:hAnsi="Helvetica Neue" w:cs="Helvetica Neue"/>
+          <w:rFonts w:asciiTheme="majorHAnsi" w:hAnsiTheme="majorHAnsi" w:cs="Helvetica Neue"/>
           <w:b/>
           <w:bCs/>
           <w:color w:val="000000"/>
@@ -2067,61 +2031,16 @@
       </w:r>
       <w:r>
         <w:rPr>
-          <w:rFonts w:ascii="Helvetica Neue" w:hAnsi="Helvetica Neue" w:cs="Helvetica Neue"/>
-          <w:color w:val="000000"/>
-          <w:kern w:val="0"/>
-          <w:lang w:val="nl-NL"/>
-        </w:rPr>
-        <w:t xml:space="preserve">. </w:t>
-      </w:r>
-      <w:r>
-        <w:rPr>
-          <w:rFonts w:ascii="Helvetica Neue" w:hAnsi="Helvetica Neue" w:cs="Helvetica Neue"/>
-          <w:color w:val="000000"/>
-          <w:kern w:val="0"/>
-          <w:lang w:val="nl-NL"/>
-        </w:rPr>
-        <w:t xml:space="preserve">Deze keuze wordt definitief na mate het testen van beide camera’s. </w:t>
-      </w:r>
-      <w:r>
-        <w:rPr>
-          <w:rFonts w:ascii="Helvetica Neue" w:hAnsi="Helvetica Neue" w:cs="Helvetica Neue"/>
-          <w:color w:val="000000"/>
-          <w:kern w:val="0"/>
-          <w:lang w:val="nl-NL"/>
-        </w:rPr>
-        <w:t>Eisen en</w:t>
-      </w:r>
-      <w:r>
-        <w:rPr>
-          <w:rFonts w:ascii="Helvetica Neue" w:hAnsi="Helvetica Neue" w:cs="Helvetica Neue"/>
-          <w:color w:val="000000"/>
-          <w:kern w:val="0"/>
-          <w:lang w:val="nl-NL"/>
-        </w:rPr>
-        <w:t xml:space="preserve"> de</w:t>
-      </w:r>
-      <w:r>
-        <w:rPr>
-          <w:rFonts w:ascii="Helvetica Neue" w:hAnsi="Helvetica Neue" w:cs="Helvetica Neue"/>
-          <w:color w:val="000000"/>
-          <w:kern w:val="0"/>
-          <w:lang w:val="nl-NL"/>
-        </w:rPr>
-        <w:t xml:space="preserve"> </w:t>
-      </w:r>
-      <w:r>
-        <w:rPr>
-          <w:rFonts w:ascii="Helvetica Neue" w:hAnsi="Helvetica Neue" w:cs="Helvetica Neue"/>
-          <w:color w:val="000000"/>
-          <w:kern w:val="0"/>
-          <w:lang w:val="nl-NL"/>
-        </w:rPr>
-        <w:t xml:space="preserve">specificaties van deze camera zijn terug te vinden in het document </w:t>
-      </w:r>
-      <w:r>
-        <w:rPr>
-          <w:rFonts w:ascii="Helvetica Neue" w:hAnsi="Helvetica Neue" w:cs="Helvetica Neue"/>
+          <w:rFonts w:asciiTheme="majorHAnsi" w:hAnsiTheme="majorHAnsi" w:cs="Helvetica Neue"/>
+          <w:color w:val="000000"/>
+          <w:kern w:val="0"/>
+          <w:lang w:val="nl-NL"/>
+        </w:rPr>
+        <w:t xml:space="preserve">. Deze keuze wordt definitief na mate het testen van beide camera’s. Eisen en de specificaties van deze camera zijn terug te vinden in het document </w:t>
+      </w:r>
+      <w:r>
+        <w:rPr>
+          <w:rFonts w:asciiTheme="majorHAnsi" w:hAnsiTheme="majorHAnsi" w:cs="Helvetica Neue"/>
           <w:b/>
           <w:bCs/>
           <w:color w:val="000000"/>
@@ -2129,19 +2048,7 @@
           <w:u w:val="single"/>
           <w:lang w:val="nl-NL"/>
         </w:rPr>
-        <w:t>Camera onderzoeksverslag</w:t>
-      </w:r>
-      <w:r>
-        <w:rPr>
-          <w:rFonts w:ascii="Helvetica Neue" w:hAnsi="Helvetica Neue" w:cs="Helvetica Neue"/>
-          <w:b/>
-          <w:bCs/>
-          <w:color w:val="000000"/>
-          <w:kern w:val="0"/>
-          <w:u w:val="single"/>
-          <w:lang w:val="nl-NL"/>
-        </w:rPr>
-        <w:t>.</w:t>
+        <w:t>Camera onderzoeksverslag.</w:t>
       </w:r>
     </w:p>
     <w:p>
@@ -2154,7 +2061,7 @@
         <w:adjustRightInd w:val="0"/>
         <w:spacing w:after="0" w:line="240" w:lineRule="auto"/>
         <w:rPr>
-          <w:rFonts w:ascii="Helvetica Neue" w:hAnsi="Helvetica Neue" w:cs="Helvetica Neue"/>
+          <w:rFonts w:asciiTheme="majorHAnsi" w:hAnsiTheme="majorHAnsi" w:cs="Helvetica Neue"/>
           <w:b/>
           <w:bCs/>
           <w:color w:val="000000"/>
@@ -2166,7 +2073,7 @@
     </w:p>
     <w:p>
       <w:pPr>
-        <w:pStyle w:val="ListParagraph"/>
+        <w:pStyle w:val="Lijstalinea"/>
         <w:numPr>
           <w:ilvl w:val="0"/>
           <w:numId w:val="19"/>
@@ -2179,17 +2086,17 @@
         <w:adjustRightInd w:val="0"/>
         <w:spacing w:after="0" w:line="240" w:lineRule="auto"/>
         <w:rPr>
-          <w:rFonts w:ascii="Helvetica Neue" w:hAnsi="Helvetica Neue" w:cs="Helvetica Neue"/>
-          <w:b/>
-          <w:bCs/>
-          <w:color w:val="000000"/>
-          <w:kern w:val="0"/>
-          <w:lang w:val="nl-NL"/>
-        </w:rPr>
-      </w:pPr>
-      <w:r>
-        <w:rPr>
-          <w:rFonts w:ascii="Helvetica Neue" w:hAnsi="Helvetica Neue" w:cs="Helvetica Neue"/>
+          <w:rFonts w:asciiTheme="majorHAnsi" w:hAnsiTheme="majorHAnsi" w:cs="Helvetica Neue"/>
+          <w:b/>
+          <w:bCs/>
+          <w:color w:val="000000"/>
+          <w:kern w:val="0"/>
+          <w:lang w:val="nl-NL"/>
+        </w:rPr>
+      </w:pPr>
+      <w:r>
+        <w:rPr>
+          <w:rFonts w:asciiTheme="majorHAnsi" w:hAnsiTheme="majorHAnsi" w:cs="Helvetica Neue"/>
           <w:b/>
           <w:bCs/>
           <w:color w:val="000000"/>
@@ -2209,7 +2116,7 @@
         <w:adjustRightInd w:val="0"/>
         <w:spacing w:after="0" w:line="240" w:lineRule="auto"/>
         <w:rPr>
-          <w:rFonts w:ascii="Helvetica Neue" w:hAnsi="Helvetica Neue" w:cs="Helvetica Neue"/>
+          <w:rFonts w:asciiTheme="majorHAnsi" w:hAnsiTheme="majorHAnsi" w:cs="Helvetica Neue"/>
           <w:b/>
           <w:bCs/>
           <w:color w:val="000000"/>
@@ -2220,25 +2127,16 @@
       </w:pPr>
       <w:r>
         <w:rPr>
-          <w:rFonts w:ascii="Helvetica Neue" w:hAnsi="Helvetica Neue" w:cs="Helvetica Neue"/>
-          <w:color w:val="000000"/>
-          <w:kern w:val="0"/>
-          <w:lang w:val="nl-NL"/>
-        </w:rPr>
-        <w:t>Voor de keuze in software is er gekozen voor het gebrui</w:t>
-      </w:r>
-      <w:r>
-        <w:rPr>
-          <w:rFonts w:ascii="Helvetica Neue" w:hAnsi="Helvetica Neue" w:cs="Helvetica Neue"/>
-          <w:color w:val="000000"/>
-          <w:kern w:val="0"/>
-          <w:lang w:val="nl-NL"/>
-        </w:rPr>
-        <w:t xml:space="preserve">k te maken van de taal </w:t>
-      </w:r>
-      <w:r>
-        <w:rPr>
-          <w:rFonts w:ascii="Helvetica Neue" w:hAnsi="Helvetica Neue" w:cs="Helvetica Neue"/>
+          <w:rFonts w:asciiTheme="majorHAnsi" w:hAnsiTheme="majorHAnsi" w:cs="Helvetica Neue"/>
+          <w:color w:val="000000"/>
+          <w:kern w:val="0"/>
+          <w:lang w:val="nl-NL"/>
+        </w:rPr>
+        <w:t xml:space="preserve">Voor de keuze in software is er gekozen voor het gebruik te maken van de taal </w:t>
+      </w:r>
+      <w:r>
+        <w:rPr>
+          <w:rFonts w:asciiTheme="majorHAnsi" w:hAnsiTheme="majorHAnsi" w:cs="Helvetica Neue"/>
           <w:b/>
           <w:bCs/>
           <w:color w:val="000000"/>
@@ -2249,7 +2147,7 @@
       </w:r>
       <w:r>
         <w:rPr>
-          <w:rFonts w:ascii="Helvetica Neue" w:hAnsi="Helvetica Neue" w:cs="Helvetica Neue"/>
+          <w:rFonts w:asciiTheme="majorHAnsi" w:hAnsiTheme="majorHAnsi" w:cs="Helvetica Neue"/>
           <w:color w:val="000000"/>
           <w:kern w:val="0"/>
           <w:lang w:val="nl-NL"/>
@@ -2259,7 +2157,7 @@
       <w:proofErr w:type="spellStart"/>
       <w:r>
         <w:rPr>
-          <w:rFonts w:ascii="Helvetica Neue" w:hAnsi="Helvetica Neue" w:cs="Helvetica Neue"/>
+          <w:rFonts w:asciiTheme="majorHAnsi" w:hAnsiTheme="majorHAnsi" w:cs="Helvetica Neue"/>
           <w:color w:val="000000"/>
           <w:kern w:val="0"/>
           <w:lang w:val="nl-NL"/>
@@ -2269,7 +2167,7 @@
       <w:proofErr w:type="spellEnd"/>
       <w:r>
         <w:rPr>
-          <w:rFonts w:ascii="Helvetica Neue" w:hAnsi="Helvetica Neue" w:cs="Helvetica Neue"/>
+          <w:rFonts w:asciiTheme="majorHAnsi" w:hAnsiTheme="majorHAnsi" w:cs="Helvetica Neue"/>
           <w:color w:val="000000"/>
           <w:kern w:val="0"/>
           <w:lang w:val="nl-NL"/>
@@ -2279,7 +2177,7 @@
       <w:proofErr w:type="spellStart"/>
       <w:r>
         <w:rPr>
-          <w:rFonts w:ascii="Helvetica Neue" w:hAnsi="Helvetica Neue" w:cs="Helvetica Neue"/>
+          <w:rFonts w:asciiTheme="majorHAnsi" w:hAnsiTheme="majorHAnsi" w:cs="Helvetica Neue"/>
           <w:b/>
           <w:bCs/>
           <w:color w:val="000000"/>
@@ -2291,52 +2189,16 @@
       <w:proofErr w:type="spellEnd"/>
       <w:r>
         <w:rPr>
-          <w:rFonts w:ascii="Helvetica Neue" w:hAnsi="Helvetica Neue" w:cs="Helvetica Neue"/>
-          <w:color w:val="000000"/>
-          <w:kern w:val="0"/>
-          <w:lang w:val="nl-NL"/>
-        </w:rPr>
-        <w:t xml:space="preserve">. </w:t>
-      </w:r>
-      <w:r>
-        <w:rPr>
-          <w:rFonts w:ascii="Helvetica Neue" w:hAnsi="Helvetica Neue" w:cs="Helvetica Neue"/>
-          <w:color w:val="000000"/>
-          <w:kern w:val="0"/>
-          <w:lang w:val="nl-NL"/>
-        </w:rPr>
-        <w:t>Eisen en</w:t>
-      </w:r>
-      <w:r>
-        <w:rPr>
-          <w:rFonts w:ascii="Helvetica Neue" w:hAnsi="Helvetica Neue" w:cs="Helvetica Neue"/>
-          <w:color w:val="000000"/>
-          <w:kern w:val="0"/>
-          <w:lang w:val="nl-NL"/>
-        </w:rPr>
-        <w:t xml:space="preserve"> de</w:t>
-      </w:r>
-      <w:r>
-        <w:rPr>
-          <w:rFonts w:ascii="Helvetica Neue" w:hAnsi="Helvetica Neue" w:cs="Helvetica Neue"/>
-          <w:color w:val="000000"/>
-          <w:kern w:val="0"/>
-          <w:lang w:val="nl-NL"/>
-        </w:rPr>
-        <w:t xml:space="preserve"> </w:t>
-      </w:r>
-      <w:r>
-        <w:rPr>
-          <w:rFonts w:ascii="Helvetica Neue" w:hAnsi="Helvetica Neue" w:cs="Helvetica Neue"/>
-          <w:color w:val="000000"/>
-          <w:kern w:val="0"/>
-          <w:lang w:val="nl-NL"/>
-        </w:rPr>
-        <w:t xml:space="preserve">specificaties van de software is terug te vinden in het document </w:t>
-      </w:r>
-      <w:r>
-        <w:rPr>
-          <w:rFonts w:ascii="Helvetica Neue" w:hAnsi="Helvetica Neue" w:cs="Helvetica Neue"/>
+          <w:rFonts w:asciiTheme="majorHAnsi" w:hAnsiTheme="majorHAnsi" w:cs="Helvetica Neue"/>
+          <w:color w:val="000000"/>
+          <w:kern w:val="0"/>
+          <w:lang w:val="nl-NL"/>
+        </w:rPr>
+        <w:t xml:space="preserve">. Eisen en de specificaties van de software is terug te vinden in het document </w:t>
+      </w:r>
+      <w:r>
+        <w:rPr>
+          <w:rFonts w:asciiTheme="majorHAnsi" w:hAnsiTheme="majorHAnsi" w:cs="Helvetica Neue"/>
           <w:b/>
           <w:bCs/>
           <w:color w:val="000000"/>
@@ -2344,62 +2206,38 @@
           <w:u w:val="single"/>
           <w:lang w:val="nl-NL"/>
         </w:rPr>
-        <w:t>Software</w:t>
-      </w:r>
-      <w:r>
-        <w:rPr>
-          <w:rFonts w:ascii="Helvetica Neue" w:hAnsi="Helvetica Neue" w:cs="Helvetica Neue"/>
-          <w:b/>
-          <w:bCs/>
-          <w:color w:val="000000"/>
-          <w:kern w:val="0"/>
-          <w:u w:val="single"/>
-          <w:lang w:val="nl-NL"/>
-        </w:rPr>
-        <w:t xml:space="preserve"> onderzoeksverslag</w:t>
-      </w:r>
-      <w:r>
-        <w:rPr>
-          <w:rFonts w:ascii="Helvetica Neue" w:hAnsi="Helvetica Neue" w:cs="Helvetica Neue"/>
-          <w:b/>
-          <w:bCs/>
-          <w:color w:val="000000"/>
-          <w:kern w:val="0"/>
-          <w:u w:val="single"/>
-          <w:lang w:val="nl-NL"/>
-        </w:rPr>
-        <w:t>.</w:t>
-      </w:r>
-    </w:p>
-    <w:p>
-      <w:pPr>
-        <w:rPr>
-          <w:rFonts w:ascii="Helvetica Neue" w:hAnsi="Helvetica Neue" w:cs="Helvetica Neue"/>
-          <w:color w:val="000000"/>
-          <w:kern w:val="0"/>
-          <w:lang w:val="nl-NL"/>
-        </w:rPr>
-      </w:pPr>
-    </w:p>
-    <w:p>
-      <w:pPr>
-        <w:pStyle w:val="ListParagraph"/>
+        <w:t>Software onderzoeksverslag.</w:t>
+      </w:r>
+    </w:p>
+    <w:p>
+      <w:pPr>
+        <w:rPr>
+          <w:rFonts w:asciiTheme="majorHAnsi" w:hAnsiTheme="majorHAnsi" w:cs="Helvetica Neue"/>
+          <w:color w:val="000000"/>
+          <w:kern w:val="0"/>
+          <w:lang w:val="nl-NL"/>
+        </w:rPr>
+      </w:pPr>
+    </w:p>
+    <w:p>
+      <w:pPr>
+        <w:pStyle w:val="Lijstalinea"/>
         <w:numPr>
           <w:ilvl w:val="0"/>
           <w:numId w:val="19"/>
         </w:numPr>
         <w:rPr>
-          <w:rFonts w:ascii="Helvetica Neue" w:hAnsi="Helvetica Neue" w:cs="Helvetica Neue"/>
-          <w:b/>
-          <w:bCs/>
-          <w:color w:val="000000"/>
-          <w:kern w:val="0"/>
-          <w:lang w:val="nl-NL"/>
-        </w:rPr>
-      </w:pPr>
-      <w:r>
-        <w:rPr>
-          <w:rFonts w:ascii="Helvetica Neue" w:hAnsi="Helvetica Neue" w:cs="Helvetica Neue"/>
+          <w:rFonts w:asciiTheme="majorHAnsi" w:hAnsiTheme="majorHAnsi" w:cs="Helvetica Neue"/>
+          <w:b/>
+          <w:bCs/>
+          <w:color w:val="000000"/>
+          <w:kern w:val="0"/>
+          <w:lang w:val="nl-NL"/>
+        </w:rPr>
+      </w:pPr>
+      <w:r>
+        <w:rPr>
+          <w:rFonts w:asciiTheme="majorHAnsi" w:hAnsiTheme="majorHAnsi" w:cs="Helvetica Neue"/>
           <w:b/>
           <w:bCs/>
           <w:color w:val="000000"/>
@@ -2412,64 +2250,59 @@
     <w:p>
       <w:pPr>
         <w:rPr>
-          <w:rFonts w:ascii="Helvetica Neue" w:hAnsi="Helvetica Neue" w:cs="Helvetica Neue"/>
-          <w:color w:val="000000"/>
-          <w:kern w:val="0"/>
-          <w:lang w:val="nl-NL"/>
-        </w:rPr>
-      </w:pPr>
-      <w:r>
-        <w:rPr>
-          <w:rFonts w:ascii="Helvetica Neue" w:hAnsi="Helvetica Neue" w:cs="Helvetica Neue"/>
-          <w:color w:val="000000"/>
-          <w:kern w:val="0"/>
-          <w:lang w:val="nl-NL"/>
-        </w:rPr>
-        <w:t xml:space="preserve">Voor de keuze in </w:t>
-      </w:r>
-      <w:r>
-        <w:rPr>
-          <w:rFonts w:ascii="Helvetica Neue" w:hAnsi="Helvetica Neue" w:cs="Helvetica Neue"/>
-          <w:color w:val="000000"/>
-          <w:kern w:val="0"/>
-          <w:lang w:val="nl-NL"/>
-        </w:rPr>
-        <w:t>Microcontroller</w:t>
-      </w:r>
-      <w:r>
-        <w:rPr>
-          <w:rFonts w:ascii="Helvetica Neue" w:hAnsi="Helvetica Neue" w:cs="Helvetica Neue"/>
-          <w:color w:val="000000"/>
-          <w:kern w:val="0"/>
-          <w:lang w:val="nl-NL"/>
-        </w:rPr>
-        <w:t xml:space="preserve"> is er gekozen voor het gebrui</w:t>
-      </w:r>
-      <w:r>
-        <w:rPr>
-          <w:rFonts w:ascii="Helvetica Neue" w:hAnsi="Helvetica Neue" w:cs="Helvetica Neue"/>
-          <w:color w:val="000000"/>
-          <w:kern w:val="0"/>
-          <w:lang w:val="nl-NL"/>
-        </w:rPr>
-        <w:t xml:space="preserve">k te maken van de </w:t>
+          <w:rFonts w:asciiTheme="majorHAnsi" w:hAnsiTheme="majorHAnsi" w:cs="Helvetica Neue"/>
+          <w:color w:val="000000"/>
+          <w:kern w:val="0"/>
+          <w:lang w:val="nl-NL"/>
+        </w:rPr>
+      </w:pPr>
+      <w:r>
+        <w:rPr>
+          <w:rFonts w:asciiTheme="majorHAnsi" w:hAnsiTheme="majorHAnsi" w:cs="Helvetica Neue"/>
+          <w:color w:val="000000"/>
+          <w:kern w:val="0"/>
+          <w:lang w:val="nl-NL"/>
+        </w:rPr>
+        <w:t xml:space="preserve">Voor de keuze in Microcontroller is er gekozen voor het gebruik te maken van de </w:t>
       </w:r>
       <w:proofErr w:type="spellStart"/>
       <w:r>
         <w:rPr>
-          <w:rFonts w:ascii="Helvetica Neue" w:hAnsi="Helvetica Neue" w:cs="Helvetica Neue"/>
-          <w:b/>
-          <w:bCs/>
-          <w:color w:val="000000"/>
-          <w:kern w:val="0"/>
-          <w:lang w:val="nl-NL"/>
-        </w:rPr>
-        <w:t>Rasberry</w:t>
+          <w:rFonts w:asciiTheme="majorHAnsi" w:hAnsiTheme="majorHAnsi" w:cs="Helvetica Neue"/>
+          <w:b/>
+          <w:bCs/>
+          <w:color w:val="000000"/>
+          <w:kern w:val="0"/>
+          <w:lang w:val="nl-NL"/>
+        </w:rPr>
+        <w:t>Ras</w:t>
+      </w:r>
+      <w:r>
+        <w:rPr>
+          <w:rFonts w:asciiTheme="majorHAnsi" w:hAnsiTheme="majorHAnsi" w:cs="Helvetica Neue"/>
+          <w:b/>
+          <w:bCs/>
+          <w:color w:val="000000"/>
+          <w:kern w:val="0"/>
+          <w:lang w:val="nl-NL"/>
+        </w:rPr>
+        <w:t>p</w:t>
+      </w:r>
+      <w:r>
+        <w:rPr>
+          <w:rFonts w:asciiTheme="majorHAnsi" w:hAnsiTheme="majorHAnsi" w:cs="Helvetica Neue"/>
+          <w:b/>
+          <w:bCs/>
+          <w:color w:val="000000"/>
+          <w:kern w:val="0"/>
+          <w:lang w:val="nl-NL"/>
+        </w:rPr>
+        <w:t>berry</w:t>
       </w:r>
       <w:proofErr w:type="spellEnd"/>
       <w:r>
         <w:rPr>
-          <w:rFonts w:ascii="Helvetica Neue" w:hAnsi="Helvetica Neue" w:cs="Helvetica Neue"/>
+          <w:rFonts w:asciiTheme="majorHAnsi" w:hAnsiTheme="majorHAnsi" w:cs="Helvetica Neue"/>
           <w:b/>
           <w:bCs/>
           <w:color w:val="000000"/>
@@ -2480,7 +2313,7 @@
       </w:r>
       <w:r>
         <w:rPr>
-          <w:rFonts w:ascii="Helvetica Neue" w:hAnsi="Helvetica Neue" w:cs="Helvetica Neue"/>
+          <w:rFonts w:asciiTheme="majorHAnsi" w:hAnsiTheme="majorHAnsi" w:cs="Helvetica Neue"/>
           <w:b/>
           <w:bCs/>
           <w:color w:val="000000"/>
@@ -2491,7 +2324,7 @@
       </w:r>
       <w:r>
         <w:rPr>
-          <w:rFonts w:ascii="Helvetica Neue" w:hAnsi="Helvetica Neue" w:cs="Helvetica Neue"/>
+          <w:rFonts w:asciiTheme="majorHAnsi" w:hAnsiTheme="majorHAnsi" w:cs="Helvetica Neue"/>
           <w:b/>
           <w:bCs/>
           <w:color w:val="000000"/>
@@ -2502,52 +2335,16 @@
       </w:r>
       <w:r>
         <w:rPr>
-          <w:rFonts w:ascii="Helvetica Neue" w:hAnsi="Helvetica Neue" w:cs="Helvetica Neue"/>
-          <w:color w:val="000000"/>
-          <w:kern w:val="0"/>
-          <w:lang w:val="nl-NL"/>
-        </w:rPr>
-        <w:t xml:space="preserve">. </w:t>
-      </w:r>
-      <w:r>
-        <w:rPr>
-          <w:rFonts w:ascii="Helvetica Neue" w:hAnsi="Helvetica Neue" w:cs="Helvetica Neue"/>
-          <w:color w:val="000000"/>
-          <w:kern w:val="0"/>
-          <w:lang w:val="nl-NL"/>
-        </w:rPr>
-        <w:t>Eisen en</w:t>
-      </w:r>
-      <w:r>
-        <w:rPr>
-          <w:rFonts w:ascii="Helvetica Neue" w:hAnsi="Helvetica Neue" w:cs="Helvetica Neue"/>
-          <w:color w:val="000000"/>
-          <w:kern w:val="0"/>
-          <w:lang w:val="nl-NL"/>
-        </w:rPr>
-        <w:t xml:space="preserve"> de</w:t>
-      </w:r>
-      <w:r>
-        <w:rPr>
-          <w:rFonts w:ascii="Helvetica Neue" w:hAnsi="Helvetica Neue" w:cs="Helvetica Neue"/>
-          <w:color w:val="000000"/>
-          <w:kern w:val="0"/>
-          <w:lang w:val="nl-NL"/>
-        </w:rPr>
-        <w:t xml:space="preserve"> </w:t>
-      </w:r>
-      <w:r>
-        <w:rPr>
-          <w:rFonts w:ascii="Helvetica Neue" w:hAnsi="Helvetica Neue" w:cs="Helvetica Neue"/>
-          <w:color w:val="000000"/>
-          <w:kern w:val="0"/>
-          <w:lang w:val="nl-NL"/>
-        </w:rPr>
-        <w:t xml:space="preserve">specificaties van de software is terug te vinden in het document </w:t>
-      </w:r>
-      <w:r>
-        <w:rPr>
-          <w:rFonts w:ascii="Helvetica Neue" w:hAnsi="Helvetica Neue" w:cs="Helvetica Neue"/>
+          <w:rFonts w:asciiTheme="majorHAnsi" w:hAnsiTheme="majorHAnsi" w:cs="Helvetica Neue"/>
+          <w:color w:val="000000"/>
+          <w:kern w:val="0"/>
+          <w:lang w:val="nl-NL"/>
+        </w:rPr>
+        <w:t xml:space="preserve">. Eisen en de specificaties van de software is terug te vinden in het document </w:t>
+      </w:r>
+      <w:r>
+        <w:rPr>
+          <w:rFonts w:asciiTheme="majorHAnsi" w:hAnsiTheme="majorHAnsi" w:cs="Helvetica Neue"/>
           <w:b/>
           <w:bCs/>
           <w:color w:val="000000"/>
@@ -2555,31 +2352,7 @@
           <w:u w:val="single"/>
           <w:lang w:val="nl-NL"/>
         </w:rPr>
-        <w:t>Microcontroller</w:t>
-      </w:r>
-      <w:r>
-        <w:rPr>
-          <w:rFonts w:ascii="Helvetica Neue" w:hAnsi="Helvetica Neue" w:cs="Helvetica Neue"/>
-          <w:b/>
-          <w:bCs/>
-          <w:color w:val="000000"/>
-          <w:kern w:val="0"/>
-          <w:u w:val="single"/>
-          <w:lang w:val="nl-NL"/>
-        </w:rPr>
-        <w:t xml:space="preserve"> onderzoeksverslag</w:t>
-      </w:r>
-      <w:r>
-        <w:rPr>
-          <w:rFonts w:ascii="Helvetica Neue" w:hAnsi="Helvetica Neue" w:cs="Helvetica Neue"/>
-          <w:b/>
-          <w:bCs/>
-          <w:color w:val="000000"/>
-          <w:kern w:val="0"/>
-          <w:u w:val="single"/>
-          <w:lang w:val="nl-NL"/>
-        </w:rPr>
-        <w:t>.</w:t>
+        <w:t>Microcontroller onderzoeksverslag.</w:t>
       </w:r>
     </w:p>
     <w:p>
@@ -2592,7 +2365,7 @@
         <w:adjustRightInd w:val="0"/>
         <w:spacing w:after="0" w:line="240" w:lineRule="auto"/>
         <w:rPr>
-          <w:rFonts w:ascii="Helvetica Neue" w:hAnsi="Helvetica Neue" w:cs="Helvetica Neue"/>
+          <w:rFonts w:asciiTheme="majorHAnsi" w:hAnsiTheme="majorHAnsi" w:cs="Helvetica Neue"/>
           <w:b/>
           <w:bCs/>
           <w:color w:val="000000"/>
@@ -2612,7 +2385,7 @@
         <w:adjustRightInd w:val="0"/>
         <w:spacing w:after="0" w:line="240" w:lineRule="auto"/>
         <w:rPr>
-          <w:rFonts w:ascii="Helvetica Neue" w:hAnsi="Helvetica Neue" w:cs="Helvetica Neue"/>
+          <w:rFonts w:asciiTheme="majorHAnsi" w:hAnsiTheme="majorHAnsi" w:cs="Helvetica Neue"/>
           <w:b/>
           <w:bCs/>
           <w:color w:val="000000"/>
@@ -2888,7 +2661,6 @@
         </w:rPr>
         <w:t xml:space="preserve"> </w:t>
       </w:r>
-      <w:proofErr w:type="spellStart"/>
       <w:r>
         <w:rPr>
           <w:rFonts w:ascii="Helvetica Neue" w:hAnsi="Helvetica Neue" w:cs="Helvetica Neue"/>
@@ -2899,9 +2671,8 @@
           <w:u w:val="single"/>
           <w:lang w:val="nl-NL"/>
         </w:rPr>
-        <w:t>UserStory</w:t>
-      </w:r>
-      <w:proofErr w:type="spellEnd"/>
+        <w:t>User</w:t>
+      </w:r>
       <w:r>
         <w:rPr>
           <w:rFonts w:ascii="Helvetica Neue" w:hAnsi="Helvetica Neue" w:cs="Helvetica Neue"/>
@@ -2912,7 +2683,19 @@
           <w:u w:val="single"/>
           <w:lang w:val="nl-NL"/>
         </w:rPr>
-        <w:t xml:space="preserve"> Nr. 1</w:t>
+        <w:t xml:space="preserve"> </w:t>
+      </w:r>
+      <w:r>
+        <w:rPr>
+          <w:rFonts w:ascii="Helvetica Neue" w:hAnsi="Helvetica Neue" w:cs="Helvetica Neue"/>
+          <w:b/>
+          <w:bCs/>
+          <w:color w:val="000000"/>
+          <w:kern w:val="0"/>
+          <w:u w:val="single"/>
+          <w:lang w:val="nl-NL"/>
+        </w:rPr>
+        <w:t>Story Nr. 1</w:t>
       </w:r>
       <w:r>
         <w:rPr>
@@ -3088,7 +2871,7 @@
     </w:p>
     <w:p>
       <w:pPr>
-        <w:pStyle w:val="ListParagraph"/>
+        <w:pStyle w:val="Lijstalinea"/>
         <w:numPr>
           <w:ilvl w:val="0"/>
           <w:numId w:val="19"/>
@@ -3171,7 +2954,7 @@
     </w:p>
     <w:p>
       <w:pPr>
-        <w:pStyle w:val="ListParagraph"/>
+        <w:pStyle w:val="Lijstalinea"/>
         <w:numPr>
           <w:ilvl w:val="0"/>
           <w:numId w:val="19"/>
@@ -3198,7 +2981,25 @@
           <w:kern w:val="0"/>
           <w:lang w:val="nl-NL"/>
         </w:rPr>
-        <w:t>Rasberry</w:t>
+        <w:t>Ras</w:t>
+      </w:r>
+      <w:r>
+        <w:rPr>
+          <w:rFonts w:ascii="Helvetica Neue" w:hAnsi="Helvetica Neue" w:cs="Helvetica Neue"/>
+          <w:color w:val="000000"/>
+          <w:kern w:val="0"/>
+          <w:lang w:val="nl-NL"/>
+        </w:rPr>
+        <w:t>p</w:t>
+      </w:r>
+      <w:r>
+        <w:rPr>
+          <w:rFonts w:ascii="Helvetica Neue" w:hAnsi="Helvetica Neue" w:cs="Helvetica Neue"/>
+          <w:color w:val="000000"/>
+          <w:kern w:val="0"/>
+          <w:lang w:val="nl-NL"/>
+        </w:rPr>
+        <w:t>berry</w:t>
       </w:r>
       <w:proofErr w:type="spellEnd"/>
       <w:r>
@@ -3213,7 +3014,7 @@
     </w:p>
     <w:p>
       <w:pPr>
-        <w:pStyle w:val="ListParagraph"/>
+        <w:pStyle w:val="Lijstalinea"/>
         <w:numPr>
           <w:ilvl w:val="0"/>
           <w:numId w:val="19"/>
@@ -3366,7 +3167,25 @@
           <w:kern w:val="0"/>
           <w:lang w:val="nl-NL"/>
         </w:rPr>
-        <w:t xml:space="preserve"> afmetingen en daarvan een correcte detectiekader overzetten met een nauwkeurigheid en vertraging die wordt waargenomen in normale lichtomstandigheden.</w:t>
+        <w:t xml:space="preserve"> </w:t>
+      </w:r>
+      <w:r>
+        <w:rPr>
+          <w:rFonts w:ascii="Helvetica Neue" w:hAnsi="Helvetica Neue" w:cs="Helvetica Neue"/>
+          <w:color w:val="000000"/>
+          <w:kern w:val="0"/>
+          <w:lang w:val="nl-NL"/>
+        </w:rPr>
+        <w:t>afstanden</w:t>
+      </w:r>
+      <w:r>
+        <w:rPr>
+          <w:rFonts w:ascii="Helvetica Neue" w:hAnsi="Helvetica Neue" w:cs="Helvetica Neue"/>
+          <w:color w:val="000000"/>
+          <w:kern w:val="0"/>
+          <w:lang w:val="nl-NL"/>
+        </w:rPr>
+        <w:t xml:space="preserve"> en daarvan een correcte detectiekader overzetten met een nauwkeurigheid en vertraging die wordt waargenomen in normale lichtomstandigheden.</w:t>
       </w:r>
     </w:p>
     <w:p>
@@ -3584,7 +3403,29 @@
           <w:kern w:val="0"/>
           <w:lang w:val="nl-NL"/>
         </w:rPr>
-        <w:t>Rasberry</w:t>
+        <w:t>Ras</w:t>
+      </w:r>
+      <w:r>
+        <w:rPr>
+          <w:rFonts w:ascii="Helvetica Neue" w:hAnsi="Helvetica Neue" w:cs="Helvetica Neue"/>
+          <w:i/>
+          <w:iCs/>
+          <w:color w:val="000000"/>
+          <w:kern w:val="0"/>
+          <w:lang w:val="nl-NL"/>
+        </w:rPr>
+        <w:t>p</w:t>
+      </w:r>
+      <w:r>
+        <w:rPr>
+          <w:rFonts w:ascii="Helvetica Neue" w:hAnsi="Helvetica Neue" w:cs="Helvetica Neue"/>
+          <w:i/>
+          <w:iCs/>
+          <w:color w:val="000000"/>
+          <w:kern w:val="0"/>
+          <w:lang w:val="nl-NL"/>
+        </w:rPr>
+        <w:t>berry</w:t>
       </w:r>
       <w:proofErr w:type="spellEnd"/>
       <w:r>
@@ -3655,7 +3496,6 @@
         </w:rPr>
         <w:t xml:space="preserve"> verwijst naar een eis van de opdrachtgever die is uitgewerkt in </w:t>
       </w:r>
-      <w:proofErr w:type="spellStart"/>
       <w:r>
         <w:rPr>
           <w:rFonts w:ascii="Helvetica Neue" w:hAnsi="Helvetica Neue" w:cs="Helvetica Neue"/>
@@ -3666,9 +3506,8 @@
           <w:u w:val="single"/>
           <w:lang w:val="nl-NL"/>
         </w:rPr>
-        <w:t>UserStory</w:t>
-      </w:r>
-      <w:proofErr w:type="spellEnd"/>
+        <w:t>User</w:t>
+      </w:r>
       <w:r>
         <w:rPr>
           <w:rFonts w:ascii="Helvetica Neue" w:hAnsi="Helvetica Neue" w:cs="Helvetica Neue"/>
@@ -3679,7 +3518,19 @@
           <w:u w:val="single"/>
           <w:lang w:val="nl-NL"/>
         </w:rPr>
-        <w:t xml:space="preserve"> Nr. </w:t>
+        <w:t xml:space="preserve"> </w:t>
+      </w:r>
+      <w:r>
+        <w:rPr>
+          <w:rFonts w:ascii="Helvetica Neue" w:hAnsi="Helvetica Neue" w:cs="Helvetica Neue"/>
+          <w:b/>
+          <w:bCs/>
+          <w:color w:val="000000"/>
+          <w:kern w:val="0"/>
+          <w:u w:val="single"/>
+          <w:lang w:val="nl-NL"/>
+        </w:rPr>
+        <w:t xml:space="preserve">Story Nr. </w:t>
       </w:r>
       <w:r>
         <w:rPr>
@@ -3784,7 +3635,7 @@
     </w:p>
     <w:p>
       <w:pPr>
-        <w:pStyle w:val="ListParagraph"/>
+        <w:pStyle w:val="Lijstalinea"/>
         <w:numPr>
           <w:ilvl w:val="0"/>
           <w:numId w:val="19"/>
@@ -3867,7 +3718,7 @@
     </w:p>
     <w:p>
       <w:pPr>
-        <w:pStyle w:val="ListParagraph"/>
+        <w:pStyle w:val="Lijstalinea"/>
         <w:numPr>
           <w:ilvl w:val="0"/>
           <w:numId w:val="19"/>
@@ -4005,7 +3856,6 @@
         <w:rPr>
           <w:color w:val="215E99" w:themeColor="text2" w:themeTint="BF"/>
         </w:rPr>
-        <w:lastRenderedPageBreak/>
         <w:t xml:space="preserve">RQ03: </w:t>
       </w:r>
       <w:r>
@@ -4137,7 +3987,6 @@
         </w:rPr>
         <w:t xml:space="preserve"> verwijst naar een eis van de opdrachtgever die is uitgewerkt in </w:t>
       </w:r>
-      <w:proofErr w:type="spellStart"/>
       <w:r>
         <w:rPr>
           <w:rFonts w:ascii="Helvetica Neue" w:hAnsi="Helvetica Neue" w:cs="Helvetica Neue"/>
@@ -4148,9 +3997,8 @@
           <w:u w:val="single"/>
           <w:lang w:val="nl-NL"/>
         </w:rPr>
-        <w:t>UserStory</w:t>
-      </w:r>
-      <w:proofErr w:type="spellEnd"/>
+        <w:t>User</w:t>
+      </w:r>
       <w:r>
         <w:rPr>
           <w:rFonts w:ascii="Helvetica Neue" w:hAnsi="Helvetica Neue" w:cs="Helvetica Neue"/>
@@ -4161,7 +4009,19 @@
           <w:u w:val="single"/>
           <w:lang w:val="nl-NL"/>
         </w:rPr>
-        <w:t xml:space="preserve"> Nr. </w:t>
+        <w:t xml:space="preserve">  </w:t>
+      </w:r>
+      <w:r>
+        <w:rPr>
+          <w:rFonts w:ascii="Helvetica Neue" w:hAnsi="Helvetica Neue" w:cs="Helvetica Neue"/>
+          <w:b/>
+          <w:bCs/>
+          <w:color w:val="000000"/>
+          <w:kern w:val="0"/>
+          <w:u w:val="single"/>
+          <w:lang w:val="nl-NL"/>
+        </w:rPr>
+        <w:t xml:space="preserve">Story Nr. </w:t>
       </w:r>
       <w:r>
         <w:rPr>
@@ -4263,7 +4123,7 @@
     </w:p>
     <w:p>
       <w:pPr>
-        <w:pStyle w:val="ListParagraph"/>
+        <w:pStyle w:val="Lijstalinea"/>
         <w:numPr>
           <w:ilvl w:val="0"/>
           <w:numId w:val="19"/>
@@ -4346,7 +4206,7 @@
     </w:p>
     <w:p>
       <w:pPr>
-        <w:pStyle w:val="ListParagraph"/>
+        <w:pStyle w:val="Lijstalinea"/>
         <w:numPr>
           <w:ilvl w:val="0"/>
           <w:numId w:val="19"/>
@@ -4373,7 +4233,25 @@
           <w:kern w:val="0"/>
           <w:lang w:val="nl-NL"/>
         </w:rPr>
-        <w:t>Rasberry</w:t>
+        <w:t>Ras</w:t>
+      </w:r>
+      <w:r>
+        <w:rPr>
+          <w:rFonts w:ascii="Helvetica Neue" w:hAnsi="Helvetica Neue" w:cs="Helvetica Neue"/>
+          <w:color w:val="000000"/>
+          <w:kern w:val="0"/>
+          <w:lang w:val="nl-NL"/>
+        </w:rPr>
+        <w:t>p</w:t>
+      </w:r>
+      <w:r>
+        <w:rPr>
+          <w:rFonts w:ascii="Helvetica Neue" w:hAnsi="Helvetica Neue" w:cs="Helvetica Neue"/>
+          <w:color w:val="000000"/>
+          <w:kern w:val="0"/>
+          <w:lang w:val="nl-NL"/>
+        </w:rPr>
+        <w:t>berry</w:t>
       </w:r>
       <w:proofErr w:type="spellEnd"/>
       <w:r>
@@ -4388,7 +4266,7 @@
     </w:p>
     <w:p>
       <w:pPr>
-        <w:pStyle w:val="ListParagraph"/>
+        <w:pStyle w:val="Lijstalinea"/>
         <w:numPr>
           <w:ilvl w:val="0"/>
           <w:numId w:val="19"/>
@@ -4780,7 +4658,6 @@
         </w:rPr>
         <w:t xml:space="preserve"> verwijst naar een eis van de opdrachtgever die is uitgewerkt in </w:t>
       </w:r>
-      <w:proofErr w:type="spellStart"/>
       <w:r>
         <w:rPr>
           <w:rFonts w:ascii="Helvetica Neue" w:hAnsi="Helvetica Neue" w:cs="Helvetica Neue"/>
@@ -4791,9 +4668,8 @@
           <w:u w:val="single"/>
           <w:lang w:val="nl-NL"/>
         </w:rPr>
-        <w:t>UserStory</w:t>
-      </w:r>
-      <w:proofErr w:type="spellEnd"/>
+        <w:t>User</w:t>
+      </w:r>
       <w:r>
         <w:rPr>
           <w:rFonts w:ascii="Helvetica Neue" w:hAnsi="Helvetica Neue" w:cs="Helvetica Neue"/>
@@ -4804,7 +4680,19 @@
           <w:u w:val="single"/>
           <w:lang w:val="nl-NL"/>
         </w:rPr>
-        <w:t xml:space="preserve"> Nr. </w:t>
+        <w:t xml:space="preserve"> </w:t>
+      </w:r>
+      <w:r>
+        <w:rPr>
+          <w:rFonts w:ascii="Helvetica Neue" w:hAnsi="Helvetica Neue" w:cs="Helvetica Neue"/>
+          <w:b/>
+          <w:bCs/>
+          <w:color w:val="000000"/>
+          <w:kern w:val="0"/>
+          <w:u w:val="single"/>
+          <w:lang w:val="nl-NL"/>
+        </w:rPr>
+        <w:t xml:space="preserve">Story Nr. </w:t>
       </w:r>
       <w:r>
         <w:rPr>
@@ -4906,7 +4794,7 @@
     </w:p>
     <w:p>
       <w:pPr>
-        <w:pStyle w:val="ListParagraph"/>
+        <w:pStyle w:val="Lijstalinea"/>
         <w:numPr>
           <w:ilvl w:val="0"/>
           <w:numId w:val="19"/>
@@ -4989,7 +4877,7 @@
     </w:p>
     <w:p>
       <w:pPr>
-        <w:pStyle w:val="ListParagraph"/>
+        <w:pStyle w:val="Lijstalinea"/>
         <w:numPr>
           <w:ilvl w:val="0"/>
           <w:numId w:val="19"/>
@@ -5015,12 +4903,13 @@
           <w:kern w:val="0"/>
           <w:lang w:val="nl-NL"/>
         </w:rPr>
+        <w:lastRenderedPageBreak/>
         <w:t>GUI</w:t>
       </w:r>
     </w:p>
     <w:p>
       <w:pPr>
-        <w:pStyle w:val="ListParagraph"/>
+        <w:pStyle w:val="Lijstalinea"/>
         <w:numPr>
           <w:ilvl w:val="0"/>
           <w:numId w:val="19"/>
@@ -5271,7 +5160,6 @@
         </w:rPr>
         <w:t xml:space="preserve"> verwijst naar een eis van de opdrachtgever die is uitgewerkt in </w:t>
       </w:r>
-      <w:proofErr w:type="spellStart"/>
       <w:r>
         <w:rPr>
           <w:rFonts w:ascii="Helvetica Neue" w:hAnsi="Helvetica Neue" w:cs="Helvetica Neue"/>
@@ -5282,9 +5170,8 @@
           <w:u w:val="single"/>
           <w:lang w:val="nl-NL"/>
         </w:rPr>
-        <w:t>UserStory</w:t>
-      </w:r>
-      <w:proofErr w:type="spellEnd"/>
+        <w:t>User</w:t>
+      </w:r>
       <w:r>
         <w:rPr>
           <w:rFonts w:ascii="Helvetica Neue" w:hAnsi="Helvetica Neue" w:cs="Helvetica Neue"/>
@@ -5295,7 +5182,19 @@
           <w:u w:val="single"/>
           <w:lang w:val="nl-NL"/>
         </w:rPr>
-        <w:t xml:space="preserve"> Nr. </w:t>
+        <w:t xml:space="preserve"> </w:t>
+      </w:r>
+      <w:r>
+        <w:rPr>
+          <w:rFonts w:ascii="Helvetica Neue" w:hAnsi="Helvetica Neue" w:cs="Helvetica Neue"/>
+          <w:b/>
+          <w:bCs/>
+          <w:color w:val="000000"/>
+          <w:kern w:val="0"/>
+          <w:u w:val="single"/>
+          <w:lang w:val="nl-NL"/>
+        </w:rPr>
+        <w:t xml:space="preserve">Story Nr. </w:t>
       </w:r>
       <w:r>
         <w:rPr>
@@ -5397,7 +5296,7 @@
     </w:p>
     <w:p>
       <w:pPr>
-        <w:pStyle w:val="ListParagraph"/>
+        <w:pStyle w:val="Lijstalinea"/>
         <w:numPr>
           <w:ilvl w:val="0"/>
           <w:numId w:val="19"/>
@@ -5480,7 +5379,7 @@
     </w:p>
     <w:p>
       <w:pPr>
-        <w:pStyle w:val="ListParagraph"/>
+        <w:pStyle w:val="Lijstalinea"/>
         <w:numPr>
           <w:ilvl w:val="0"/>
           <w:numId w:val="19"/>
@@ -5507,7 +5406,25 @@
           <w:kern w:val="0"/>
           <w:lang w:val="nl-NL"/>
         </w:rPr>
-        <w:t>Rasberry</w:t>
+        <w:t>Ras</w:t>
+      </w:r>
+      <w:r>
+        <w:rPr>
+          <w:rFonts w:ascii="Helvetica Neue" w:hAnsi="Helvetica Neue" w:cs="Helvetica Neue"/>
+          <w:color w:val="000000"/>
+          <w:kern w:val="0"/>
+          <w:lang w:val="nl-NL"/>
+        </w:rPr>
+        <w:t>p</w:t>
+      </w:r>
+      <w:r>
+        <w:rPr>
+          <w:rFonts w:ascii="Helvetica Neue" w:hAnsi="Helvetica Neue" w:cs="Helvetica Neue"/>
+          <w:color w:val="000000"/>
+          <w:kern w:val="0"/>
+          <w:lang w:val="nl-NL"/>
+        </w:rPr>
+        <w:t>berry</w:t>
       </w:r>
       <w:proofErr w:type="spellEnd"/>
       <w:r>
@@ -5522,7 +5439,7 @@
     </w:p>
     <w:p>
       <w:pPr>
-        <w:pStyle w:val="ListParagraph"/>
+        <w:pStyle w:val="Lijstalinea"/>
         <w:numPr>
           <w:ilvl w:val="0"/>
           <w:numId w:val="19"/>
@@ -5824,7 +5741,6 @@
         </w:rPr>
         <w:t xml:space="preserve"> verwijst naar een eis van de opdrachtgever die is uitgewerkt in </w:t>
       </w:r>
-      <w:proofErr w:type="spellStart"/>
       <w:r>
         <w:rPr>
           <w:rFonts w:ascii="Helvetica Neue" w:hAnsi="Helvetica Neue" w:cs="Helvetica Neue"/>
@@ -5835,9 +5751,8 @@
           <w:u w:val="single"/>
           <w:lang w:val="nl-NL"/>
         </w:rPr>
-        <w:t>UserStory</w:t>
-      </w:r>
-      <w:proofErr w:type="spellEnd"/>
+        <w:t>User</w:t>
+      </w:r>
       <w:r>
         <w:rPr>
           <w:rFonts w:ascii="Helvetica Neue" w:hAnsi="Helvetica Neue" w:cs="Helvetica Neue"/>
@@ -5848,7 +5763,19 @@
           <w:u w:val="single"/>
           <w:lang w:val="nl-NL"/>
         </w:rPr>
-        <w:t xml:space="preserve"> Nr. </w:t>
+        <w:t xml:space="preserve"> S</w:t>
+      </w:r>
+      <w:r>
+        <w:rPr>
+          <w:rFonts w:ascii="Helvetica Neue" w:hAnsi="Helvetica Neue" w:cs="Helvetica Neue"/>
+          <w:b/>
+          <w:bCs/>
+          <w:color w:val="000000"/>
+          <w:kern w:val="0"/>
+          <w:u w:val="single"/>
+          <w:lang w:val="nl-NL"/>
+        </w:rPr>
+        <w:t xml:space="preserve">tory Nr. </w:t>
       </w:r>
       <w:r>
         <w:rPr>
@@ -5950,7 +5877,7 @@
     </w:p>
     <w:p>
       <w:pPr>
-        <w:pStyle w:val="ListParagraph"/>
+        <w:pStyle w:val="Lijstalinea"/>
         <w:numPr>
           <w:ilvl w:val="0"/>
           <w:numId w:val="19"/>
@@ -5999,7 +5926,7 @@
     </w:p>
     <w:p>
       <w:pPr>
-        <w:pStyle w:val="ListParagraph"/>
+        <w:pStyle w:val="Lijstalinea"/>
         <w:numPr>
           <w:ilvl w:val="0"/>
           <w:numId w:val="19"/>
@@ -6074,7 +6001,6 @@
           <w:szCs w:val="28"/>
           <w:lang w:val="nl-NL"/>
         </w:rPr>
-        <w:lastRenderedPageBreak/>
         <w:t>-</w:t>
       </w:r>
     </w:p>
@@ -6496,7 +6422,6 @@
         </w:rPr>
         <w:t xml:space="preserve"> van de opdrachtgever die is uitgewerkt in </w:t>
       </w:r>
-      <w:proofErr w:type="spellStart"/>
       <w:r>
         <w:rPr>
           <w:rFonts w:ascii="Helvetica Neue" w:hAnsi="Helvetica Neue" w:cs="Helvetica Neue"/>
@@ -6507,9 +6432,8 @@
           <w:u w:val="single"/>
           <w:lang w:val="nl-NL"/>
         </w:rPr>
-        <w:t>UserStory</w:t>
-      </w:r>
-      <w:proofErr w:type="spellEnd"/>
+        <w:t>User</w:t>
+      </w:r>
       <w:r>
         <w:rPr>
           <w:rFonts w:ascii="Helvetica Neue" w:hAnsi="Helvetica Neue" w:cs="Helvetica Neue"/>
@@ -6520,7 +6444,19 @@
           <w:u w:val="single"/>
           <w:lang w:val="nl-NL"/>
         </w:rPr>
-        <w:t xml:space="preserve"> Nr. </w:t>
+        <w:t xml:space="preserve"> </w:t>
+      </w:r>
+      <w:r>
+        <w:rPr>
+          <w:rFonts w:ascii="Helvetica Neue" w:hAnsi="Helvetica Neue" w:cs="Helvetica Neue"/>
+          <w:b/>
+          <w:bCs/>
+          <w:color w:val="000000"/>
+          <w:kern w:val="0"/>
+          <w:u w:val="single"/>
+          <w:lang w:val="nl-NL"/>
+        </w:rPr>
+        <w:t xml:space="preserve">Story Nr. </w:t>
       </w:r>
       <w:r>
         <w:rPr>
@@ -6622,7 +6558,7 @@
     </w:p>
     <w:p>
       <w:pPr>
-        <w:pStyle w:val="ListParagraph"/>
+        <w:pStyle w:val="Lijstalinea"/>
         <w:numPr>
           <w:ilvl w:val="0"/>
           <w:numId w:val="19"/>
@@ -6705,7 +6641,7 @@
     </w:p>
     <w:p>
       <w:pPr>
-        <w:pStyle w:val="ListParagraph"/>
+        <w:pStyle w:val="Lijstalinea"/>
         <w:numPr>
           <w:ilvl w:val="0"/>
           <w:numId w:val="19"/>
@@ -6732,7 +6668,25 @@
           <w:kern w:val="0"/>
           <w:lang w:val="nl-NL"/>
         </w:rPr>
-        <w:t>Rasberry</w:t>
+        <w:t>Ras</w:t>
+      </w:r>
+      <w:r>
+        <w:rPr>
+          <w:rFonts w:ascii="Helvetica Neue" w:hAnsi="Helvetica Neue" w:cs="Helvetica Neue"/>
+          <w:color w:val="000000"/>
+          <w:kern w:val="0"/>
+          <w:lang w:val="nl-NL"/>
+        </w:rPr>
+        <w:t>p</w:t>
+      </w:r>
+      <w:r>
+        <w:rPr>
+          <w:rFonts w:ascii="Helvetica Neue" w:hAnsi="Helvetica Neue" w:cs="Helvetica Neue"/>
+          <w:color w:val="000000"/>
+          <w:kern w:val="0"/>
+          <w:lang w:val="nl-NL"/>
+        </w:rPr>
+        <w:t>berry</w:t>
       </w:r>
       <w:proofErr w:type="spellEnd"/>
       <w:r>
@@ -6747,7 +6701,7 @@
     </w:p>
     <w:p>
       <w:pPr>
-        <w:pStyle w:val="ListParagraph"/>
+        <w:pStyle w:val="Lijstalinea"/>
         <w:numPr>
           <w:ilvl w:val="0"/>
           <w:numId w:val="19"/>
@@ -7330,7 +7284,6 @@
         </w:rPr>
         <w:t xml:space="preserve"> van de opdrachtgever die is uitgewerkt in </w:t>
       </w:r>
-      <w:proofErr w:type="spellStart"/>
       <w:r>
         <w:rPr>
           <w:rFonts w:ascii="Helvetica Neue" w:hAnsi="Helvetica Neue" w:cs="Helvetica Neue"/>
@@ -7341,9 +7294,8 @@
           <w:u w:val="single"/>
           <w:lang w:val="nl-NL"/>
         </w:rPr>
-        <w:t>UserStory</w:t>
-      </w:r>
-      <w:proofErr w:type="spellEnd"/>
+        <w:t>User</w:t>
+      </w:r>
       <w:r>
         <w:rPr>
           <w:rFonts w:ascii="Helvetica Neue" w:hAnsi="Helvetica Neue" w:cs="Helvetica Neue"/>
@@ -7354,7 +7306,19 @@
           <w:u w:val="single"/>
           <w:lang w:val="nl-NL"/>
         </w:rPr>
-        <w:t xml:space="preserve"> Nr. </w:t>
+        <w:t xml:space="preserve"> </w:t>
+      </w:r>
+      <w:r>
+        <w:rPr>
+          <w:rFonts w:ascii="Helvetica Neue" w:hAnsi="Helvetica Neue" w:cs="Helvetica Neue"/>
+          <w:b/>
+          <w:bCs/>
+          <w:color w:val="000000"/>
+          <w:kern w:val="0"/>
+          <w:u w:val="single"/>
+          <w:lang w:val="nl-NL"/>
+        </w:rPr>
+        <w:t xml:space="preserve">Story Nr. </w:t>
       </w:r>
       <w:r>
         <w:rPr>
@@ -7466,7 +7430,7 @@
     </w:p>
     <w:p>
       <w:pPr>
-        <w:pStyle w:val="ListParagraph"/>
+        <w:pStyle w:val="Lijstalinea"/>
         <w:numPr>
           <w:ilvl w:val="0"/>
           <w:numId w:val="19"/>
@@ -7497,7 +7461,7 @@
     </w:p>
     <w:p>
       <w:pPr>
-        <w:pStyle w:val="ListParagraph"/>
+        <w:pStyle w:val="Lijstalinea"/>
         <w:numPr>
           <w:ilvl w:val="0"/>
           <w:numId w:val="19"/>
@@ -7524,7 +7488,25 @@
           <w:kern w:val="0"/>
           <w:lang w:val="nl-NL"/>
         </w:rPr>
-        <w:t>Rasberry</w:t>
+        <w:t>Ras</w:t>
+      </w:r>
+      <w:r>
+        <w:rPr>
+          <w:rFonts w:ascii="Helvetica Neue" w:hAnsi="Helvetica Neue" w:cs="Helvetica Neue"/>
+          <w:color w:val="000000"/>
+          <w:kern w:val="0"/>
+          <w:lang w:val="nl-NL"/>
+        </w:rPr>
+        <w:t>p</w:t>
+      </w:r>
+      <w:r>
+        <w:rPr>
+          <w:rFonts w:ascii="Helvetica Neue" w:hAnsi="Helvetica Neue" w:cs="Helvetica Neue"/>
+          <w:color w:val="000000"/>
+          <w:kern w:val="0"/>
+          <w:lang w:val="nl-NL"/>
+        </w:rPr>
+        <w:t>berry</w:t>
       </w:r>
       <w:proofErr w:type="spellEnd"/>
       <w:r>
@@ -7539,7 +7521,7 @@
     </w:p>
     <w:p>
       <w:pPr>
-        <w:pStyle w:val="ListParagraph"/>
+        <w:pStyle w:val="Lijstalinea"/>
         <w:numPr>
           <w:ilvl w:val="0"/>
           <w:numId w:val="19"/>
@@ -7649,7 +7631,7 @@
     </w:p>
     <w:p>
       <w:pPr>
-        <w:pStyle w:val="ListParagraph"/>
+        <w:pStyle w:val="Lijstalinea"/>
         <w:numPr>
           <w:ilvl w:val="0"/>
           <w:numId w:val="19"/>
@@ -8036,6 +8018,7 @@
           <w:kern w:val="0"/>
           <w:lang w:val="nl-NL"/>
         </w:rPr>
+        <w:lastRenderedPageBreak/>
         <w:t>De camera moet een object kunnen detecteren van 3 verschillende afmetingen en daarvan een correcte detectiekader overzetten met een nauwkeurigheid en vertraging die wordt waargenomen in normale lichtomstandigheden.</w:t>
       </w:r>
     </w:p>
@@ -8482,7 +8465,7 @@
     </w:p>
     <w:p>
       <w:pPr>
-        <w:pStyle w:val="ListParagraph"/>
+        <w:pStyle w:val="Lijstalinea"/>
         <w:numPr>
           <w:ilvl w:val="0"/>
           <w:numId w:val="19"/>
@@ -8513,7 +8496,7 @@
     </w:p>
     <w:p>
       <w:pPr>
-        <w:pStyle w:val="ListParagraph"/>
+        <w:pStyle w:val="Lijstalinea"/>
         <w:numPr>
           <w:ilvl w:val="0"/>
           <w:numId w:val="19"/>
@@ -8555,7 +8538,7 @@
     </w:p>
     <w:p>
       <w:pPr>
-        <w:pStyle w:val="ListParagraph"/>
+        <w:pStyle w:val="Lijstalinea"/>
         <w:numPr>
           <w:ilvl w:val="0"/>
           <w:numId w:val="19"/>
@@ -8665,7 +8648,7 @@
     </w:p>
     <w:p>
       <w:pPr>
-        <w:pStyle w:val="ListParagraph"/>
+        <w:pStyle w:val="Lijstalinea"/>
         <w:numPr>
           <w:ilvl w:val="0"/>
           <w:numId w:val="19"/>
@@ -9175,7 +9158,7 @@
     </w:p>
     <w:tbl>
       <w:tblPr>
-        <w:tblStyle w:val="TableGrid"/>
+        <w:tblStyle w:val="Tabelraster"/>
         <w:tblW w:w="0" w:type="auto"/>
         <w:tblLook w:val="04A0" w:firstRow="1" w:lastRow="0" w:firstColumn="1" w:lastColumn="0" w:noHBand="0" w:noVBand="1"/>
       </w:tblPr>
@@ -12603,16 +12586,16 @@
     <w:lsdException w:name="Unresolved Mention" w:semiHidden="1" w:unhideWhenUsed="1"/>
     <w:lsdException w:name="Smart Link" w:semiHidden="1" w:unhideWhenUsed="1"/>
   </w:latentStyles>
-  <w:style w:type="paragraph" w:default="1" w:styleId="Normal">
+  <w:style w:type="paragraph" w:default="1" w:styleId="Standaard">
     <w:name w:val="Normal"/>
     <w:qFormat/>
     <w:rsid w:val="00BF08FD"/>
   </w:style>
-  <w:style w:type="paragraph" w:styleId="Heading1">
+  <w:style w:type="paragraph" w:styleId="Kop1">
     <w:name w:val="heading 1"/>
-    <w:basedOn w:val="Normal"/>
-    <w:next w:val="Normal"/>
-    <w:link w:val="Heading1Char"/>
+    <w:basedOn w:val="Standaard"/>
+    <w:next w:val="Standaard"/>
+    <w:link w:val="Kop1Char"/>
     <w:uiPriority w:val="9"/>
     <w:qFormat/>
     <w:rsid w:val="00F52705"/>
@@ -12629,11 +12612,11 @@
       <w:szCs w:val="40"/>
     </w:rPr>
   </w:style>
-  <w:style w:type="paragraph" w:styleId="Heading2">
+  <w:style w:type="paragraph" w:styleId="Kop2">
     <w:name w:val="heading 2"/>
-    <w:basedOn w:val="Normal"/>
-    <w:next w:val="Normal"/>
-    <w:link w:val="Heading2Char"/>
+    <w:basedOn w:val="Standaard"/>
+    <w:next w:val="Standaard"/>
+    <w:link w:val="Kop2Char"/>
     <w:uiPriority w:val="9"/>
     <w:unhideWhenUsed/>
     <w:qFormat/>
@@ -12651,11 +12634,11 @@
       <w:szCs w:val="32"/>
     </w:rPr>
   </w:style>
-  <w:style w:type="paragraph" w:styleId="Heading3">
+  <w:style w:type="paragraph" w:styleId="Kop3">
     <w:name w:val="heading 3"/>
-    <w:basedOn w:val="Normal"/>
-    <w:next w:val="Normal"/>
-    <w:link w:val="Heading3Char"/>
+    <w:basedOn w:val="Standaard"/>
+    <w:next w:val="Standaard"/>
+    <w:link w:val="Kop3Char"/>
     <w:uiPriority w:val="9"/>
     <w:semiHidden/>
     <w:unhideWhenUsed/>
@@ -12674,11 +12657,11 @@
       <w:szCs w:val="28"/>
     </w:rPr>
   </w:style>
-  <w:style w:type="paragraph" w:styleId="Heading4">
+  <w:style w:type="paragraph" w:styleId="Kop4">
     <w:name w:val="heading 4"/>
-    <w:basedOn w:val="Normal"/>
-    <w:next w:val="Normal"/>
-    <w:link w:val="Heading4Char"/>
+    <w:basedOn w:val="Standaard"/>
+    <w:next w:val="Standaard"/>
+    <w:link w:val="Kop4Char"/>
     <w:uiPriority w:val="9"/>
     <w:semiHidden/>
     <w:unhideWhenUsed/>
@@ -12697,11 +12680,11 @@
       <w:color w:val="0F4761" w:themeColor="accent1" w:themeShade="BF"/>
     </w:rPr>
   </w:style>
-  <w:style w:type="paragraph" w:styleId="Heading5">
+  <w:style w:type="paragraph" w:styleId="Kop5">
     <w:name w:val="heading 5"/>
-    <w:basedOn w:val="Normal"/>
-    <w:next w:val="Normal"/>
-    <w:link w:val="Heading5Char"/>
+    <w:basedOn w:val="Standaard"/>
+    <w:next w:val="Standaard"/>
+    <w:link w:val="Kop5Char"/>
     <w:uiPriority w:val="9"/>
     <w:semiHidden/>
     <w:unhideWhenUsed/>
@@ -12718,11 +12701,11 @@
       <w:color w:val="0F4761" w:themeColor="accent1" w:themeShade="BF"/>
     </w:rPr>
   </w:style>
-  <w:style w:type="paragraph" w:styleId="Heading6">
+  <w:style w:type="paragraph" w:styleId="Kop6">
     <w:name w:val="heading 6"/>
-    <w:basedOn w:val="Normal"/>
-    <w:next w:val="Normal"/>
-    <w:link w:val="Heading6Char"/>
+    <w:basedOn w:val="Standaard"/>
+    <w:next w:val="Standaard"/>
+    <w:link w:val="Kop6Char"/>
     <w:uiPriority w:val="9"/>
     <w:semiHidden/>
     <w:unhideWhenUsed/>
@@ -12741,11 +12724,11 @@
       <w:color w:val="595959" w:themeColor="text1" w:themeTint="A6"/>
     </w:rPr>
   </w:style>
-  <w:style w:type="paragraph" w:styleId="Heading7">
+  <w:style w:type="paragraph" w:styleId="Kop7">
     <w:name w:val="heading 7"/>
-    <w:basedOn w:val="Normal"/>
-    <w:next w:val="Normal"/>
-    <w:link w:val="Heading7Char"/>
+    <w:basedOn w:val="Standaard"/>
+    <w:next w:val="Standaard"/>
+    <w:link w:val="Kop7Char"/>
     <w:uiPriority w:val="9"/>
     <w:semiHidden/>
     <w:unhideWhenUsed/>
@@ -12762,11 +12745,11 @@
       <w:color w:val="595959" w:themeColor="text1" w:themeTint="A6"/>
     </w:rPr>
   </w:style>
-  <w:style w:type="paragraph" w:styleId="Heading8">
+  <w:style w:type="paragraph" w:styleId="Kop8">
     <w:name w:val="heading 8"/>
-    <w:basedOn w:val="Normal"/>
-    <w:next w:val="Normal"/>
-    <w:link w:val="Heading8Char"/>
+    <w:basedOn w:val="Standaard"/>
+    <w:next w:val="Standaard"/>
+    <w:link w:val="Kop8Char"/>
     <w:uiPriority w:val="9"/>
     <w:semiHidden/>
     <w:unhideWhenUsed/>
@@ -12785,11 +12768,11 @@
       <w:color w:val="272727" w:themeColor="text1" w:themeTint="D8"/>
     </w:rPr>
   </w:style>
-  <w:style w:type="paragraph" w:styleId="Heading9">
+  <w:style w:type="paragraph" w:styleId="Kop9">
     <w:name w:val="heading 9"/>
-    <w:basedOn w:val="Normal"/>
-    <w:next w:val="Normal"/>
-    <w:link w:val="Heading9Char"/>
+    <w:basedOn w:val="Standaard"/>
+    <w:next w:val="Standaard"/>
+    <w:link w:val="Kop9Char"/>
     <w:uiPriority w:val="9"/>
     <w:semiHidden/>
     <w:unhideWhenUsed/>
@@ -12806,13 +12789,13 @@
       <w:color w:val="272727" w:themeColor="text1" w:themeTint="D8"/>
     </w:rPr>
   </w:style>
-  <w:style w:type="character" w:default="1" w:styleId="DefaultParagraphFont">
+  <w:style w:type="character" w:default="1" w:styleId="Standaardalinea-lettertype">
     <w:name w:val="Default Paragraph Font"/>
     <w:uiPriority w:val="1"/>
     <w:semiHidden/>
     <w:unhideWhenUsed/>
   </w:style>
-  <w:style w:type="table" w:default="1" w:styleId="TableNormal">
+  <w:style w:type="table" w:default="1" w:styleId="Standaardtabel">
     <w:name w:val="Normal Table"/>
     <w:uiPriority w:val="99"/>
     <w:semiHidden/>
@@ -12827,16 +12810,16 @@
       </w:tblCellMar>
     </w:tblPr>
   </w:style>
-  <w:style w:type="numbering" w:default="1" w:styleId="NoList">
+  <w:style w:type="numbering" w:default="1" w:styleId="Geenlijst">
     <w:name w:val="No List"/>
     <w:uiPriority w:val="99"/>
     <w:semiHidden/>
     <w:unhideWhenUsed/>
   </w:style>
-  <w:style w:type="character" w:customStyle="1" w:styleId="Heading1Char">
-    <w:name w:val="Heading 1 Char"/>
-    <w:basedOn w:val="DefaultParagraphFont"/>
-    <w:link w:val="Heading1"/>
+  <w:style w:type="character" w:customStyle="1" w:styleId="Kop1Char">
+    <w:name w:val="Kop 1 Char"/>
+    <w:basedOn w:val="Standaardalinea-lettertype"/>
+    <w:link w:val="Kop1"/>
     <w:uiPriority w:val="9"/>
     <w:rsid w:val="00F52705"/>
     <w:rPr>
@@ -12846,10 +12829,10 @@
       <w:szCs w:val="40"/>
     </w:rPr>
   </w:style>
-  <w:style w:type="character" w:customStyle="1" w:styleId="Heading2Char">
-    <w:name w:val="Heading 2 Char"/>
-    <w:basedOn w:val="DefaultParagraphFont"/>
-    <w:link w:val="Heading2"/>
+  <w:style w:type="character" w:customStyle="1" w:styleId="Kop2Char">
+    <w:name w:val="Kop 2 Char"/>
+    <w:basedOn w:val="Standaardalinea-lettertype"/>
+    <w:link w:val="Kop2"/>
     <w:uiPriority w:val="9"/>
     <w:rsid w:val="00F52705"/>
     <w:rPr>
@@ -12859,10 +12842,10 @@
       <w:szCs w:val="32"/>
     </w:rPr>
   </w:style>
-  <w:style w:type="character" w:customStyle="1" w:styleId="Heading3Char">
-    <w:name w:val="Heading 3 Char"/>
-    <w:basedOn w:val="DefaultParagraphFont"/>
-    <w:link w:val="Heading3"/>
+  <w:style w:type="character" w:customStyle="1" w:styleId="Kop3Char">
+    <w:name w:val="Kop 3 Char"/>
+    <w:basedOn w:val="Standaardalinea-lettertype"/>
+    <w:link w:val="Kop3"/>
     <w:uiPriority w:val="9"/>
     <w:semiHidden/>
     <w:rsid w:val="00F52705"/>
@@ -12873,10 +12856,10 @@
       <w:szCs w:val="28"/>
     </w:rPr>
   </w:style>
-  <w:style w:type="character" w:customStyle="1" w:styleId="Heading4Char">
-    <w:name w:val="Heading 4 Char"/>
-    <w:basedOn w:val="DefaultParagraphFont"/>
-    <w:link w:val="Heading4"/>
+  <w:style w:type="character" w:customStyle="1" w:styleId="Kop4Char">
+    <w:name w:val="Kop 4 Char"/>
+    <w:basedOn w:val="Standaardalinea-lettertype"/>
+    <w:link w:val="Kop4"/>
     <w:uiPriority w:val="9"/>
     <w:semiHidden/>
     <w:rsid w:val="00F52705"/>
@@ -12887,10 +12870,10 @@
       <w:color w:val="0F4761" w:themeColor="accent1" w:themeShade="BF"/>
     </w:rPr>
   </w:style>
-  <w:style w:type="character" w:customStyle="1" w:styleId="Heading5Char">
-    <w:name w:val="Heading 5 Char"/>
-    <w:basedOn w:val="DefaultParagraphFont"/>
-    <w:link w:val="Heading5"/>
+  <w:style w:type="character" w:customStyle="1" w:styleId="Kop5Char">
+    <w:name w:val="Kop 5 Char"/>
+    <w:basedOn w:val="Standaardalinea-lettertype"/>
+    <w:link w:val="Kop5"/>
     <w:uiPriority w:val="9"/>
     <w:semiHidden/>
     <w:rsid w:val="00F52705"/>
@@ -12899,10 +12882,10 @@
       <w:color w:val="0F4761" w:themeColor="accent1" w:themeShade="BF"/>
     </w:rPr>
   </w:style>
-  <w:style w:type="character" w:customStyle="1" w:styleId="Heading6Char">
-    <w:name w:val="Heading 6 Char"/>
-    <w:basedOn w:val="DefaultParagraphFont"/>
-    <w:link w:val="Heading6"/>
+  <w:style w:type="character" w:customStyle="1" w:styleId="Kop6Char">
+    <w:name w:val="Kop 6 Char"/>
+    <w:basedOn w:val="Standaardalinea-lettertype"/>
+    <w:link w:val="Kop6"/>
     <w:uiPriority w:val="9"/>
     <w:semiHidden/>
     <w:rsid w:val="00F52705"/>
@@ -12913,10 +12896,10 @@
       <w:color w:val="595959" w:themeColor="text1" w:themeTint="A6"/>
     </w:rPr>
   </w:style>
-  <w:style w:type="character" w:customStyle="1" w:styleId="Heading7Char">
-    <w:name w:val="Heading 7 Char"/>
-    <w:basedOn w:val="DefaultParagraphFont"/>
-    <w:link w:val="Heading7"/>
+  <w:style w:type="character" w:customStyle="1" w:styleId="Kop7Char">
+    <w:name w:val="Kop 7 Char"/>
+    <w:basedOn w:val="Standaardalinea-lettertype"/>
+    <w:link w:val="Kop7"/>
     <w:uiPriority w:val="9"/>
     <w:semiHidden/>
     <w:rsid w:val="00F52705"/>
@@ -12925,10 +12908,10 @@
       <w:color w:val="595959" w:themeColor="text1" w:themeTint="A6"/>
     </w:rPr>
   </w:style>
-  <w:style w:type="character" w:customStyle="1" w:styleId="Heading8Char">
-    <w:name w:val="Heading 8 Char"/>
-    <w:basedOn w:val="DefaultParagraphFont"/>
-    <w:link w:val="Heading8"/>
+  <w:style w:type="character" w:customStyle="1" w:styleId="Kop8Char">
+    <w:name w:val="Kop 8 Char"/>
+    <w:basedOn w:val="Standaardalinea-lettertype"/>
+    <w:link w:val="Kop8"/>
     <w:uiPriority w:val="9"/>
     <w:semiHidden/>
     <w:rsid w:val="00F52705"/>
@@ -12939,10 +12922,10 @@
       <w:color w:val="272727" w:themeColor="text1" w:themeTint="D8"/>
     </w:rPr>
   </w:style>
-  <w:style w:type="character" w:customStyle="1" w:styleId="Heading9Char">
-    <w:name w:val="Heading 9 Char"/>
-    <w:basedOn w:val="DefaultParagraphFont"/>
-    <w:link w:val="Heading9"/>
+  <w:style w:type="character" w:customStyle="1" w:styleId="Kop9Char">
+    <w:name w:val="Kop 9 Char"/>
+    <w:basedOn w:val="Standaardalinea-lettertype"/>
+    <w:link w:val="Kop9"/>
     <w:uiPriority w:val="9"/>
     <w:semiHidden/>
     <w:rsid w:val="00F52705"/>
@@ -12951,11 +12934,11 @@
       <w:color w:val="272727" w:themeColor="text1" w:themeTint="D8"/>
     </w:rPr>
   </w:style>
-  <w:style w:type="paragraph" w:styleId="Title">
+  <w:style w:type="paragraph" w:styleId="Titel">
     <w:name w:val="Title"/>
-    <w:basedOn w:val="Normal"/>
-    <w:next w:val="Normal"/>
-    <w:link w:val="TitleChar"/>
+    <w:basedOn w:val="Standaard"/>
+    <w:next w:val="Standaard"/>
+    <w:link w:val="TitelChar"/>
     <w:uiPriority w:val="10"/>
     <w:qFormat/>
     <w:rsid w:val="00F52705"/>
@@ -12971,10 +12954,10 @@
       <w:szCs w:val="56"/>
     </w:rPr>
   </w:style>
-  <w:style w:type="character" w:customStyle="1" w:styleId="TitleChar">
-    <w:name w:val="Title Char"/>
-    <w:basedOn w:val="DefaultParagraphFont"/>
-    <w:link w:val="Title"/>
+  <w:style w:type="character" w:customStyle="1" w:styleId="TitelChar">
+    <w:name w:val="Titel Char"/>
+    <w:basedOn w:val="Standaardalinea-lettertype"/>
+    <w:link w:val="Titel"/>
     <w:uiPriority w:val="10"/>
     <w:rsid w:val="00F52705"/>
     <w:rPr>
@@ -12985,11 +12968,11 @@
       <w:szCs w:val="56"/>
     </w:rPr>
   </w:style>
-  <w:style w:type="paragraph" w:styleId="Subtitle">
+  <w:style w:type="paragraph" w:styleId="Ondertitel">
     <w:name w:val="Subtitle"/>
-    <w:basedOn w:val="Normal"/>
-    <w:next w:val="Normal"/>
-    <w:link w:val="SubtitleChar"/>
+    <w:basedOn w:val="Standaard"/>
+    <w:next w:val="Standaard"/>
+    <w:link w:val="OndertitelChar"/>
     <w:uiPriority w:val="11"/>
     <w:qFormat/>
     <w:rsid w:val="00F52705"/>
@@ -13006,10 +12989,10 @@
       <w:szCs w:val="28"/>
     </w:rPr>
   </w:style>
-  <w:style w:type="character" w:customStyle="1" w:styleId="SubtitleChar">
-    <w:name w:val="Subtitle Char"/>
-    <w:basedOn w:val="DefaultParagraphFont"/>
-    <w:link w:val="Subtitle"/>
+  <w:style w:type="character" w:customStyle="1" w:styleId="OndertitelChar">
+    <w:name w:val="Ondertitel Char"/>
+    <w:basedOn w:val="Standaardalinea-lettertype"/>
+    <w:link w:val="Ondertitel"/>
     <w:uiPriority w:val="11"/>
     <w:rsid w:val="00F52705"/>
     <w:rPr>
@@ -13020,11 +13003,11 @@
       <w:szCs w:val="28"/>
     </w:rPr>
   </w:style>
-  <w:style w:type="paragraph" w:styleId="Quote">
+  <w:style w:type="paragraph" w:styleId="Citaat">
     <w:name w:val="Quote"/>
-    <w:basedOn w:val="Normal"/>
-    <w:next w:val="Normal"/>
-    <w:link w:val="QuoteChar"/>
+    <w:basedOn w:val="Standaard"/>
+    <w:next w:val="Standaard"/>
+    <w:link w:val="CitaatChar"/>
     <w:uiPriority w:val="29"/>
     <w:qFormat/>
     <w:rsid w:val="00F52705"/>
@@ -13038,10 +13021,10 @@
       <w:color w:val="404040" w:themeColor="text1" w:themeTint="BF"/>
     </w:rPr>
   </w:style>
-  <w:style w:type="character" w:customStyle="1" w:styleId="QuoteChar">
-    <w:name w:val="Quote Char"/>
-    <w:basedOn w:val="DefaultParagraphFont"/>
-    <w:link w:val="Quote"/>
+  <w:style w:type="character" w:customStyle="1" w:styleId="CitaatChar">
+    <w:name w:val="Citaat Char"/>
+    <w:basedOn w:val="Standaardalinea-lettertype"/>
+    <w:link w:val="Citaat"/>
     <w:uiPriority w:val="29"/>
     <w:rsid w:val="00F52705"/>
     <w:rPr>
@@ -13050,9 +13033,9 @@
       <w:color w:val="404040" w:themeColor="text1" w:themeTint="BF"/>
     </w:rPr>
   </w:style>
-  <w:style w:type="paragraph" w:styleId="ListParagraph">
+  <w:style w:type="paragraph" w:styleId="Lijstalinea">
     <w:name w:val="List Paragraph"/>
-    <w:basedOn w:val="Normal"/>
+    <w:basedOn w:val="Standaard"/>
     <w:uiPriority w:val="34"/>
     <w:qFormat/>
     <w:rsid w:val="00F52705"/>
@@ -13061,9 +13044,9 @@
       <w:contextualSpacing/>
     </w:pPr>
   </w:style>
-  <w:style w:type="character" w:styleId="IntenseEmphasis">
+  <w:style w:type="character" w:styleId="Intensievebenadrukking">
     <w:name w:val="Intense Emphasis"/>
-    <w:basedOn w:val="DefaultParagraphFont"/>
+    <w:basedOn w:val="Standaardalinea-lettertype"/>
     <w:uiPriority w:val="21"/>
     <w:qFormat/>
     <w:rsid w:val="00F52705"/>
@@ -13073,11 +13056,11 @@
       <w:color w:val="0F4761" w:themeColor="accent1" w:themeShade="BF"/>
     </w:rPr>
   </w:style>
-  <w:style w:type="paragraph" w:styleId="IntenseQuote">
+  <w:style w:type="paragraph" w:styleId="Duidelijkcitaat">
     <w:name w:val="Intense Quote"/>
-    <w:basedOn w:val="Normal"/>
-    <w:next w:val="Normal"/>
-    <w:link w:val="IntenseQuoteChar"/>
+    <w:basedOn w:val="Standaard"/>
+    <w:next w:val="Standaard"/>
+    <w:link w:val="DuidelijkcitaatChar"/>
     <w:uiPriority w:val="30"/>
     <w:qFormat/>
     <w:rsid w:val="00F52705"/>
@@ -13096,10 +13079,10 @@
       <w:color w:val="0F4761" w:themeColor="accent1" w:themeShade="BF"/>
     </w:rPr>
   </w:style>
-  <w:style w:type="character" w:customStyle="1" w:styleId="IntenseQuoteChar">
-    <w:name w:val="Intense Quote Char"/>
-    <w:basedOn w:val="DefaultParagraphFont"/>
-    <w:link w:val="IntenseQuote"/>
+  <w:style w:type="character" w:customStyle="1" w:styleId="DuidelijkcitaatChar">
+    <w:name w:val="Duidelijk citaat Char"/>
+    <w:basedOn w:val="Standaardalinea-lettertype"/>
+    <w:link w:val="Duidelijkcitaat"/>
     <w:uiPriority w:val="30"/>
     <w:rsid w:val="00F52705"/>
     <w:rPr>
@@ -13108,9 +13091,9 @@
       <w:color w:val="0F4761" w:themeColor="accent1" w:themeShade="BF"/>
     </w:rPr>
   </w:style>
-  <w:style w:type="character" w:styleId="IntenseReference">
+  <w:style w:type="character" w:styleId="Intensieveverwijzing">
     <w:name w:val="Intense Reference"/>
-    <w:basedOn w:val="DefaultParagraphFont"/>
+    <w:basedOn w:val="Standaardalinea-lettertype"/>
     <w:uiPriority w:val="32"/>
     <w:qFormat/>
     <w:rsid w:val="00F52705"/>
@@ -13122,9 +13105,9 @@
       <w:spacing w:val="5"/>
     </w:rPr>
   </w:style>
-  <w:style w:type="table" w:styleId="TableGrid">
+  <w:style w:type="table" w:styleId="Tabelraster">
     <w:name w:val="Table Grid"/>
-    <w:basedOn w:val="TableNormal"/>
+    <w:basedOn w:val="Standaardtabel"/>
     <w:uiPriority w:val="39"/>
     <w:rsid w:val="00F52705"/>
     <w:pPr>
@@ -13141,9 +13124,9 @@
       </w:tblBorders>
     </w:tblPr>
   </w:style>
-  <w:style w:type="table" w:styleId="TableGridLight">
+  <w:style w:type="table" w:styleId="Tabelrasterlicht">
     <w:name w:val="Grid Table Light"/>
-    <w:basedOn w:val="TableNormal"/>
+    <w:basedOn w:val="Standaardtabel"/>
     <w:uiPriority w:val="40"/>
     <w:rsid w:val="00D53FBC"/>
     <w:pPr>
@@ -13160,9 +13143,9 @@
       </w:tblBorders>
     </w:tblPr>
   </w:style>
-  <w:style w:type="table" w:styleId="PlainTable1">
+  <w:style w:type="table" w:styleId="Onopgemaaktetabel1">
     <w:name w:val="Plain Table 1"/>
-    <w:basedOn w:val="TableNormal"/>
+    <w:basedOn w:val="Standaardtabel"/>
     <w:uiPriority w:val="41"/>
     <w:rsid w:val="005D78C6"/>
     <w:pPr>
@@ -13223,9 +13206,9 @@
       </w:tcPr>
     </w:tblStylePr>
   </w:style>
-  <w:style w:type="table" w:styleId="PlainTable2">
+  <w:style w:type="table" w:styleId="Onopgemaaktetabel2">
     <w:name w:val="Plain Table 2"/>
-    <w:basedOn w:val="TableNormal"/>
+    <w:basedOn w:val="Standaardtabel"/>
     <w:uiPriority w:val="42"/>
     <w:rsid w:val="005D78C6"/>
     <w:pPr>
@@ -13303,9 +13286,9 @@
       </w:tcPr>
     </w:tblStylePr>
   </w:style>
-  <w:style w:type="table" w:styleId="PlainTable3">
+  <w:style w:type="table" w:styleId="Onopgemaaktetabel3">
     <w:name w:val="Plain Table 3"/>
-    <w:basedOn w:val="TableNormal"/>
+    <w:basedOn w:val="Standaardtabel"/>
     <w:uiPriority w:val="43"/>
     <w:rsid w:val="005D78C6"/>
     <w:pPr>
@@ -13396,9 +13379,9 @@
       </w:tcPr>
     </w:tblStylePr>
   </w:style>
-  <w:style w:type="table" w:styleId="PlainTable4">
+  <w:style w:type="table" w:styleId="Onopgemaaktetabel4">
     <w:name w:val="Plain Table 4"/>
-    <w:basedOn w:val="TableNormal"/>
+    <w:basedOn w:val="Standaardtabel"/>
     <w:uiPriority w:val="44"/>
     <w:rsid w:val="005D78C6"/>
     <w:pPr>
@@ -13445,9 +13428,9 @@
       </w:tcPr>
     </w:tblStylePr>
   </w:style>
-  <w:style w:type="table" w:styleId="PlainTable5">
+  <w:style w:type="table" w:styleId="Onopgemaaktetabel5">
     <w:name w:val="Plain Table 5"/>
-    <w:basedOn w:val="TableNormal"/>
+    <w:basedOn w:val="Standaardtabel"/>
     <w:uiPriority w:val="45"/>
     <w:rsid w:val="005D78C6"/>
     <w:pPr>
@@ -13565,9 +13548,9 @@
       </w:tcPr>
     </w:tblStylePr>
   </w:style>
-  <w:style w:type="table" w:styleId="GridTable1Light">
+  <w:style w:type="table" w:styleId="Rastertabel1licht">
     <w:name w:val="Grid Table 1 Light"/>
-    <w:basedOn w:val="TableNormal"/>
+    <w:basedOn w:val="Standaardtabel"/>
     <w:uiPriority w:val="46"/>
     <w:rsid w:val="005D78C6"/>
     <w:pPr>
@@ -13622,9 +13605,9 @@
       </w:rPr>
     </w:tblStylePr>
   </w:style>
-  <w:style w:type="table" w:styleId="GridTable1Light-Accent1">
+  <w:style w:type="table" w:styleId="Rastertabel1licht-Accent1">
     <w:name w:val="Grid Table 1 Light Accent 1"/>
-    <w:basedOn w:val="TableNormal"/>
+    <w:basedOn w:val="Standaardtabel"/>
     <w:uiPriority w:val="46"/>
     <w:rsid w:val="005D78C6"/>
     <w:pPr>
@@ -13679,9 +13662,9 @@
       </w:rPr>
     </w:tblStylePr>
   </w:style>
-  <w:style w:type="table" w:styleId="GridTable1Light-Accent2">
+  <w:style w:type="table" w:styleId="Rastertabel1licht-Accent2">
     <w:name w:val="Grid Table 1 Light Accent 2"/>
-    <w:basedOn w:val="TableNormal"/>
+    <w:basedOn w:val="Standaardtabel"/>
     <w:uiPriority w:val="46"/>
     <w:rsid w:val="005D78C6"/>
     <w:pPr>
@@ -13736,9 +13719,9 @@
       </w:rPr>
     </w:tblStylePr>
   </w:style>
-  <w:style w:type="table" w:styleId="GridTable3-Accent4">
+  <w:style w:type="table" w:styleId="Rastertabel3-Accent4">
     <w:name w:val="Grid Table 3 Accent 4"/>
-    <w:basedOn w:val="TableNormal"/>
+    <w:basedOn w:val="Standaardtabel"/>
     <w:uiPriority w:val="48"/>
     <w:rsid w:val="005D78C6"/>
     <w:pPr>
@@ -13872,9 +13855,9 @@
       </w:tcPr>
     </w:tblStylePr>
   </w:style>
-  <w:style w:type="table" w:styleId="GridTable5Dark">
+  <w:style w:type="table" w:styleId="Rastertabel5donker">
     <w:name w:val="Grid Table 5 Dark"/>
-    <w:basedOn w:val="TableNormal"/>
+    <w:basedOn w:val="Standaardtabel"/>
     <w:uiPriority w:val="50"/>
     <w:rsid w:val="005D78C6"/>
     <w:pPr>
@@ -13978,9 +13961,9 @@
       </w:tcPr>
     </w:tblStylePr>
   </w:style>
-  <w:style w:type="table" w:styleId="ListTable1Light">
+  <w:style w:type="table" w:styleId="Lijsttabel1licht">
     <w:name w:val="List Table 1 Light"/>
-    <w:basedOn w:val="TableNormal"/>
+    <w:basedOn w:val="Standaardtabel"/>
     <w:uiPriority w:val="46"/>
     <w:rsid w:val="005D78C6"/>
     <w:pPr>
@@ -14039,9 +14022,9 @@
       </w:tcPr>
     </w:tblStylePr>
   </w:style>
-  <w:style w:type="table" w:styleId="ListTable4">
+  <w:style w:type="table" w:styleId="Lijsttabel4">
     <w:name w:val="List Table 4"/>
-    <w:basedOn w:val="TableNormal"/>
+    <w:basedOn w:val="Standaardtabel"/>
     <w:uiPriority w:val="49"/>
     <w:rsid w:val="005D78C6"/>
     <w:pPr>
@@ -14113,9 +14096,9 @@
       </w:tcPr>
     </w:tblStylePr>
   </w:style>
-  <w:style w:type="table" w:styleId="ListTable5Dark">
+  <w:style w:type="table" w:styleId="Lijsttabel5donker">
     <w:name w:val="List Table 5 Dark"/>
-    <w:basedOn w:val="TableNormal"/>
+    <w:basedOn w:val="Standaardtabel"/>
     <w:uiPriority w:val="50"/>
     <w:rsid w:val="005D78C6"/>
     <w:pPr>
@@ -14247,9 +14230,9 @@
       </w:tcPr>
     </w:tblStylePr>
   </w:style>
-  <w:style w:type="table" w:styleId="ListTable5Dark-Accent1">
+  <w:style w:type="table" w:styleId="Lijsttabel5donker-Accent1">
     <w:name w:val="List Table 5 Dark Accent 1"/>
-    <w:basedOn w:val="TableNormal"/>
+    <w:basedOn w:val="Standaardtabel"/>
     <w:uiPriority w:val="50"/>
     <w:rsid w:val="005D78C6"/>
     <w:pPr>
@@ -14381,9 +14364,9 @@
       </w:tcPr>
     </w:tblStylePr>
   </w:style>
-  <w:style w:type="table" w:styleId="ListTable2">
+  <w:style w:type="table" w:styleId="Lijsttabel2">
     <w:name w:val="List Table 2"/>
-    <w:basedOn w:val="TableNormal"/>
+    <w:basedOn w:val="Standaardtabel"/>
     <w:uiPriority w:val="47"/>
     <w:rsid w:val="005D78C6"/>
     <w:pPr>
@@ -14435,9 +14418,9 @@
       </w:tcPr>
     </w:tblStylePr>
   </w:style>
-  <w:style w:type="table" w:styleId="GridTable4">
+  <w:style w:type="table" w:styleId="Rastertabel4">
     <w:name w:val="Grid Table 4"/>
-    <w:basedOn w:val="TableNormal"/>
+    <w:basedOn w:val="Standaardtabel"/>
     <w:uiPriority w:val="49"/>
     <w:rsid w:val="005D78C6"/>
     <w:pPr>
@@ -14525,8 +14508,8 @@
   </w:style>
   <w:style w:type="paragraph" w:customStyle="1" w:styleId="Style2">
     <w:name w:val="Style2"/>
-    <w:basedOn w:val="Heading1"/>
-    <w:next w:val="Normal"/>
+    <w:basedOn w:val="Kop1"/>
+    <w:next w:val="Standaard"/>
     <w:qFormat/>
     <w:rsid w:val="001A6124"/>
     <w:rPr>
@@ -14536,8 +14519,8 @@
   </w:style>
   <w:style w:type="paragraph" w:customStyle="1" w:styleId="Style3">
     <w:name w:val="Style3"/>
-    <w:basedOn w:val="Heading2"/>
-    <w:next w:val="Normal"/>
+    <w:basedOn w:val="Kop2"/>
+    <w:next w:val="Standaard"/>
     <w:qFormat/>
     <w:rsid w:val="001A6124"/>
     <w:rPr>
@@ -14546,10 +14529,10 @@
       <w:lang w:val="nl-NL"/>
     </w:rPr>
   </w:style>
-  <w:style w:type="paragraph" w:styleId="TOCHeading">
+  <w:style w:type="paragraph" w:styleId="Kopvaninhoudsopgave">
     <w:name w:val="TOC Heading"/>
-    <w:basedOn w:val="Heading1"/>
-    <w:next w:val="Normal"/>
+    <w:basedOn w:val="Kop1"/>
+    <w:next w:val="Standaard"/>
     <w:uiPriority w:val="39"/>
     <w:unhideWhenUsed/>
     <w:qFormat/>
@@ -14567,10 +14550,10 @@
       <w14:ligatures w14:val="none"/>
     </w:rPr>
   </w:style>
-  <w:style w:type="paragraph" w:styleId="TOC1">
+  <w:style w:type="paragraph" w:styleId="Inhopg1">
     <w:name w:val="toc 1"/>
-    <w:basedOn w:val="Normal"/>
-    <w:next w:val="Normal"/>
+    <w:basedOn w:val="Standaard"/>
+    <w:next w:val="Standaard"/>
     <w:autoRedefine/>
     <w:uiPriority w:val="39"/>
     <w:unhideWhenUsed/>
@@ -14585,10 +14568,10 @@
       <w:iCs/>
     </w:rPr>
   </w:style>
-  <w:style w:type="paragraph" w:styleId="TOC2">
+  <w:style w:type="paragraph" w:styleId="Inhopg2">
     <w:name w:val="toc 2"/>
-    <w:basedOn w:val="Normal"/>
-    <w:next w:val="Normal"/>
+    <w:basedOn w:val="Standaard"/>
+    <w:next w:val="Standaard"/>
     <w:autoRedefine/>
     <w:uiPriority w:val="39"/>
     <w:unhideWhenUsed/>
@@ -14606,7 +14589,7 @@
   </w:style>
   <w:style w:type="character" w:styleId="Hyperlink">
     <w:name w:val="Hyperlink"/>
-    <w:basedOn w:val="DefaultParagraphFont"/>
+    <w:basedOn w:val="Standaardalinea-lettertype"/>
     <w:uiPriority w:val="99"/>
     <w:unhideWhenUsed/>
     <w:rsid w:val="00957DC9"/>
@@ -14615,10 +14598,10 @@
       <w:u w:val="single"/>
     </w:rPr>
   </w:style>
-  <w:style w:type="paragraph" w:styleId="TOC3">
+  <w:style w:type="paragraph" w:styleId="Inhopg3">
     <w:name w:val="toc 3"/>
-    <w:basedOn w:val="Normal"/>
-    <w:next w:val="Normal"/>
+    <w:basedOn w:val="Standaard"/>
+    <w:next w:val="Standaard"/>
     <w:autoRedefine/>
     <w:uiPriority w:val="39"/>
     <w:unhideWhenUsed/>
@@ -14632,10 +14615,10 @@
       <w:szCs w:val="20"/>
     </w:rPr>
   </w:style>
-  <w:style w:type="paragraph" w:styleId="TOC4">
+  <w:style w:type="paragraph" w:styleId="Inhopg4">
     <w:name w:val="toc 4"/>
-    <w:basedOn w:val="Normal"/>
-    <w:next w:val="Normal"/>
+    <w:basedOn w:val="Standaard"/>
+    <w:next w:val="Standaard"/>
     <w:autoRedefine/>
     <w:uiPriority w:val="39"/>
     <w:semiHidden/>
@@ -14650,10 +14633,10 @@
       <w:szCs w:val="20"/>
     </w:rPr>
   </w:style>
-  <w:style w:type="paragraph" w:styleId="TOC5">
+  <w:style w:type="paragraph" w:styleId="Inhopg5">
     <w:name w:val="toc 5"/>
-    <w:basedOn w:val="Normal"/>
-    <w:next w:val="Normal"/>
+    <w:basedOn w:val="Standaard"/>
+    <w:next w:val="Standaard"/>
     <w:autoRedefine/>
     <w:uiPriority w:val="39"/>
     <w:semiHidden/>
@@ -14668,10 +14651,10 @@
       <w:szCs w:val="20"/>
     </w:rPr>
   </w:style>
-  <w:style w:type="paragraph" w:styleId="TOC6">
+  <w:style w:type="paragraph" w:styleId="Inhopg6">
     <w:name w:val="toc 6"/>
-    <w:basedOn w:val="Normal"/>
-    <w:next w:val="Normal"/>
+    <w:basedOn w:val="Standaard"/>
+    <w:next w:val="Standaard"/>
     <w:autoRedefine/>
     <w:uiPriority w:val="39"/>
     <w:semiHidden/>
@@ -14686,10 +14669,10 @@
       <w:szCs w:val="20"/>
     </w:rPr>
   </w:style>
-  <w:style w:type="paragraph" w:styleId="TOC7">
+  <w:style w:type="paragraph" w:styleId="Inhopg7">
     <w:name w:val="toc 7"/>
-    <w:basedOn w:val="Normal"/>
-    <w:next w:val="Normal"/>
+    <w:basedOn w:val="Standaard"/>
+    <w:next w:val="Standaard"/>
     <w:autoRedefine/>
     <w:uiPriority w:val="39"/>
     <w:semiHidden/>
@@ -14704,10 +14687,10 @@
       <w:szCs w:val="20"/>
     </w:rPr>
   </w:style>
-  <w:style w:type="paragraph" w:styleId="TOC8">
+  <w:style w:type="paragraph" w:styleId="Inhopg8">
     <w:name w:val="toc 8"/>
-    <w:basedOn w:val="Normal"/>
-    <w:next w:val="Normal"/>
+    <w:basedOn w:val="Standaard"/>
+    <w:next w:val="Standaard"/>
     <w:autoRedefine/>
     <w:uiPriority w:val="39"/>
     <w:semiHidden/>
@@ -14722,10 +14705,10 @@
       <w:szCs w:val="20"/>
     </w:rPr>
   </w:style>
-  <w:style w:type="paragraph" w:styleId="TOC9">
+  <w:style w:type="paragraph" w:styleId="Inhopg9">
     <w:name w:val="toc 9"/>
-    <w:basedOn w:val="Normal"/>
-    <w:next w:val="Normal"/>
+    <w:basedOn w:val="Standaard"/>
+    <w:next w:val="Standaard"/>
     <w:autoRedefine/>
     <w:uiPriority w:val="39"/>
     <w:semiHidden/>

</xml_diff>

<commit_message>
analyse aangepast/ read aan opleverset
</commit_message>
<xml_diff>
--- a/Opleverset_Project_5-6/Verslagen/Requirement analyse.docx
+++ b/Opleverset_Project_5-6/Verslagen/Requirement analyse.docx
@@ -17,8 +17,19 @@
           <w:sz w:val="36"/>
           <w:szCs w:val="36"/>
         </w:rPr>
-        <w:t>Requirements analyse</w:t>
-      </w:r>
+        <w:t xml:space="preserve">Requirements </w:t>
+      </w:r>
+      <w:proofErr w:type="spellStart"/>
+      <w:r>
+        <w:rPr>
+          <w:b/>
+          <w:bCs/>
+          <w:sz w:val="36"/>
+          <w:szCs w:val="36"/>
+        </w:rPr>
+        <w:t>analyse</w:t>
+      </w:r>
+      <w:proofErr w:type="spellEnd"/>
     </w:p>
     <w:p>
       <w:r>
@@ -172,8 +183,13 @@
     </w:p>
     <w:p>
       <w:r>
-        <w:t>Ali Haimed</w:t>
-      </w:r>
+        <w:t xml:space="preserve">Ali </w:t>
+      </w:r>
+      <w:proofErr w:type="spellStart"/>
+      <w:r>
+        <w:t>Haimed</w:t>
+      </w:r>
+      <w:proofErr w:type="spellEnd"/>
       <w:r>
         <w:tab/>
       </w:r>
@@ -195,13 +211,23 @@
       <w:pPr>
         <w:jc w:val="right"/>
       </w:pPr>
+      <w:proofErr w:type="spellStart"/>
       <w:r>
         <w:rPr>
           <w:b/>
           <w:bCs/>
           <w:u w:val="single"/>
         </w:rPr>
-        <w:t>Docenten:</w:t>
+        <w:t>Docenten</w:t>
+      </w:r>
+      <w:proofErr w:type="spellEnd"/>
+      <w:r>
+        <w:rPr>
+          <w:b/>
+          <w:bCs/>
+          <w:u w:val="single"/>
+        </w:rPr>
+        <w:t>:</w:t>
       </w:r>
     </w:p>
     <w:p>
@@ -215,8 +241,16 @@
         <w:rPr>
           <w:lang w:val="nl-NL"/>
         </w:rPr>
-        <w:t>Sandra Hekkelman</w:t>
-      </w:r>
+        <w:t xml:space="preserve">Sandra </w:t>
+      </w:r>
+      <w:proofErr w:type="spellStart"/>
+      <w:r>
+        <w:rPr>
+          <w:lang w:val="nl-NL"/>
+        </w:rPr>
+        <w:t>Hekkelman</w:t>
+      </w:r>
+      <w:proofErr w:type="spellEnd"/>
     </w:p>
     <w:p>
       <w:pPr>
@@ -286,15 +320,17 @@
       <w:sdtContent>
         <w:p>
           <w:pPr>
-            <w:pStyle w:val="Kopvaninhoudsopgave"/>
+            <w:pStyle w:val="TOCHeading"/>
           </w:pPr>
+          <w:proofErr w:type="spellStart"/>
           <w:r>
             <w:t>Inhoudsopgave</w:t>
           </w:r>
+          <w:proofErr w:type="spellEnd"/>
         </w:p>
         <w:p>
           <w:pPr>
-            <w:pStyle w:val="Inhopg1"/>
+            <w:pStyle w:val="TOC1"/>
             <w:tabs>
               <w:tab w:val="right" w:leader="dot" w:pos="9350"/>
             </w:tabs>
@@ -384,7 +420,7 @@
         </w:p>
         <w:p>
           <w:pPr>
-            <w:pStyle w:val="Inhopg1"/>
+            <w:pStyle w:val="TOC1"/>
             <w:tabs>
               <w:tab w:val="right" w:leader="dot" w:pos="9350"/>
             </w:tabs>
@@ -457,7 +493,7 @@
         </w:p>
         <w:p>
           <w:pPr>
-            <w:pStyle w:val="Inhopg1"/>
+            <w:pStyle w:val="TOC1"/>
             <w:tabs>
               <w:tab w:val="right" w:leader="dot" w:pos="9350"/>
             </w:tabs>
@@ -530,7 +566,7 @@
         </w:p>
         <w:p>
           <w:pPr>
-            <w:pStyle w:val="Inhopg2"/>
+            <w:pStyle w:val="TOC2"/>
             <w:tabs>
               <w:tab w:val="right" w:leader="dot" w:pos="9350"/>
             </w:tabs>
@@ -603,7 +639,7 @@
         </w:p>
         <w:p>
           <w:pPr>
-            <w:pStyle w:val="Inhopg2"/>
+            <w:pStyle w:val="TOC2"/>
             <w:tabs>
               <w:tab w:val="right" w:leader="dot" w:pos="9350"/>
             </w:tabs>
@@ -676,7 +712,7 @@
         </w:p>
         <w:p>
           <w:pPr>
-            <w:pStyle w:val="Inhopg2"/>
+            <w:pStyle w:val="TOC2"/>
             <w:tabs>
               <w:tab w:val="right" w:leader="dot" w:pos="9350"/>
             </w:tabs>
@@ -749,7 +785,7 @@
         </w:p>
         <w:p>
           <w:pPr>
-            <w:pStyle w:val="Inhopg2"/>
+            <w:pStyle w:val="TOC2"/>
             <w:tabs>
               <w:tab w:val="right" w:leader="dot" w:pos="9350"/>
             </w:tabs>
@@ -822,7 +858,7 @@
         </w:p>
         <w:p>
           <w:pPr>
-            <w:pStyle w:val="Inhopg2"/>
+            <w:pStyle w:val="TOC2"/>
             <w:tabs>
               <w:tab w:val="right" w:leader="dot" w:pos="9350"/>
             </w:tabs>
@@ -895,7 +931,7 @@
         </w:p>
         <w:p>
           <w:pPr>
-            <w:pStyle w:val="Inhopg2"/>
+            <w:pStyle w:val="TOC2"/>
             <w:tabs>
               <w:tab w:val="right" w:leader="dot" w:pos="9350"/>
             </w:tabs>
@@ -968,7 +1004,7 @@
         </w:p>
         <w:p>
           <w:pPr>
-            <w:pStyle w:val="Inhopg2"/>
+            <w:pStyle w:val="TOC2"/>
             <w:tabs>
               <w:tab w:val="right" w:leader="dot" w:pos="9350"/>
             </w:tabs>
@@ -1041,7 +1077,7 @@
         </w:p>
         <w:p>
           <w:pPr>
-            <w:pStyle w:val="Inhopg2"/>
+            <w:pStyle w:val="TOC2"/>
             <w:tabs>
               <w:tab w:val="right" w:leader="dot" w:pos="9350"/>
             </w:tabs>
@@ -1114,7 +1150,7 @@
         </w:p>
         <w:p>
           <w:pPr>
-            <w:pStyle w:val="Inhopg2"/>
+            <w:pStyle w:val="TOC2"/>
             <w:tabs>
               <w:tab w:val="right" w:leader="dot" w:pos="9350"/>
             </w:tabs>
@@ -1187,7 +1223,7 @@
         </w:p>
         <w:p>
           <w:pPr>
-            <w:pStyle w:val="Inhopg2"/>
+            <w:pStyle w:val="TOC2"/>
             <w:tabs>
               <w:tab w:val="right" w:leader="dot" w:pos="9350"/>
             </w:tabs>
@@ -1260,7 +1296,7 @@
         </w:p>
         <w:p>
           <w:pPr>
-            <w:pStyle w:val="Inhopg2"/>
+            <w:pStyle w:val="TOC2"/>
             <w:tabs>
               <w:tab w:val="right" w:leader="dot" w:pos="9350"/>
             </w:tabs>
@@ -1374,7 +1410,23 @@
           <w:rFonts w:asciiTheme="majorHAnsi" w:hAnsiTheme="majorHAnsi"/>
           <w:lang w:val="nl-NL"/>
         </w:rPr>
-        <w:t xml:space="preserve">In dit requirements analyse zullen de eisen behandeld worden voor het project: Het lokaliseren en detecteren van drones. Deze analyse zal de </w:t>
+        <w:t xml:space="preserve">In dit </w:t>
+      </w:r>
+      <w:proofErr w:type="spellStart"/>
+      <w:r>
+        <w:rPr>
+          <w:rFonts w:asciiTheme="majorHAnsi" w:hAnsiTheme="majorHAnsi"/>
+          <w:lang w:val="nl-NL"/>
+        </w:rPr>
+        <w:t>requirements</w:t>
+      </w:r>
+      <w:proofErr w:type="spellEnd"/>
+      <w:r>
+        <w:rPr>
+          <w:rFonts w:asciiTheme="majorHAnsi" w:hAnsiTheme="majorHAnsi"/>
+          <w:lang w:val="nl-NL"/>
+        </w:rPr>
+        <w:t xml:space="preserve"> analyse zullen de eisen behandeld worden voor het project: Het lokaliseren en detecteren van drones. Deze analyse zal de </w:t>
       </w:r>
       <w:r>
         <w:rPr>
@@ -1396,6 +1448,7 @@
         </w:rPr>
         <w:t xml:space="preserve">ser </w:t>
       </w:r>
+      <w:proofErr w:type="spellStart"/>
       <w:r>
         <w:rPr>
           <w:rFonts w:asciiTheme="majorHAnsi" w:hAnsiTheme="majorHAnsi"/>
@@ -1414,15 +1467,9 @@
           <w:u w:val="single"/>
           <w:lang w:val="nl-NL"/>
         </w:rPr>
-        <w:t xml:space="preserve">tories </w:t>
-      </w:r>
-      <w:r>
-        <w:rPr>
-          <w:rFonts w:asciiTheme="majorHAnsi" w:hAnsiTheme="majorHAnsi"/>
-          <w:lang w:val="nl-NL"/>
-        </w:rPr>
-        <w:t>van de</w:t>
-      </w:r>
+        <w:t>tories</w:t>
+      </w:r>
+      <w:proofErr w:type="spellEnd"/>
       <w:r>
         <w:rPr>
           <w:rFonts w:asciiTheme="majorHAnsi" w:hAnsiTheme="majorHAnsi"/>
@@ -1431,14 +1478,14 @@
           <w:u w:val="single"/>
           <w:lang w:val="nl-NL"/>
         </w:rPr>
-        <w:t xml:space="preserve"> Product Backlog </w:t>
+        <w:t xml:space="preserve"> </w:t>
       </w:r>
       <w:r>
         <w:rPr>
           <w:rFonts w:asciiTheme="majorHAnsi" w:hAnsiTheme="majorHAnsi"/>
           <w:lang w:val="nl-NL"/>
         </w:rPr>
-        <w:t xml:space="preserve">(zie </w:t>
+        <w:t>van de</w:t>
       </w:r>
       <w:r>
         <w:rPr>
@@ -1448,6 +1495,45 @@
           <w:u w:val="single"/>
           <w:lang w:val="nl-NL"/>
         </w:rPr>
+        <w:t xml:space="preserve"> Product </w:t>
+      </w:r>
+      <w:proofErr w:type="spellStart"/>
+      <w:r>
+        <w:rPr>
+          <w:rFonts w:asciiTheme="majorHAnsi" w:hAnsiTheme="majorHAnsi"/>
+          <w:b/>
+          <w:bCs/>
+          <w:u w:val="single"/>
+          <w:lang w:val="nl-NL"/>
+        </w:rPr>
+        <w:t>Backlog</w:t>
+      </w:r>
+      <w:proofErr w:type="spellEnd"/>
+      <w:r>
+        <w:rPr>
+          <w:rFonts w:asciiTheme="majorHAnsi" w:hAnsiTheme="majorHAnsi"/>
+          <w:b/>
+          <w:bCs/>
+          <w:u w:val="single"/>
+          <w:lang w:val="nl-NL"/>
+        </w:rPr>
+        <w:t xml:space="preserve"> </w:t>
+      </w:r>
+      <w:r>
+        <w:rPr>
+          <w:rFonts w:asciiTheme="majorHAnsi" w:hAnsiTheme="majorHAnsi"/>
+          <w:lang w:val="nl-NL"/>
+        </w:rPr>
+        <w:t xml:space="preserve">(zie </w:t>
+      </w:r>
+      <w:r>
+        <w:rPr>
+          <w:rFonts w:asciiTheme="majorHAnsi" w:hAnsiTheme="majorHAnsi"/>
+          <w:b/>
+          <w:bCs/>
+          <w:u w:val="single"/>
+          <w:lang w:val="nl-NL"/>
+        </w:rPr>
         <w:t>README.md</w:t>
       </w:r>
       <w:r>
@@ -1455,7 +1541,39 @@
           <w:rFonts w:asciiTheme="majorHAnsi" w:hAnsiTheme="majorHAnsi"/>
           <w:lang w:val="nl-NL"/>
         </w:rPr>
-        <w:t>) die zijn geconstrueerd na meerdere meetings met de opdrachtgever behandelen om daarvan passende eisen op te stellen. Deze analyse zal een Prioriteit systeem bevatten die de eisen verdeeld in hoe belangrijk ze zijn voor het project waarin het MoSCoW systeem wordt toegepast. Ook zullen de gekozen componenten voor het project aan het begin van de analyse benoemd worden, eisen waarin er een aanpassing of toevoeging is van de componenten zal aangegeven worden in de requirements zelf</w:t>
+        <w:t xml:space="preserve">) die zijn geconstrueerd na meerdere meetings met de opdrachtgever behandelen om daarvan passende eisen op te stellen. Deze analyse zal een Prioriteit systeem bevatten die de eisen verdeeld in hoe belangrijk ze zijn voor het project waarin het </w:t>
+      </w:r>
+      <w:proofErr w:type="spellStart"/>
+      <w:r>
+        <w:rPr>
+          <w:rFonts w:asciiTheme="majorHAnsi" w:hAnsiTheme="majorHAnsi"/>
+          <w:lang w:val="nl-NL"/>
+        </w:rPr>
+        <w:t>MoSCoW</w:t>
+      </w:r>
+      <w:proofErr w:type="spellEnd"/>
+      <w:r>
+        <w:rPr>
+          <w:rFonts w:asciiTheme="majorHAnsi" w:hAnsiTheme="majorHAnsi"/>
+          <w:lang w:val="nl-NL"/>
+        </w:rPr>
+        <w:t xml:space="preserve"> systeem wordt toegepast. Ook zullen de gekozen componenten voor het project aan het begin van de analyse benoemd worden, eisen waarin er een aanpassing of toevoeging is van de componenten zal aangegeven worden in de </w:t>
+      </w:r>
+      <w:proofErr w:type="spellStart"/>
+      <w:r>
+        <w:rPr>
+          <w:rFonts w:asciiTheme="majorHAnsi" w:hAnsiTheme="majorHAnsi"/>
+          <w:lang w:val="nl-NL"/>
+        </w:rPr>
+        <w:t>requirements</w:t>
+      </w:r>
+      <w:proofErr w:type="spellEnd"/>
+      <w:r>
+        <w:rPr>
+          <w:rFonts w:asciiTheme="majorHAnsi" w:hAnsiTheme="majorHAnsi"/>
+          <w:lang w:val="nl-NL"/>
+        </w:rPr>
+        <w:t xml:space="preserve"> zelf</w:t>
       </w:r>
       <w:r>
         <w:rPr>
@@ -1483,7 +1601,7 @@
     </w:p>
     <w:tbl>
       <w:tblPr>
-        <w:tblStyle w:val="Tabelraster"/>
+        <w:tblStyle w:val="TableGrid"/>
         <w:tblW w:w="0" w:type="auto"/>
         <w:tblLook w:val="04A0" w:firstRow="1" w:lastRow="0" w:firstColumn="1" w:lastColumn="0" w:noHBand="0" w:noVBand="1"/>
       </w:tblPr>
@@ -1497,7 +1615,7 @@
           </w:tcPr>
           <w:tbl>
             <w:tblPr>
-              <w:tblStyle w:val="Tabelrasterlicht"/>
+              <w:tblStyle w:val="TableGridLight"/>
               <w:tblW w:w="0" w:type="auto"/>
               <w:tblLook w:val="04A0" w:firstRow="1" w:lastRow="0" w:firstColumn="1" w:lastColumn="0" w:noHBand="0" w:noVBand="1"/>
             </w:tblPr>
@@ -1520,6 +1638,7 @@
                       <w:bCs/>
                     </w:rPr>
                   </w:pPr>
+                  <w:proofErr w:type="spellStart"/>
                   <w:r>
                     <w:rPr>
                       <w:b/>
@@ -1527,6 +1646,7 @@
                     </w:rPr>
                     <w:t>Prioriteit</w:t>
                   </w:r>
+                  <w:proofErr w:type="spellEnd"/>
                 </w:p>
               </w:tc>
               <w:tc>
@@ -1589,7 +1709,23 @@
                       <w:b/>
                       <w:bCs/>
                     </w:rPr>
-                    <w:t>P1 – Essentieel (must-have)</w:t>
+                    <w:t xml:space="preserve">P1 – </w:t>
+                  </w:r>
+                  <w:proofErr w:type="spellStart"/>
+                  <w:r>
+                    <w:rPr>
+                      <w:b/>
+                      <w:bCs/>
+                    </w:rPr>
+                    <w:t>Essentieel</w:t>
+                  </w:r>
+                  <w:proofErr w:type="spellEnd"/>
+                  <w:r>
+                    <w:rPr>
+                      <w:b/>
+                      <w:bCs/>
+                    </w:rPr>
+                    <w:t xml:space="preserve"> (must-have)</w:t>
                   </w:r>
                 </w:p>
               </w:tc>
@@ -1649,7 +1785,58 @@
                       <w:b/>
                       <w:bCs/>
                     </w:rPr>
-                    <w:t>P2 – Belangrijk (should-have)</w:t>
+                    <w:t xml:space="preserve">P2 – </w:t>
+                  </w:r>
+                  <w:proofErr w:type="spellStart"/>
+                  <w:r>
+                    <w:rPr>
+                      <w:b/>
+                      <w:bCs/>
+                    </w:rPr>
+                    <w:t>Belangrijk</w:t>
+                  </w:r>
+                  <w:proofErr w:type="spellEnd"/>
+                  <w:r>
+                    <w:rPr>
+                      <w:b/>
+                      <w:bCs/>
+                    </w:rPr>
+                    <w:t xml:space="preserve"> (should-have)</w:t>
+                  </w:r>
+                </w:p>
+              </w:tc>
+              <w:tc>
+                <w:tcPr>
+                  <w:tcW w:w="0" w:type="auto"/>
+                  <w:hideMark/>
+                </w:tcPr>
+                <w:p>
+                  <w:pPr>
+                    <w:spacing w:after="160" w:line="278" w:lineRule="auto"/>
+                  </w:pPr>
+                  <w:proofErr w:type="spellStart"/>
+                  <w:r>
+                    <w:t>Verbetert</w:t>
+                  </w:r>
+                  <w:proofErr w:type="spellEnd"/>
+                  <w:r>
+                    <w:t xml:space="preserve"> </w:t>
+                  </w:r>
+                  <w:proofErr w:type="spellStart"/>
+                  <w:r>
+                    <w:t>bruikbaarheid</w:t>
+                  </w:r>
+                  <w:proofErr w:type="spellEnd"/>
+                  <w:r>
+                    <w:t xml:space="preserve"> of </w:t>
+                  </w:r>
+                  <w:proofErr w:type="spellStart"/>
+                  <w:r>
+                    <w:t>betrouwbaarheid</w:t>
+                  </w:r>
+                  <w:proofErr w:type="spellEnd"/>
+                  <w:r>
+                    <w:t>.</w:t>
                   </w:r>
                 </w:p>
               </w:tc>
@@ -1663,21 +1850,15 @@
                     <w:spacing w:after="160" w:line="278" w:lineRule="auto"/>
                   </w:pPr>
                   <w:r>
-                    <w:t>Verbetert bruikbaarheid of betrouwbaarheid.</w:t>
+                    <w:t>Live camera-</w:t>
                   </w:r>
-                </w:p>
-              </w:tc>
-              <w:tc>
-                <w:tcPr>
-                  <w:tcW w:w="0" w:type="auto"/>
-                  <w:hideMark/>
-                </w:tcPr>
-                <w:p>
-                  <w:pPr>
-                    <w:spacing w:after="160" w:line="278" w:lineRule="auto"/>
-                  </w:pPr>
+                  <w:proofErr w:type="spellStart"/>
                   <w:r>
-                    <w:t>Live camera-overzicht, data in GUI.</w:t>
+                    <w:t>overzicht</w:t>
+                  </w:r>
+                  <w:proofErr w:type="spellEnd"/>
+                  <w:r>
+                    <w:t>, data in GUI.</w:t>
                   </w:r>
                 </w:p>
               </w:tc>
@@ -1697,7 +1878,23 @@
                       <w:b/>
                       <w:bCs/>
                     </w:rPr>
-                    <w:t>P3 – Optioneel (could-have)</w:t>
+                    <w:t xml:space="preserve">P3 – </w:t>
+                  </w:r>
+                  <w:proofErr w:type="spellStart"/>
+                  <w:r>
+                    <w:rPr>
+                      <w:b/>
+                      <w:bCs/>
+                    </w:rPr>
+                    <w:t>Optioneel</w:t>
+                  </w:r>
+                  <w:proofErr w:type="spellEnd"/>
+                  <w:r>
+                    <w:rPr>
+                      <w:b/>
+                      <w:bCs/>
+                    </w:rPr>
+                    <w:t xml:space="preserve"> (could-have)</w:t>
                   </w:r>
                 </w:p>
               </w:tc>
@@ -1804,7 +2001,7 @@
     </w:p>
     <w:p>
       <w:pPr>
-        <w:pStyle w:val="Lijstalinea"/>
+        <w:pStyle w:val="ListParagraph"/>
         <w:numPr>
           <w:ilvl w:val="0"/>
           <w:numId w:val="19"/>
@@ -1869,11 +2066,19 @@
         </w:rPr>
         <w:t xml:space="preserve">Voor de keuze van de camera’s is er gekozen door de opdrachtgever om de </w:t>
       </w:r>
-      <w:r>
-        <w:rPr>
-          <w:lang w:val="nl-NL"/>
-        </w:rPr>
-        <w:t>Arducam USB Camera Module</w:t>
+      <w:proofErr w:type="spellStart"/>
+      <w:r>
+        <w:rPr>
+          <w:lang w:val="nl-NL"/>
+        </w:rPr>
+        <w:t>Arducam</w:t>
+      </w:r>
+      <w:proofErr w:type="spellEnd"/>
+      <w:r>
+        <w:rPr>
+          <w:lang w:val="nl-NL"/>
+        </w:rPr>
+        <w:t xml:space="preserve"> USB Camera Module</w:t>
       </w:r>
       <w:r>
         <w:rPr>
@@ -1937,11 +2142,130 @@
     </w:p>
     <w:p>
       <w:pPr>
-        <w:pStyle w:val="Lijstalinea"/>
+        <w:rPr>
+          <w:rFonts w:asciiTheme="majorHAnsi" w:hAnsiTheme="majorHAnsi" w:cs="Helvetica Neue"/>
+          <w:color w:val="000000"/>
+          <w:kern w:val="0"/>
+          <w:lang w:val="nl-NL"/>
+        </w:rPr>
+      </w:pPr>
+    </w:p>
+    <w:p>
+      <w:pPr>
+        <w:pStyle w:val="ListParagraph"/>
         <w:numPr>
           <w:ilvl w:val="0"/>
           <w:numId w:val="19"/>
         </w:numPr>
+        <w:rPr>
+          <w:rFonts w:asciiTheme="majorHAnsi" w:hAnsiTheme="majorHAnsi" w:cs="Helvetica Neue"/>
+          <w:b/>
+          <w:bCs/>
+          <w:color w:val="000000"/>
+          <w:kern w:val="0"/>
+          <w:lang w:val="nl-NL"/>
+        </w:rPr>
+      </w:pPr>
+      <w:r>
+        <w:rPr>
+          <w:rFonts w:asciiTheme="majorHAnsi" w:hAnsiTheme="majorHAnsi" w:cs="Helvetica Neue"/>
+          <w:b/>
+          <w:bCs/>
+          <w:color w:val="000000"/>
+          <w:kern w:val="0"/>
+          <w:lang w:val="nl-NL"/>
+        </w:rPr>
+        <w:t xml:space="preserve">Microcontroller: </w:t>
+      </w:r>
+    </w:p>
+    <w:p>
+      <w:pPr>
+        <w:rPr>
+          <w:rFonts w:asciiTheme="majorHAnsi" w:hAnsiTheme="majorHAnsi" w:cs="Helvetica Neue"/>
+          <w:color w:val="000000"/>
+          <w:kern w:val="0"/>
+          <w:lang w:val="nl-NL"/>
+        </w:rPr>
+      </w:pPr>
+      <w:r>
+        <w:rPr>
+          <w:rFonts w:asciiTheme="majorHAnsi" w:hAnsiTheme="majorHAnsi" w:cs="Helvetica Neue"/>
+          <w:color w:val="000000"/>
+          <w:kern w:val="0"/>
+          <w:lang w:val="nl-NL"/>
+        </w:rPr>
+        <w:t xml:space="preserve">Voor de keuze in Microcontroller is er gekozen voor het gebruik te maken van de </w:t>
+      </w:r>
+      <w:proofErr w:type="spellStart"/>
+      <w:r>
+        <w:rPr>
+          <w:rFonts w:asciiTheme="majorHAnsi" w:hAnsiTheme="majorHAnsi" w:cs="Helvetica Neue"/>
+          <w:b/>
+          <w:bCs/>
+          <w:color w:val="000000"/>
+          <w:kern w:val="0"/>
+          <w:lang w:val="nl-NL"/>
+        </w:rPr>
+        <w:t>Ras</w:t>
+      </w:r>
+      <w:r>
+        <w:rPr>
+          <w:rFonts w:asciiTheme="majorHAnsi" w:hAnsiTheme="majorHAnsi" w:cs="Helvetica Neue"/>
+          <w:b/>
+          <w:bCs/>
+          <w:color w:val="000000"/>
+          <w:kern w:val="0"/>
+          <w:lang w:val="nl-NL"/>
+        </w:rPr>
+        <w:t>p</w:t>
+      </w:r>
+      <w:r>
+        <w:rPr>
+          <w:rFonts w:asciiTheme="majorHAnsi" w:hAnsiTheme="majorHAnsi" w:cs="Helvetica Neue"/>
+          <w:b/>
+          <w:bCs/>
+          <w:color w:val="000000"/>
+          <w:kern w:val="0"/>
+          <w:lang w:val="nl-NL"/>
+        </w:rPr>
+        <w:t>berry</w:t>
+      </w:r>
+      <w:proofErr w:type="spellEnd"/>
+      <w:r>
+        <w:rPr>
+          <w:rFonts w:asciiTheme="majorHAnsi" w:hAnsiTheme="majorHAnsi" w:cs="Helvetica Neue"/>
+          <w:b/>
+          <w:bCs/>
+          <w:color w:val="000000"/>
+          <w:kern w:val="0"/>
+          <w:lang w:val="nl-NL"/>
+        </w:rPr>
+        <w:t xml:space="preserve"> Pi 5</w:t>
+      </w:r>
+      <w:r>
+        <w:rPr>
+          <w:rFonts w:asciiTheme="majorHAnsi" w:hAnsiTheme="majorHAnsi" w:cs="Helvetica Neue"/>
+          <w:color w:val="000000"/>
+          <w:kern w:val="0"/>
+          <w:lang w:val="nl-NL"/>
+        </w:rPr>
+        <w:t xml:space="preserve">. Eisen en de specificaties van de software is terug te vinden in het document </w:t>
+      </w:r>
+      <w:r>
+        <w:rPr>
+          <w:rFonts w:asciiTheme="majorHAnsi" w:hAnsiTheme="majorHAnsi" w:cs="Helvetica Neue"/>
+          <w:b/>
+          <w:bCs/>
+          <w:color w:val="000000"/>
+          <w:kern w:val="0"/>
+          <w:u w:val="single"/>
+          <w:lang w:val="nl-NL"/>
+        </w:rPr>
+        <w:t>Microcontroller onderzoeksverslag.</w:t>
+      </w:r>
+    </w:p>
+    <w:p>
+      <w:pPr>
         <w:tabs>
           <w:tab w:val="right" w:pos="9020"/>
         </w:tabs>
@@ -1955,20 +2279,10 @@
           <w:bCs/>
           <w:color w:val="000000"/>
           <w:kern w:val="0"/>
-          <w:lang w:val="nl-NL"/>
-        </w:rPr>
-      </w:pPr>
-      <w:r>
-        <w:rPr>
-          <w:rFonts w:asciiTheme="majorHAnsi" w:hAnsiTheme="majorHAnsi" w:cs="Helvetica Neue"/>
-          <w:b/>
-          <w:bCs/>
-          <w:color w:val="000000"/>
-          <w:kern w:val="0"/>
-          <w:lang w:val="nl-NL"/>
-        </w:rPr>
-        <w:t>Software:</w:t>
-      </w:r>
+          <w:u w:val="single"/>
+          <w:lang w:val="nl-NL"/>
+        </w:rPr>
+      </w:pPr>
     </w:p>
     <w:p>
       <w:pPr>
@@ -1989,58 +2303,241 @@
           <w:lang w:val="nl-NL"/>
         </w:rPr>
       </w:pPr>
-      <w:r>
-        <w:rPr>
-          <w:rFonts w:asciiTheme="majorHAnsi" w:hAnsiTheme="majorHAnsi" w:cs="Helvetica Neue"/>
-          <w:color w:val="000000"/>
-          <w:kern w:val="0"/>
-          <w:lang w:val="nl-NL"/>
-        </w:rPr>
-        <w:t xml:space="preserve">Voor de keuze in software is er gekozen voor het gebruik te maken van de taal </w:t>
-      </w:r>
-      <w:r>
-        <w:rPr>
-          <w:rFonts w:asciiTheme="majorHAnsi" w:hAnsiTheme="majorHAnsi" w:cs="Helvetica Neue"/>
+    </w:p>
+    <w:p>
+      <w:pPr>
+        <w:tabs>
+          <w:tab w:val="right" w:pos="9020"/>
+        </w:tabs>
+        <w:autoSpaceDE w:val="0"/>
+        <w:autoSpaceDN w:val="0"/>
+        <w:adjustRightInd w:val="0"/>
+        <w:spacing w:after="0" w:line="240" w:lineRule="auto"/>
+        <w:rPr>
+          <w:rFonts w:ascii="Helvetica Neue" w:hAnsi="Helvetica Neue" w:cs="Helvetica Neue"/>
+          <w:color w:val="000000"/>
+          <w:kern w:val="0"/>
+          <w:lang w:val="nl-NL"/>
+        </w:rPr>
+      </w:pPr>
+    </w:p>
+    <w:p>
+      <w:pPr>
+        <w:tabs>
+          <w:tab w:val="right" w:pos="9020"/>
+        </w:tabs>
+        <w:autoSpaceDE w:val="0"/>
+        <w:autoSpaceDN w:val="0"/>
+        <w:adjustRightInd w:val="0"/>
+        <w:spacing w:after="0" w:line="240" w:lineRule="auto"/>
+        <w:rPr>
+          <w:rFonts w:ascii="Helvetica Neue" w:hAnsi="Helvetica Neue" w:cs="Helvetica Neue"/>
           <w:b/>
           <w:bCs/>
-          <w:color w:val="000000"/>
-          <w:kern w:val="0"/>
-          <w:lang w:val="nl-NL"/>
-        </w:rPr>
-        <w:t>Python</w:t>
-      </w:r>
-      <w:r>
-        <w:rPr>
-          <w:rFonts w:asciiTheme="majorHAnsi" w:hAnsiTheme="majorHAnsi" w:cs="Helvetica Neue"/>
-          <w:color w:val="000000"/>
-          <w:kern w:val="0"/>
-          <w:lang w:val="nl-NL"/>
-        </w:rPr>
-        <w:t xml:space="preserve"> en de library </w:t>
-      </w:r>
-      <w:r>
-        <w:rPr>
-          <w:rFonts w:asciiTheme="majorHAnsi" w:hAnsiTheme="majorHAnsi" w:cs="Helvetica Neue"/>
+          <w:color w:val="0070C0"/>
+          <w:kern w:val="0"/>
+          <w:sz w:val="28"/>
+          <w:szCs w:val="28"/>
+          <w:lang w:val="nl-NL"/>
+        </w:rPr>
+      </w:pPr>
+    </w:p>
+    <w:p>
+      <w:pPr>
+        <w:pStyle w:val="Style3"/>
+        <w:rPr>
+          <w:rFonts w:asciiTheme="minorHAnsi" w:hAnsiTheme="minorHAnsi"/>
+          <w:color w:val="215E99" w:themeColor="text2" w:themeTint="BF"/>
+        </w:rPr>
+      </w:pPr>
+      <w:bookmarkStart w:id="3" w:name="_Toc214218434"/>
+    </w:p>
+    <w:p>
+      <w:pPr>
+        <w:pStyle w:val="Style3"/>
+        <w:rPr>
+          <w:rFonts w:asciiTheme="minorHAnsi" w:hAnsiTheme="minorHAnsi"/>
+          <w:color w:val="215E99" w:themeColor="text2" w:themeTint="BF"/>
+        </w:rPr>
+      </w:pPr>
+    </w:p>
+    <w:p>
+      <w:pPr>
+        <w:pStyle w:val="Style3"/>
+        <w:rPr>
+          <w:rFonts w:asciiTheme="minorHAnsi" w:hAnsiTheme="minorHAnsi"/>
+          <w:color w:val="215E99" w:themeColor="text2" w:themeTint="BF"/>
+        </w:rPr>
+      </w:pPr>
+      <w:r>
+        <w:rPr>
+          <w:rFonts w:asciiTheme="minorHAnsi" w:hAnsiTheme="minorHAnsi"/>
+          <w:color w:val="215E99" w:themeColor="text2" w:themeTint="BF"/>
+        </w:rPr>
+        <w:t>RQ01: Objectdetectie (Functioneel (Prioriteit P1))</w:t>
+      </w:r>
+      <w:bookmarkEnd w:id="3"/>
+    </w:p>
+    <w:p>
+      <w:pPr>
+        <w:tabs>
+          <w:tab w:val="right" w:pos="9020"/>
+        </w:tabs>
+        <w:autoSpaceDE w:val="0"/>
+        <w:autoSpaceDN w:val="0"/>
+        <w:adjustRightInd w:val="0"/>
+        <w:spacing w:after="0" w:line="240" w:lineRule="auto"/>
+        <w:rPr>
+          <w:rFonts w:cs="Helvetica Neue"/>
+          <w:i/>
+          <w:iCs/>
+          <w:color w:val="000000"/>
+          <w:kern w:val="0"/>
+          <w:lang w:val="nl-NL"/>
+        </w:rPr>
+      </w:pPr>
+      <w:r>
+        <w:rPr>
+          <w:rFonts w:cs="Helvetica Neue"/>
+          <w:i/>
+          <w:iCs/>
+          <w:color w:val="000000"/>
+          <w:kern w:val="0"/>
+          <w:lang w:val="nl-NL"/>
+        </w:rPr>
+        <w:t>Het systeem detecteert objecten met gebruik van camera’s met een nauwkeurigheid van minimaal 90%</w:t>
+      </w:r>
+      <w:r>
+        <w:rPr>
+          <w:rFonts w:cs="Helvetica Neue"/>
+          <w:i/>
+          <w:iCs/>
+          <w:color w:val="000000"/>
+          <w:kern w:val="0"/>
+          <w:lang w:val="nl-NL"/>
+        </w:rPr>
+        <w:t xml:space="preserve"> en </w:t>
+      </w:r>
+      <w:r>
+        <w:rPr>
+          <w:rFonts w:cs="Helvetica Neue"/>
+          <w:i/>
+          <w:iCs/>
+          <w:color w:val="000000"/>
+          <w:kern w:val="0"/>
+          <w:lang w:val="nl-NL"/>
+        </w:rPr>
+        <w:t>een &lt;</w:t>
+      </w:r>
+      <w:r>
+        <w:rPr>
+          <w:rFonts w:cs="Helvetica Neue"/>
+          <w:i/>
+          <w:iCs/>
+          <w:color w:val="000000"/>
+          <w:kern w:val="0"/>
+          <w:lang w:val="nl-NL"/>
+        </w:rPr>
+        <w:t>2</w:t>
+      </w:r>
+      <w:r>
+        <w:rPr>
+          <w:rFonts w:cs="Helvetica Neue"/>
+          <w:i/>
+          <w:iCs/>
+          <w:color w:val="000000"/>
+          <w:kern w:val="0"/>
+          <w:lang w:val="nl-NL"/>
+        </w:rPr>
+        <w:t>s vertraging) waarin de detectie wordt weergegeven met een detectiekader over het object.</w:t>
+      </w:r>
+    </w:p>
+    <w:p>
+      <w:pPr>
+        <w:tabs>
+          <w:tab w:val="right" w:pos="9020"/>
+        </w:tabs>
+        <w:autoSpaceDE w:val="0"/>
+        <w:autoSpaceDN w:val="0"/>
+        <w:adjustRightInd w:val="0"/>
+        <w:spacing w:after="0" w:line="240" w:lineRule="auto"/>
+        <w:rPr>
+          <w:rFonts w:cs="Helvetica Neue"/>
+          <w:color w:val="000000"/>
+          <w:kern w:val="0"/>
+          <w:lang w:val="nl-NL"/>
+        </w:rPr>
+      </w:pPr>
+    </w:p>
+    <w:p>
+      <w:pPr>
+        <w:tabs>
+          <w:tab w:val="right" w:pos="9020"/>
+        </w:tabs>
+        <w:autoSpaceDE w:val="0"/>
+        <w:autoSpaceDN w:val="0"/>
+        <w:adjustRightInd w:val="0"/>
+        <w:spacing w:after="0" w:line="240" w:lineRule="auto"/>
+        <w:rPr>
+          <w:rFonts w:cs="Helvetica Neue"/>
+          <w:color w:val="000000"/>
+          <w:kern w:val="0"/>
+          <w:lang w:val="nl-NL"/>
+        </w:rPr>
+      </w:pPr>
+      <w:r>
+        <w:rPr>
+          <w:rFonts w:cs="Helvetica Neue"/>
+          <w:color w:val="000000"/>
+          <w:kern w:val="0"/>
+          <w:lang w:val="nl-NL"/>
+        </w:rPr>
+        <w:t xml:space="preserve">Deze </w:t>
+      </w:r>
+      <w:proofErr w:type="spellStart"/>
+      <w:r>
+        <w:rPr>
+          <w:rFonts w:cs="Helvetica Neue"/>
+          <w:color w:val="000000"/>
+          <w:kern w:val="0"/>
+          <w:lang w:val="nl-NL"/>
+        </w:rPr>
+        <w:t>requirement</w:t>
+      </w:r>
+      <w:proofErr w:type="spellEnd"/>
+      <w:r>
+        <w:rPr>
+          <w:rFonts w:cs="Helvetica Neue"/>
+          <w:color w:val="000000"/>
+          <w:kern w:val="0"/>
+          <w:lang w:val="nl-NL"/>
+        </w:rPr>
+        <w:t xml:space="preserve"> verwijst naar een eis van de opdrachtgever die is uitgewerkt in </w:t>
+      </w:r>
+      <w:r>
+        <w:rPr>
+          <w:rFonts w:cs="Helvetica Neue"/>
           <w:b/>
           <w:bCs/>
           <w:color w:val="000000"/>
           <w:kern w:val="0"/>
-          <w:lang w:val="nl-NL"/>
-        </w:rPr>
-        <w:t>OpenCV</w:t>
-      </w:r>
-      <w:r>
-        <w:rPr>
-          <w:rFonts w:asciiTheme="majorHAnsi" w:hAnsiTheme="majorHAnsi" w:cs="Helvetica Neue"/>
-          <w:color w:val="000000"/>
-          <w:kern w:val="0"/>
-          <w:lang w:val="nl-NL"/>
-        </w:rPr>
-        <w:t xml:space="preserve">. Eisen en de specificaties van de software is terug te vinden in het document </w:t>
-      </w:r>
-      <w:r>
-        <w:rPr>
-          <w:rFonts w:asciiTheme="majorHAnsi" w:hAnsiTheme="majorHAnsi" w:cs="Helvetica Neue"/>
+          <w:u w:val="single"/>
+          <w:lang w:val="nl-NL"/>
+        </w:rPr>
+        <w:t>User Story Nr. 1</w:t>
+      </w:r>
+      <w:r>
+        <w:rPr>
+          <w:rFonts w:cs="Helvetica Neue"/>
+          <w:color w:val="000000"/>
+          <w:kern w:val="0"/>
+          <w:lang w:val="nl-NL"/>
+        </w:rPr>
+        <w:t xml:space="preserve"> in de </w:t>
+      </w:r>
+      <w:r>
+        <w:rPr>
+          <w:rFonts w:cs="Helvetica Neue"/>
           <w:b/>
           <w:bCs/>
           <w:color w:val="000000"/>
@@ -2048,122 +2545,94 @@
           <w:u w:val="single"/>
           <w:lang w:val="nl-NL"/>
         </w:rPr>
-        <w:t>Software onderzoeksverslag.</w:t>
-      </w:r>
-    </w:p>
-    <w:p>
-      <w:pPr>
-        <w:rPr>
-          <w:rFonts w:asciiTheme="majorHAnsi" w:hAnsiTheme="majorHAnsi" w:cs="Helvetica Neue"/>
-          <w:color w:val="000000"/>
-          <w:kern w:val="0"/>
-          <w:lang w:val="nl-NL"/>
-        </w:rPr>
-      </w:pPr>
-    </w:p>
-    <w:p>
-      <w:pPr>
-        <w:pStyle w:val="Lijstalinea"/>
+        <w:t xml:space="preserve">Product </w:t>
+      </w:r>
+      <w:proofErr w:type="spellStart"/>
+      <w:r>
+        <w:rPr>
+          <w:rFonts w:cs="Helvetica Neue"/>
+          <w:b/>
+          <w:bCs/>
+          <w:color w:val="000000"/>
+          <w:kern w:val="0"/>
+          <w:u w:val="single"/>
+          <w:lang w:val="nl-NL"/>
+        </w:rPr>
+        <w:t>Backlog</w:t>
+      </w:r>
+      <w:proofErr w:type="spellEnd"/>
+      <w:r>
+        <w:rPr>
+          <w:rFonts w:cs="Helvetica Neue"/>
+          <w:color w:val="000000"/>
+          <w:kern w:val="0"/>
+          <w:lang w:val="nl-NL"/>
+        </w:rPr>
+        <w:t>, in het geval van financiële beperkingen was er een vrije keuze en was het budget te bepalen met de opdrachtgever.</w:t>
+      </w:r>
+    </w:p>
+    <w:p>
+      <w:pPr>
+        <w:tabs>
+          <w:tab w:val="right" w:pos="9020"/>
+        </w:tabs>
+        <w:autoSpaceDE w:val="0"/>
+        <w:autoSpaceDN w:val="0"/>
+        <w:adjustRightInd w:val="0"/>
+        <w:spacing w:after="0" w:line="240" w:lineRule="auto"/>
+        <w:rPr>
+          <w:rFonts w:cs="Helvetica Neue"/>
+          <w:b/>
+          <w:bCs/>
+          <w:color w:val="000000"/>
+          <w:kern w:val="0"/>
+          <w:sz w:val="28"/>
+          <w:szCs w:val="28"/>
+          <w:lang w:val="nl-NL"/>
+        </w:rPr>
+      </w:pPr>
+    </w:p>
+    <w:p>
+      <w:pPr>
+        <w:tabs>
+          <w:tab w:val="right" w:pos="9020"/>
+        </w:tabs>
+        <w:autoSpaceDE w:val="0"/>
+        <w:autoSpaceDN w:val="0"/>
+        <w:adjustRightInd w:val="0"/>
+        <w:spacing w:after="0" w:line="240" w:lineRule="auto"/>
+        <w:rPr>
+          <w:rFonts w:cs="Helvetica Neue"/>
+          <w:b/>
+          <w:bCs/>
+          <w:color w:val="000000"/>
+          <w:kern w:val="0"/>
+          <w:sz w:val="28"/>
+          <w:szCs w:val="28"/>
+          <w:lang w:val="nl-NL"/>
+        </w:rPr>
+      </w:pPr>
+      <w:r>
+        <w:rPr>
+          <w:rFonts w:cs="Helvetica Neue"/>
+          <w:b/>
+          <w:bCs/>
+          <w:color w:val="000000"/>
+          <w:kern w:val="0"/>
+          <w:sz w:val="28"/>
+          <w:szCs w:val="28"/>
+          <w:lang w:val="nl-NL"/>
+        </w:rPr>
+        <w:t>Betrokken componenten:</w:t>
+      </w:r>
+    </w:p>
+    <w:p>
+      <w:pPr>
+        <w:pStyle w:val="ListParagraph"/>
         <w:numPr>
           <w:ilvl w:val="0"/>
           <w:numId w:val="19"/>
         </w:numPr>
-        <w:rPr>
-          <w:rFonts w:asciiTheme="majorHAnsi" w:hAnsiTheme="majorHAnsi" w:cs="Helvetica Neue"/>
-          <w:b/>
-          <w:bCs/>
-          <w:color w:val="000000"/>
-          <w:kern w:val="0"/>
-          <w:lang w:val="nl-NL"/>
-        </w:rPr>
-      </w:pPr>
-      <w:r>
-        <w:rPr>
-          <w:rFonts w:asciiTheme="majorHAnsi" w:hAnsiTheme="majorHAnsi" w:cs="Helvetica Neue"/>
-          <w:b/>
-          <w:bCs/>
-          <w:color w:val="000000"/>
-          <w:kern w:val="0"/>
-          <w:lang w:val="nl-NL"/>
-        </w:rPr>
-        <w:t xml:space="preserve">Microcontroller: </w:t>
-      </w:r>
-    </w:p>
-    <w:p>
-      <w:pPr>
-        <w:rPr>
-          <w:rFonts w:asciiTheme="majorHAnsi" w:hAnsiTheme="majorHAnsi" w:cs="Helvetica Neue"/>
-          <w:color w:val="000000"/>
-          <w:kern w:val="0"/>
-          <w:lang w:val="nl-NL"/>
-        </w:rPr>
-      </w:pPr>
-      <w:r>
-        <w:rPr>
-          <w:rFonts w:asciiTheme="majorHAnsi" w:hAnsiTheme="majorHAnsi" w:cs="Helvetica Neue"/>
-          <w:color w:val="000000"/>
-          <w:kern w:val="0"/>
-          <w:lang w:val="nl-NL"/>
-        </w:rPr>
-        <w:t xml:space="preserve">Voor de keuze in Microcontroller is er gekozen voor het gebruik te maken van de </w:t>
-      </w:r>
-      <w:r>
-        <w:rPr>
-          <w:rFonts w:asciiTheme="majorHAnsi" w:hAnsiTheme="majorHAnsi" w:cs="Helvetica Neue"/>
-          <w:b/>
-          <w:bCs/>
-          <w:color w:val="000000"/>
-          <w:kern w:val="0"/>
-          <w:lang w:val="nl-NL"/>
-        </w:rPr>
-        <w:t>Ras</w:t>
-      </w:r>
-      <w:r>
-        <w:rPr>
-          <w:rFonts w:asciiTheme="majorHAnsi" w:hAnsiTheme="majorHAnsi" w:cs="Helvetica Neue"/>
-          <w:b/>
-          <w:bCs/>
-          <w:color w:val="000000"/>
-          <w:kern w:val="0"/>
-          <w:lang w:val="nl-NL"/>
-        </w:rPr>
-        <w:t>p</w:t>
-      </w:r>
-      <w:r>
-        <w:rPr>
-          <w:rFonts w:asciiTheme="majorHAnsi" w:hAnsiTheme="majorHAnsi" w:cs="Helvetica Neue"/>
-          <w:b/>
-          <w:bCs/>
-          <w:color w:val="000000"/>
-          <w:kern w:val="0"/>
-          <w:lang w:val="nl-NL"/>
-        </w:rPr>
-        <w:t>berry Pi 5</w:t>
-      </w:r>
-      <w:r>
-        <w:rPr>
-          <w:rFonts w:asciiTheme="majorHAnsi" w:hAnsiTheme="majorHAnsi" w:cs="Helvetica Neue"/>
-          <w:color w:val="000000"/>
-          <w:kern w:val="0"/>
-          <w:lang w:val="nl-NL"/>
-        </w:rPr>
-        <w:t xml:space="preserve">. Eisen en de specificaties van de software is terug te vinden in het document </w:t>
-      </w:r>
-      <w:r>
-        <w:rPr>
-          <w:rFonts w:asciiTheme="majorHAnsi" w:hAnsiTheme="majorHAnsi" w:cs="Helvetica Neue"/>
-          <w:b/>
-          <w:bCs/>
-          <w:color w:val="000000"/>
-          <w:kern w:val="0"/>
-          <w:u w:val="single"/>
-          <w:lang w:val="nl-NL"/>
-        </w:rPr>
-        <w:t>Microcontroller onderzoeksverslag.</w:t>
-      </w:r>
-    </w:p>
-    <w:p>
-      <w:pPr>
         <w:tabs>
           <w:tab w:val="right" w:pos="9020"/>
         </w:tabs>
@@ -2172,18 +2641,81 @@
         <w:adjustRightInd w:val="0"/>
         <w:spacing w:after="0" w:line="240" w:lineRule="auto"/>
         <w:rPr>
-          <w:rFonts w:asciiTheme="majorHAnsi" w:hAnsiTheme="majorHAnsi" w:cs="Helvetica Neue"/>
-          <w:b/>
-          <w:bCs/>
-          <w:color w:val="000000"/>
-          <w:kern w:val="0"/>
-          <w:u w:val="single"/>
-          <w:lang w:val="nl-NL"/>
-        </w:rPr>
-      </w:pPr>
-    </w:p>
-    <w:p>
-      <w:pPr>
+          <w:rFonts w:cs="Helvetica Neue"/>
+          <w:color w:val="000000"/>
+          <w:kern w:val="0"/>
+        </w:rPr>
+      </w:pPr>
+      <w:r>
+        <w:rPr>
+          <w:rFonts w:cs="Helvetica Neue"/>
+          <w:color w:val="000000"/>
+          <w:kern w:val="0"/>
+        </w:rPr>
+        <w:t>Camera (</w:t>
+      </w:r>
+      <w:proofErr w:type="spellStart"/>
+      <w:r>
+        <w:rPr>
+          <w:rFonts w:cs="Helvetica Neue"/>
+          <w:color w:val="000000"/>
+          <w:kern w:val="0"/>
+        </w:rPr>
+        <w:t>Arducam</w:t>
+      </w:r>
+      <w:proofErr w:type="spellEnd"/>
+      <w:r>
+        <w:rPr>
+          <w:rFonts w:cs="Helvetica Neue"/>
+          <w:color w:val="000000"/>
+          <w:kern w:val="0"/>
+        </w:rPr>
+        <w:t xml:space="preserve"> of </w:t>
+      </w:r>
+      <w:proofErr w:type="spellStart"/>
+      <w:r>
+        <w:rPr>
+          <w:rFonts w:cs="Helvetica Neue"/>
+          <w:color w:val="000000"/>
+          <w:kern w:val="0"/>
+        </w:rPr>
+        <w:t>Waveshare</w:t>
+      </w:r>
+      <w:proofErr w:type="spellEnd"/>
+      <w:r>
+        <w:rPr>
+          <w:rFonts w:cs="Helvetica Neue"/>
+          <w:color w:val="000000"/>
+          <w:kern w:val="0"/>
+        </w:rPr>
+        <w:t xml:space="preserve"> </w:t>
+      </w:r>
+      <w:proofErr w:type="spellStart"/>
+      <w:r>
+        <w:rPr>
+          <w:rFonts w:cs="Helvetica Neue"/>
+          <w:color w:val="000000"/>
+          <w:kern w:val="0"/>
+        </w:rPr>
+        <w:t>stereocamera</w:t>
+      </w:r>
+      <w:proofErr w:type="spellEnd"/>
+      <w:r>
+        <w:rPr>
+          <w:rFonts w:cs="Helvetica Neue"/>
+          <w:color w:val="000000"/>
+          <w:kern w:val="0"/>
+        </w:rPr>
+        <w:t>)</w:t>
+      </w:r>
+    </w:p>
+    <w:p>
+      <w:pPr>
+        <w:pStyle w:val="ListParagraph"/>
+        <w:numPr>
+          <w:ilvl w:val="0"/>
+          <w:numId w:val="19"/>
+        </w:numPr>
         <w:tabs>
           <w:tab w:val="right" w:pos="9020"/>
         </w:tabs>
@@ -2192,18 +2724,40 @@
         <w:adjustRightInd w:val="0"/>
         <w:spacing w:after="0" w:line="240" w:lineRule="auto"/>
         <w:rPr>
-          <w:rFonts w:asciiTheme="majorHAnsi" w:hAnsiTheme="majorHAnsi" w:cs="Helvetica Neue"/>
-          <w:b/>
-          <w:bCs/>
-          <w:color w:val="000000"/>
-          <w:kern w:val="0"/>
-          <w:u w:val="single"/>
-          <w:lang w:val="nl-NL"/>
-        </w:rPr>
-      </w:pPr>
-    </w:p>
-    <w:p>
-      <w:pPr>
+          <w:rFonts w:cs="Helvetica Neue"/>
+          <w:color w:val="000000"/>
+          <w:kern w:val="0"/>
+          <w:lang w:val="nl-NL"/>
+        </w:rPr>
+      </w:pPr>
+      <w:proofErr w:type="spellStart"/>
+      <w:r>
+        <w:rPr>
+          <w:rFonts w:cs="Helvetica Neue"/>
+          <w:color w:val="000000"/>
+          <w:kern w:val="0"/>
+          <w:lang w:val="nl-NL"/>
+        </w:rPr>
+        <w:t>Raspberry</w:t>
+      </w:r>
+      <w:proofErr w:type="spellEnd"/>
+      <w:r>
+        <w:rPr>
+          <w:rFonts w:cs="Helvetica Neue"/>
+          <w:color w:val="000000"/>
+          <w:kern w:val="0"/>
+          <w:lang w:val="nl-NL"/>
+        </w:rPr>
+        <w:t xml:space="preserve"> Pi 5</w:t>
+      </w:r>
+    </w:p>
+    <w:p>
+      <w:pPr>
+        <w:pStyle w:val="ListParagraph"/>
+        <w:numPr>
+          <w:ilvl w:val="0"/>
+          <w:numId w:val="19"/>
+        </w:numPr>
         <w:tabs>
           <w:tab w:val="right" w:pos="9020"/>
         </w:tabs>
@@ -2212,12 +2766,32 @@
         <w:adjustRightInd w:val="0"/>
         <w:spacing w:after="0" w:line="240" w:lineRule="auto"/>
         <w:rPr>
-          <w:rFonts w:ascii="Helvetica Neue" w:hAnsi="Helvetica Neue" w:cs="Helvetica Neue"/>
-          <w:color w:val="000000"/>
-          <w:kern w:val="0"/>
-          <w:lang w:val="nl-NL"/>
-        </w:rPr>
-      </w:pPr>
+          <w:rFonts w:cs="Helvetica Neue"/>
+          <w:color w:val="000000"/>
+          <w:kern w:val="0"/>
+          <w:lang w:val="nl-NL"/>
+        </w:rPr>
+      </w:pPr>
+      <w:r>
+        <w:rPr>
+          <w:rFonts w:cs="Helvetica Neue"/>
+          <w:color w:val="000000"/>
+          <w:kern w:val="0"/>
+          <w:lang w:val="nl-NL"/>
+        </w:rPr>
+        <w:t xml:space="preserve">Python met </w:t>
+      </w:r>
+      <w:proofErr w:type="spellStart"/>
+      <w:r>
+        <w:rPr>
+          <w:rFonts w:cs="Helvetica Neue"/>
+          <w:color w:val="000000"/>
+          <w:kern w:val="0"/>
+          <w:lang w:val="nl-NL"/>
+        </w:rPr>
+        <w:t>Opencv</w:t>
+      </w:r>
+      <w:proofErr w:type="spellEnd"/>
     </w:p>
     <w:p>
       <w:pPr>
@@ -2229,35 +2803,12 @@
         <w:adjustRightInd w:val="0"/>
         <w:spacing w:after="0" w:line="240" w:lineRule="auto"/>
         <w:rPr>
-          <w:rFonts w:ascii="Helvetica Neue" w:hAnsi="Helvetica Neue" w:cs="Helvetica Neue"/>
-          <w:b/>
-          <w:bCs/>
-          <w:color w:val="0070C0"/>
-          <w:kern w:val="0"/>
-          <w:sz w:val="28"/>
-          <w:szCs w:val="28"/>
-          <w:lang w:val="nl-NL"/>
-        </w:rPr>
-      </w:pPr>
-    </w:p>
-    <w:p>
-      <w:pPr>
-        <w:pStyle w:val="Style3"/>
-        <w:rPr>
-          <w:rFonts w:asciiTheme="minorHAnsi" w:hAnsiTheme="minorHAnsi"/>
-          <w:color w:val="215E99" w:themeColor="text2" w:themeTint="BF"/>
-        </w:rPr>
-      </w:pPr>
-      <w:bookmarkStart w:id="3" w:name="_Toc214218434"/>
-      <w:r>
-        <w:rPr>
-          <w:rFonts w:asciiTheme="minorHAnsi" w:hAnsiTheme="minorHAnsi"/>
-          <w:color w:val="215E99" w:themeColor="text2" w:themeTint="BF"/>
-        </w:rPr>
-        <w:lastRenderedPageBreak/>
-        <w:t>RQ01: Objectdetectie (Functioneel (Prioriteit P1))</w:t>
-      </w:r>
-      <w:bookmarkEnd w:id="3"/>
+          <w:rFonts w:cs="Helvetica Neue"/>
+          <w:color w:val="000000"/>
+          <w:kern w:val="0"/>
+          <w:lang w:val="nl-NL"/>
+        </w:rPr>
+      </w:pPr>
     </w:p>
     <w:p>
       <w:pPr>
@@ -2270,68 +2821,15 @@
         <w:spacing w:after="0" w:line="240" w:lineRule="auto"/>
         <w:rPr>
           <w:rFonts w:cs="Helvetica Neue"/>
-          <w:i/>
-          <w:iCs/>
-          <w:color w:val="000000"/>
-          <w:kern w:val="0"/>
-          <w:lang w:val="nl-NL"/>
-        </w:rPr>
-      </w:pPr>
-      <w:r>
-        <w:rPr>
-          <w:rFonts w:cs="Helvetica Neue"/>
-          <w:i/>
-          <w:iCs/>
-          <w:color w:val="000000"/>
-          <w:kern w:val="0"/>
-          <w:lang w:val="nl-NL"/>
-        </w:rPr>
-        <w:t>Het systeem detecteert objecten met gebruik van camera’s met een nauwkeurigheid van minimaal 90%</w:t>
-      </w:r>
-      <w:r>
-        <w:rPr>
-          <w:rFonts w:cs="Helvetica Neue"/>
-          <w:i/>
-          <w:iCs/>
-          <w:color w:val="000000"/>
-          <w:kern w:val="0"/>
-          <w:lang w:val="nl-NL"/>
-        </w:rPr>
-        <w:t xml:space="preserve"> en </w:t>
-      </w:r>
-      <w:r>
-        <w:rPr>
-          <w:rFonts w:cs="Helvetica Neue"/>
-          <w:i/>
-          <w:iCs/>
-          <w:color w:val="000000"/>
-          <w:kern w:val="0"/>
-          <w:lang w:val="nl-NL"/>
-        </w:rPr>
-        <w:t>een &lt;</w:t>
-      </w:r>
-      <w:r>
-        <w:rPr>
-          <w:rFonts w:cs="Helvetica Neue"/>
-          <w:i/>
-          <w:iCs/>
-          <w:color w:val="000000"/>
-          <w:kern w:val="0"/>
-          <w:lang w:val="nl-NL"/>
-        </w:rPr>
-        <w:t>2</w:t>
-      </w:r>
-      <w:r>
-        <w:rPr>
-          <w:rFonts w:cs="Helvetica Neue"/>
-          <w:i/>
-          <w:iCs/>
-          <w:color w:val="000000"/>
-          <w:kern w:val="0"/>
-          <w:lang w:val="nl-NL"/>
-        </w:rPr>
-        <w:t>s vertraging) waarin de detectie wordt weergegeven met een detectiekader over het object.</w:t>
-      </w:r>
+          <w:b/>
+          <w:bCs/>
+          <w:color w:val="000000"/>
+          <w:kern w:val="0"/>
+          <w:sz w:val="28"/>
+          <w:szCs w:val="28"/>
+          <w:lang w:val="nl-NL"/>
+        </w:rPr>
+      </w:pPr>
     </w:p>
     <w:p>
       <w:pPr>
@@ -2344,11 +2842,28 @@
         <w:spacing w:after="0" w:line="240" w:lineRule="auto"/>
         <w:rPr>
           <w:rFonts w:cs="Helvetica Neue"/>
-          <w:color w:val="000000"/>
-          <w:kern w:val="0"/>
-          <w:lang w:val="nl-NL"/>
-        </w:rPr>
-      </w:pPr>
+          <w:b/>
+          <w:bCs/>
+          <w:color w:val="000000"/>
+          <w:kern w:val="0"/>
+          <w:sz w:val="28"/>
+          <w:szCs w:val="28"/>
+          <w:lang w:val="nl-NL"/>
+        </w:rPr>
+      </w:pPr>
+      <w:r>
+        <w:rPr>
+          <w:rFonts w:cs="Helvetica Neue"/>
+          <w:b/>
+          <w:bCs/>
+          <w:color w:val="000000"/>
+          <w:kern w:val="0"/>
+          <w:sz w:val="28"/>
+          <w:szCs w:val="28"/>
+          <w:lang w:val="nl-NL"/>
+        </w:rPr>
+        <w:t xml:space="preserve">Test: </w:t>
+      </w:r>
     </w:p>
     <w:p>
       <w:pPr>
@@ -2373,49 +2888,34 @@
           <w:kern w:val="0"/>
           <w:lang w:val="nl-NL"/>
         </w:rPr>
-        <w:t xml:space="preserve">Deze requirement verwijst naar een eis van de opdrachtgever die is uitgewerkt in </w:t>
-      </w:r>
-      <w:r>
-        <w:rPr>
-          <w:rFonts w:cs="Helvetica Neue"/>
-          <w:b/>
-          <w:bCs/>
-          <w:color w:val="000000"/>
-          <w:kern w:val="0"/>
-          <w:u w:val="single"/>
-          <w:lang w:val="nl-NL"/>
-        </w:rPr>
-        <w:t>User Story Nr. 1</w:t>
-      </w:r>
-      <w:r>
-        <w:rPr>
-          <w:rFonts w:cs="Helvetica Neue"/>
-          <w:color w:val="000000"/>
-          <w:kern w:val="0"/>
-          <w:lang w:val="nl-NL"/>
-        </w:rPr>
-        <w:t xml:space="preserve"> in de </w:t>
-      </w:r>
-      <w:r>
-        <w:rPr>
-          <w:rFonts w:cs="Helvetica Neue"/>
-          <w:b/>
-          <w:bCs/>
-          <w:color w:val="000000"/>
-          <w:kern w:val="0"/>
-          <w:u w:val="single"/>
-          <w:lang w:val="nl-NL"/>
-        </w:rPr>
-        <w:t>Product Backlog</w:t>
-      </w:r>
-      <w:r>
-        <w:rPr>
-          <w:rFonts w:cs="Helvetica Neue"/>
-          <w:color w:val="000000"/>
-          <w:kern w:val="0"/>
-          <w:lang w:val="nl-NL"/>
-        </w:rPr>
-        <w:t>, in het geval van financiële beperkingen was er een vrije keuze en was het budget te bepalen met de opdrachtgever.</w:t>
+        <w:t>Zie Testrapport</w:t>
+      </w:r>
+      <w:r>
+        <w:rPr>
+          <w:rFonts w:cs="Helvetica Neue"/>
+          <w:color w:val="000000"/>
+          <w:kern w:val="0"/>
+          <w:lang w:val="nl-NL"/>
+        </w:rPr>
+        <w:t xml:space="preserve"> Test </w:t>
+      </w:r>
+      <w:r>
+        <w:rPr>
+          <w:rFonts w:cs="Helvetica Neue"/>
+          <w:color w:val="000000"/>
+          <w:kern w:val="0"/>
+          <w:lang w:val="nl-NL"/>
+        </w:rPr>
+        <w:t>2</w:t>
+      </w:r>
+      <w:r>
+        <w:rPr>
+          <w:rFonts w:cs="Helvetica Neue"/>
+          <w:color w:val="000000"/>
+          <w:kern w:val="0"/>
+          <w:lang w:val="nl-NL"/>
+        </w:rPr>
+        <w:t>: ‘Object Detectie’</w:t>
       </w:r>
     </w:p>
     <w:p>
@@ -2429,12 +2929,8 @@
         <w:spacing w:after="0" w:line="240" w:lineRule="auto"/>
         <w:rPr>
           <w:rFonts w:cs="Helvetica Neue"/>
-          <w:b/>
-          <w:bCs/>
-          <w:color w:val="000000"/>
-          <w:kern w:val="0"/>
-          <w:sz w:val="28"/>
-          <w:szCs w:val="28"/>
+          <w:color w:val="000000"/>
+          <w:kern w:val="0"/>
           <w:lang w:val="nl-NL"/>
         </w:rPr>
       </w:pPr>
@@ -2459,6 +2955,138 @@
           <w:lang w:val="nl-NL"/>
         </w:rPr>
       </w:pPr>
+    </w:p>
+    <w:p>
+      <w:pPr>
+        <w:pStyle w:val="Style3"/>
+        <w:rPr>
+          <w:rFonts w:asciiTheme="minorHAnsi" w:hAnsiTheme="minorHAnsi"/>
+          <w:color w:val="215E99" w:themeColor="text2" w:themeTint="BF"/>
+        </w:rPr>
+      </w:pPr>
+      <w:bookmarkStart w:id="4" w:name="_Toc214218435"/>
+      <w:r>
+        <w:rPr>
+          <w:rFonts w:asciiTheme="minorHAnsi" w:hAnsiTheme="minorHAnsi"/>
+          <w:color w:val="215E99" w:themeColor="text2" w:themeTint="BF"/>
+        </w:rPr>
+        <w:t>RQ02: Gebruikersinterface (Functioneel (Prioriteit P1))</w:t>
+      </w:r>
+      <w:bookmarkEnd w:id="4"/>
+    </w:p>
+    <w:p>
+      <w:pPr>
+        <w:rPr>
+          <w:i/>
+          <w:iCs/>
+          <w:lang w:val="nl-NL"/>
+        </w:rPr>
+      </w:pPr>
+      <w:r>
+        <w:rPr>
+          <w:rFonts w:cs="Helvetica Neue"/>
+          <w:i/>
+          <w:iCs/>
+          <w:color w:val="000000"/>
+          <w:kern w:val="0"/>
+          <w:lang w:val="nl-NL"/>
+        </w:rPr>
+        <w:t xml:space="preserve">Er wordt een </w:t>
+      </w:r>
+      <w:proofErr w:type="spellStart"/>
+      <w:r>
+        <w:rPr>
+          <w:rFonts w:cs="Helvetica Neue"/>
+          <w:i/>
+          <w:iCs/>
+          <w:color w:val="000000"/>
+          <w:kern w:val="0"/>
+          <w:lang w:val="nl-NL"/>
+        </w:rPr>
+        <w:t>Graphical</w:t>
+      </w:r>
+      <w:proofErr w:type="spellEnd"/>
+      <w:r>
+        <w:rPr>
+          <w:rFonts w:cs="Helvetica Neue"/>
+          <w:i/>
+          <w:iCs/>
+          <w:color w:val="000000"/>
+          <w:kern w:val="0"/>
+          <w:lang w:val="nl-NL"/>
+        </w:rPr>
+        <w:t xml:space="preserve"> User Interface (GUI) aangemaakt die de real-time beeld, afstand en positie kan laten zien door middel van de data van de </w:t>
+      </w:r>
+      <w:proofErr w:type="spellStart"/>
+      <w:r>
+        <w:rPr>
+          <w:rFonts w:cs="Helvetica Neue"/>
+          <w:i/>
+          <w:iCs/>
+          <w:color w:val="000000"/>
+          <w:kern w:val="0"/>
+          <w:lang w:val="nl-NL"/>
+        </w:rPr>
+        <w:t>Raspberry</w:t>
+      </w:r>
+      <w:proofErr w:type="spellEnd"/>
+      <w:r>
+        <w:rPr>
+          <w:rFonts w:cs="Helvetica Neue"/>
+          <w:i/>
+          <w:iCs/>
+          <w:color w:val="000000"/>
+          <w:kern w:val="0"/>
+          <w:lang w:val="nl-NL"/>
+        </w:rPr>
+        <w:t xml:space="preserve"> Pi 5 op te nemen.</w:t>
+      </w:r>
+    </w:p>
+    <w:p>
+      <w:pPr>
+        <w:tabs>
+          <w:tab w:val="right" w:pos="9020"/>
+        </w:tabs>
+        <w:autoSpaceDE w:val="0"/>
+        <w:autoSpaceDN w:val="0"/>
+        <w:adjustRightInd w:val="0"/>
+        <w:spacing w:after="0" w:line="240" w:lineRule="auto"/>
+        <w:rPr>
+          <w:rFonts w:cs="Helvetica Neue"/>
+          <w:color w:val="000000"/>
+          <w:kern w:val="0"/>
+          <w:lang w:val="nl-NL"/>
+        </w:rPr>
+      </w:pPr>
+      <w:r>
+        <w:rPr>
+          <w:rFonts w:cs="Helvetica Neue"/>
+          <w:color w:val="000000"/>
+          <w:kern w:val="0"/>
+          <w:lang w:val="nl-NL"/>
+        </w:rPr>
+        <w:t xml:space="preserve">Deze </w:t>
+      </w:r>
+      <w:proofErr w:type="spellStart"/>
+      <w:r>
+        <w:rPr>
+          <w:rFonts w:cs="Helvetica Neue"/>
+          <w:color w:val="000000"/>
+          <w:kern w:val="0"/>
+          <w:lang w:val="nl-NL"/>
+        </w:rPr>
+        <w:t>requirement</w:t>
+      </w:r>
+      <w:proofErr w:type="spellEnd"/>
+      <w:r>
+        <w:rPr>
+          <w:rFonts w:cs="Helvetica Neue"/>
+          <w:color w:val="000000"/>
+          <w:kern w:val="0"/>
+          <w:lang w:val="nl-NL"/>
+        </w:rPr>
+        <w:t xml:space="preserve"> verwijst naar een eis van de opdrachtgever die is uitgewerkt in </w:t>
+      </w:r>
       <w:r>
         <w:rPr>
           <w:rFonts w:cs="Helvetica Neue"/>
@@ -2466,16 +3094,103 @@
           <w:bCs/>
           <w:color w:val="000000"/>
           <w:kern w:val="0"/>
+          <w:u w:val="single"/>
+          <w:lang w:val="nl-NL"/>
+        </w:rPr>
+        <w:t>User Story Nr. 2</w:t>
+      </w:r>
+      <w:r>
+        <w:rPr>
+          <w:rFonts w:cs="Helvetica Neue"/>
+          <w:color w:val="000000"/>
+          <w:kern w:val="0"/>
+          <w:lang w:val="nl-NL"/>
+        </w:rPr>
+        <w:t xml:space="preserve"> in de </w:t>
+      </w:r>
+      <w:r>
+        <w:rPr>
+          <w:rFonts w:cs="Helvetica Neue"/>
+          <w:b/>
+          <w:bCs/>
+          <w:color w:val="000000"/>
+          <w:kern w:val="0"/>
+          <w:u w:val="single"/>
+          <w:lang w:val="nl-NL"/>
+        </w:rPr>
+        <w:t xml:space="preserve">Product </w:t>
+      </w:r>
+      <w:proofErr w:type="spellStart"/>
+      <w:r>
+        <w:rPr>
+          <w:rFonts w:cs="Helvetica Neue"/>
+          <w:b/>
+          <w:bCs/>
+          <w:color w:val="000000"/>
+          <w:kern w:val="0"/>
+          <w:u w:val="single"/>
+          <w:lang w:val="nl-NL"/>
+        </w:rPr>
+        <w:t>Backlog</w:t>
+      </w:r>
+      <w:proofErr w:type="spellEnd"/>
+      <w:r>
+        <w:rPr>
+          <w:rFonts w:cs="Helvetica Neue"/>
+          <w:color w:val="000000"/>
+          <w:kern w:val="0"/>
+          <w:lang w:val="nl-NL"/>
+        </w:rPr>
+        <w:t>, in het geval van financiële beperkingen was er een vrije keuze en was het budget te bepalen met de opdrachtgever.</w:t>
+      </w:r>
+    </w:p>
+    <w:p>
+      <w:pPr>
+        <w:rPr>
+          <w:rFonts w:cs="Helvetica Neue"/>
+          <w:color w:val="000000"/>
+          <w:kern w:val="0"/>
+          <w:lang w:val="nl-NL"/>
+        </w:rPr>
+      </w:pPr>
+    </w:p>
+    <w:p>
+      <w:pPr>
+        <w:tabs>
+          <w:tab w:val="right" w:pos="9020"/>
+        </w:tabs>
+        <w:autoSpaceDE w:val="0"/>
+        <w:autoSpaceDN w:val="0"/>
+        <w:adjustRightInd w:val="0"/>
+        <w:spacing w:after="0" w:line="240" w:lineRule="auto"/>
+        <w:rPr>
+          <w:rFonts w:cs="Helvetica Neue"/>
+          <w:b/>
+          <w:bCs/>
+          <w:color w:val="000000"/>
+          <w:kern w:val="0"/>
           <w:sz w:val="28"/>
           <w:szCs w:val="28"/>
           <w:lang w:val="nl-NL"/>
         </w:rPr>
+      </w:pPr>
+      <w:r>
+        <w:rPr>
+          <w:rFonts w:cs="Helvetica Neue"/>
+          <w:b/>
+          <w:bCs/>
+          <w:color w:val="000000"/>
+          <w:kern w:val="0"/>
+          <w:sz w:val="28"/>
+          <w:szCs w:val="28"/>
+          <w:lang w:val="nl-NL"/>
+        </w:rPr>
         <w:t>Betrokken componenten:</w:t>
       </w:r>
     </w:p>
     <w:p>
       <w:pPr>
-        <w:pStyle w:val="Lijstalinea"/>
+        <w:pStyle w:val="ListParagraph"/>
         <w:numPr>
           <w:ilvl w:val="0"/>
           <w:numId w:val="19"/>
@@ -2499,410 +3214,6 @@
           <w:color w:val="000000"/>
           <w:kern w:val="0"/>
         </w:rPr>
-        <w:t>Camera (Arducam of Waveshare stereocamera)</w:t>
-      </w:r>
-    </w:p>
-    <w:p>
-      <w:pPr>
-        <w:pStyle w:val="Lijstalinea"/>
-        <w:numPr>
-          <w:ilvl w:val="0"/>
-          <w:numId w:val="19"/>
-        </w:numPr>
-        <w:tabs>
-          <w:tab w:val="right" w:pos="9020"/>
-        </w:tabs>
-        <w:autoSpaceDE w:val="0"/>
-        <w:autoSpaceDN w:val="0"/>
-        <w:adjustRightInd w:val="0"/>
-        <w:spacing w:after="0" w:line="240" w:lineRule="auto"/>
-        <w:rPr>
-          <w:rFonts w:cs="Helvetica Neue"/>
-          <w:color w:val="000000"/>
-          <w:kern w:val="0"/>
-          <w:lang w:val="nl-NL"/>
-        </w:rPr>
-      </w:pPr>
-      <w:r>
-        <w:rPr>
-          <w:rFonts w:cs="Helvetica Neue"/>
-          <w:color w:val="000000"/>
-          <w:kern w:val="0"/>
-          <w:lang w:val="nl-NL"/>
-        </w:rPr>
-        <w:t>Raspberry Pi 5</w:t>
-      </w:r>
-    </w:p>
-    <w:p>
-      <w:pPr>
-        <w:pStyle w:val="Lijstalinea"/>
-        <w:numPr>
-          <w:ilvl w:val="0"/>
-          <w:numId w:val="19"/>
-        </w:numPr>
-        <w:tabs>
-          <w:tab w:val="right" w:pos="9020"/>
-        </w:tabs>
-        <w:autoSpaceDE w:val="0"/>
-        <w:autoSpaceDN w:val="0"/>
-        <w:adjustRightInd w:val="0"/>
-        <w:spacing w:after="0" w:line="240" w:lineRule="auto"/>
-        <w:rPr>
-          <w:rFonts w:cs="Helvetica Neue"/>
-          <w:color w:val="000000"/>
-          <w:kern w:val="0"/>
-          <w:lang w:val="nl-NL"/>
-        </w:rPr>
-      </w:pPr>
-      <w:r>
-        <w:rPr>
-          <w:rFonts w:cs="Helvetica Neue"/>
-          <w:color w:val="000000"/>
-          <w:kern w:val="0"/>
-          <w:lang w:val="nl-NL"/>
-        </w:rPr>
-        <w:t>Python met Opencv</w:t>
-      </w:r>
-    </w:p>
-    <w:p>
-      <w:pPr>
-        <w:tabs>
-          <w:tab w:val="right" w:pos="9020"/>
-        </w:tabs>
-        <w:autoSpaceDE w:val="0"/>
-        <w:autoSpaceDN w:val="0"/>
-        <w:adjustRightInd w:val="0"/>
-        <w:spacing w:after="0" w:line="240" w:lineRule="auto"/>
-        <w:rPr>
-          <w:rFonts w:cs="Helvetica Neue"/>
-          <w:color w:val="000000"/>
-          <w:kern w:val="0"/>
-          <w:lang w:val="nl-NL"/>
-        </w:rPr>
-      </w:pPr>
-    </w:p>
-    <w:p>
-      <w:pPr>
-        <w:tabs>
-          <w:tab w:val="right" w:pos="9020"/>
-        </w:tabs>
-        <w:autoSpaceDE w:val="0"/>
-        <w:autoSpaceDN w:val="0"/>
-        <w:adjustRightInd w:val="0"/>
-        <w:spacing w:after="0" w:line="240" w:lineRule="auto"/>
-        <w:rPr>
-          <w:rFonts w:cs="Helvetica Neue"/>
-          <w:b/>
-          <w:bCs/>
-          <w:color w:val="000000"/>
-          <w:kern w:val="0"/>
-          <w:sz w:val="28"/>
-          <w:szCs w:val="28"/>
-          <w:lang w:val="nl-NL"/>
-        </w:rPr>
-      </w:pPr>
-    </w:p>
-    <w:p>
-      <w:pPr>
-        <w:tabs>
-          <w:tab w:val="right" w:pos="9020"/>
-        </w:tabs>
-        <w:autoSpaceDE w:val="0"/>
-        <w:autoSpaceDN w:val="0"/>
-        <w:adjustRightInd w:val="0"/>
-        <w:spacing w:after="0" w:line="240" w:lineRule="auto"/>
-        <w:rPr>
-          <w:rFonts w:cs="Helvetica Neue"/>
-          <w:b/>
-          <w:bCs/>
-          <w:color w:val="000000"/>
-          <w:kern w:val="0"/>
-          <w:sz w:val="28"/>
-          <w:szCs w:val="28"/>
-          <w:lang w:val="nl-NL"/>
-        </w:rPr>
-      </w:pPr>
-      <w:r>
-        <w:rPr>
-          <w:rFonts w:cs="Helvetica Neue"/>
-          <w:b/>
-          <w:bCs/>
-          <w:color w:val="000000"/>
-          <w:kern w:val="0"/>
-          <w:sz w:val="28"/>
-          <w:szCs w:val="28"/>
-          <w:lang w:val="nl-NL"/>
-        </w:rPr>
-        <w:t xml:space="preserve">Test: </w:t>
-      </w:r>
-    </w:p>
-    <w:p>
-      <w:pPr>
-        <w:tabs>
-          <w:tab w:val="right" w:pos="9020"/>
-        </w:tabs>
-        <w:autoSpaceDE w:val="0"/>
-        <w:autoSpaceDN w:val="0"/>
-        <w:adjustRightInd w:val="0"/>
-        <w:spacing w:after="0" w:line="240" w:lineRule="auto"/>
-        <w:rPr>
-          <w:rFonts w:cs="Helvetica Neue"/>
-          <w:color w:val="000000"/>
-          <w:kern w:val="0"/>
-          <w:lang w:val="nl-NL"/>
-        </w:rPr>
-      </w:pPr>
-      <w:r>
-        <w:rPr>
-          <w:rFonts w:cs="Helvetica Neue"/>
-          <w:color w:val="000000"/>
-          <w:kern w:val="0"/>
-          <w:lang w:val="nl-NL"/>
-        </w:rPr>
-        <w:t>Zie Testrapport</w:t>
-      </w:r>
-      <w:r>
-        <w:rPr>
-          <w:rFonts w:cs="Helvetica Neue"/>
-          <w:color w:val="000000"/>
-          <w:kern w:val="0"/>
-          <w:lang w:val="nl-NL"/>
-        </w:rPr>
-        <w:t xml:space="preserve"> Test </w:t>
-      </w:r>
-      <w:r>
-        <w:rPr>
-          <w:rFonts w:cs="Helvetica Neue"/>
-          <w:color w:val="000000"/>
-          <w:kern w:val="0"/>
-          <w:lang w:val="nl-NL"/>
-        </w:rPr>
-        <w:t>2</w:t>
-      </w:r>
-      <w:r>
-        <w:rPr>
-          <w:rFonts w:cs="Helvetica Neue"/>
-          <w:color w:val="000000"/>
-          <w:kern w:val="0"/>
-          <w:lang w:val="nl-NL"/>
-        </w:rPr>
-        <w:t>: ‘Object Detectie’</w:t>
-      </w:r>
-    </w:p>
-    <w:p>
-      <w:pPr>
-        <w:tabs>
-          <w:tab w:val="right" w:pos="9020"/>
-        </w:tabs>
-        <w:autoSpaceDE w:val="0"/>
-        <w:autoSpaceDN w:val="0"/>
-        <w:adjustRightInd w:val="0"/>
-        <w:spacing w:after="0" w:line="240" w:lineRule="auto"/>
-        <w:rPr>
-          <w:rFonts w:cs="Helvetica Neue"/>
-          <w:color w:val="000000"/>
-          <w:kern w:val="0"/>
-          <w:lang w:val="nl-NL"/>
-        </w:rPr>
-      </w:pPr>
-    </w:p>
-    <w:p>
-      <w:pPr>
-        <w:tabs>
-          <w:tab w:val="right" w:pos="9020"/>
-        </w:tabs>
-        <w:autoSpaceDE w:val="0"/>
-        <w:autoSpaceDN w:val="0"/>
-        <w:adjustRightInd w:val="0"/>
-        <w:spacing w:after="0" w:line="240" w:lineRule="auto"/>
-        <w:rPr>
-          <w:rFonts w:cs="Helvetica Neue"/>
-          <w:b/>
-          <w:bCs/>
-          <w:color w:val="000000"/>
-          <w:kern w:val="0"/>
-          <w:sz w:val="28"/>
-          <w:szCs w:val="28"/>
-          <w:lang w:val="nl-NL"/>
-        </w:rPr>
-      </w:pPr>
-    </w:p>
-    <w:p>
-      <w:pPr>
-        <w:pStyle w:val="Style3"/>
-        <w:rPr>
-          <w:rFonts w:asciiTheme="minorHAnsi" w:hAnsiTheme="minorHAnsi"/>
-          <w:color w:val="215E99" w:themeColor="text2" w:themeTint="BF"/>
-        </w:rPr>
-      </w:pPr>
-      <w:bookmarkStart w:id="4" w:name="_Toc214218435"/>
-      <w:r>
-        <w:rPr>
-          <w:rFonts w:asciiTheme="minorHAnsi" w:hAnsiTheme="minorHAnsi"/>
-          <w:color w:val="215E99" w:themeColor="text2" w:themeTint="BF"/>
-        </w:rPr>
-        <w:t>RQ02: Gebruikersinterface (Functioneel (Prioriteit P1))</w:t>
-      </w:r>
-      <w:bookmarkEnd w:id="4"/>
-    </w:p>
-    <w:p>
-      <w:pPr>
-        <w:rPr>
-          <w:i/>
-          <w:iCs/>
-          <w:lang w:val="nl-NL"/>
-        </w:rPr>
-      </w:pPr>
-      <w:r>
-        <w:rPr>
-          <w:rFonts w:cs="Helvetica Neue"/>
-          <w:i/>
-          <w:iCs/>
-          <w:color w:val="000000"/>
-          <w:kern w:val="0"/>
-          <w:lang w:val="nl-NL"/>
-        </w:rPr>
-        <w:t>Er wordt een Graphical User Interface (GUI) aangemaakt die de real-time beeld, afstand en positie kan laten zien door middel van de data van de Raspberry Pi 5 op te nemen.</w:t>
-      </w:r>
-    </w:p>
-    <w:p>
-      <w:pPr>
-        <w:tabs>
-          <w:tab w:val="right" w:pos="9020"/>
-        </w:tabs>
-        <w:autoSpaceDE w:val="0"/>
-        <w:autoSpaceDN w:val="0"/>
-        <w:adjustRightInd w:val="0"/>
-        <w:spacing w:after="0" w:line="240" w:lineRule="auto"/>
-        <w:rPr>
-          <w:rFonts w:cs="Helvetica Neue"/>
-          <w:color w:val="000000"/>
-          <w:kern w:val="0"/>
-          <w:lang w:val="nl-NL"/>
-        </w:rPr>
-      </w:pPr>
-      <w:r>
-        <w:rPr>
-          <w:rFonts w:cs="Helvetica Neue"/>
-          <w:color w:val="000000"/>
-          <w:kern w:val="0"/>
-          <w:lang w:val="nl-NL"/>
-        </w:rPr>
-        <w:t xml:space="preserve">Deze requirement verwijst naar een eis van de opdrachtgever die is uitgewerkt in </w:t>
-      </w:r>
-      <w:r>
-        <w:rPr>
-          <w:rFonts w:cs="Helvetica Neue"/>
-          <w:b/>
-          <w:bCs/>
-          <w:color w:val="000000"/>
-          <w:kern w:val="0"/>
-          <w:u w:val="single"/>
-          <w:lang w:val="nl-NL"/>
-        </w:rPr>
-        <w:t>User Story Nr. 2</w:t>
-      </w:r>
-      <w:r>
-        <w:rPr>
-          <w:rFonts w:cs="Helvetica Neue"/>
-          <w:color w:val="000000"/>
-          <w:kern w:val="0"/>
-          <w:lang w:val="nl-NL"/>
-        </w:rPr>
-        <w:t xml:space="preserve"> in de </w:t>
-      </w:r>
-      <w:r>
-        <w:rPr>
-          <w:rFonts w:cs="Helvetica Neue"/>
-          <w:b/>
-          <w:bCs/>
-          <w:color w:val="000000"/>
-          <w:kern w:val="0"/>
-          <w:u w:val="single"/>
-          <w:lang w:val="nl-NL"/>
-        </w:rPr>
-        <w:t>Product Backlog</w:t>
-      </w:r>
-      <w:r>
-        <w:rPr>
-          <w:rFonts w:cs="Helvetica Neue"/>
-          <w:color w:val="000000"/>
-          <w:kern w:val="0"/>
-          <w:lang w:val="nl-NL"/>
-        </w:rPr>
-        <w:t>, in het geval van financiële beperkingen was er een vrije keuze en was het budget te bepalen met de opdrachtgever.</w:t>
-      </w:r>
-    </w:p>
-    <w:p>
-      <w:pPr>
-        <w:rPr>
-          <w:rFonts w:cs="Helvetica Neue"/>
-          <w:color w:val="000000"/>
-          <w:kern w:val="0"/>
-          <w:lang w:val="nl-NL"/>
-        </w:rPr>
-      </w:pPr>
-    </w:p>
-    <w:p>
-      <w:pPr>
-        <w:tabs>
-          <w:tab w:val="right" w:pos="9020"/>
-        </w:tabs>
-        <w:autoSpaceDE w:val="0"/>
-        <w:autoSpaceDN w:val="0"/>
-        <w:adjustRightInd w:val="0"/>
-        <w:spacing w:after="0" w:line="240" w:lineRule="auto"/>
-        <w:rPr>
-          <w:rFonts w:cs="Helvetica Neue"/>
-          <w:b/>
-          <w:bCs/>
-          <w:color w:val="000000"/>
-          <w:kern w:val="0"/>
-          <w:sz w:val="28"/>
-          <w:szCs w:val="28"/>
-          <w:lang w:val="nl-NL"/>
-        </w:rPr>
-      </w:pPr>
-      <w:r>
-        <w:rPr>
-          <w:rFonts w:cs="Helvetica Neue"/>
-          <w:b/>
-          <w:bCs/>
-          <w:color w:val="000000"/>
-          <w:kern w:val="0"/>
-          <w:sz w:val="28"/>
-          <w:szCs w:val="28"/>
-          <w:lang w:val="nl-NL"/>
-        </w:rPr>
-        <w:t>Betrokken componenten:</w:t>
-      </w:r>
-    </w:p>
-    <w:p>
-      <w:pPr>
-        <w:pStyle w:val="Lijstalinea"/>
-        <w:numPr>
-          <w:ilvl w:val="0"/>
-          <w:numId w:val="19"/>
-        </w:numPr>
-        <w:tabs>
-          <w:tab w:val="right" w:pos="9020"/>
-        </w:tabs>
-        <w:autoSpaceDE w:val="0"/>
-        <w:autoSpaceDN w:val="0"/>
-        <w:adjustRightInd w:val="0"/>
-        <w:spacing w:after="0" w:line="240" w:lineRule="auto"/>
-        <w:rPr>
-          <w:rFonts w:cs="Helvetica Neue"/>
-          <w:color w:val="000000"/>
-          <w:kern w:val="0"/>
-        </w:rPr>
-      </w:pPr>
-      <w:r>
-        <w:rPr>
-          <w:rFonts w:cs="Helvetica Neue"/>
-          <w:color w:val="000000"/>
-          <w:kern w:val="0"/>
-        </w:rPr>
         <w:t xml:space="preserve">GUI </w:t>
       </w:r>
       <w:r>
@@ -2920,12 +3231,48 @@
           <w:color w:val="000000"/>
           <w:kern w:val="0"/>
         </w:rPr>
-        <w:t>in Python (Tkinter, PyQt of OpenCV GUI)</w:t>
-      </w:r>
-    </w:p>
-    <w:p>
-      <w:pPr>
-        <w:pStyle w:val="Lijstalinea"/>
+        <w:t>in Python (</w:t>
+      </w:r>
+      <w:proofErr w:type="spellStart"/>
+      <w:r>
+        <w:rPr>
+          <w:rFonts w:cs="Helvetica Neue"/>
+          <w:color w:val="000000"/>
+          <w:kern w:val="0"/>
+        </w:rPr>
+        <w:t>Tkinter</w:t>
+      </w:r>
+      <w:proofErr w:type="spellEnd"/>
+      <w:r>
+        <w:rPr>
+          <w:rFonts w:cs="Helvetica Neue"/>
+          <w:color w:val="000000"/>
+          <w:kern w:val="0"/>
+        </w:rPr>
+        <w:t xml:space="preserve">, </w:t>
+      </w:r>
+      <w:proofErr w:type="spellStart"/>
+      <w:r>
+        <w:rPr>
+          <w:rFonts w:cs="Helvetica Neue"/>
+          <w:color w:val="000000"/>
+          <w:kern w:val="0"/>
+        </w:rPr>
+        <w:t>PyQt</w:t>
+      </w:r>
+      <w:proofErr w:type="spellEnd"/>
+      <w:r>
+        <w:rPr>
+          <w:rFonts w:cs="Helvetica Neue"/>
+          <w:color w:val="000000"/>
+          <w:kern w:val="0"/>
+        </w:rPr>
+        <w:t xml:space="preserve"> of OpenCV GUI)</w:t>
+      </w:r>
+    </w:p>
+    <w:p>
+      <w:pPr>
+        <w:pStyle w:val="ListParagraph"/>
         <w:numPr>
           <w:ilvl w:val="0"/>
           <w:numId w:val="19"/>
@@ -3163,7 +3510,27 @@
           <w:kern w:val="0"/>
           <w:lang w:val="nl-NL"/>
         </w:rPr>
-        <w:t xml:space="preserve">Deze requirement verwijst naar een eis van de opdrachtgever die is uitgewerkt in </w:t>
+        <w:t xml:space="preserve">Deze </w:t>
+      </w:r>
+      <w:proofErr w:type="spellStart"/>
+      <w:r>
+        <w:rPr>
+          <w:rFonts w:cs="Helvetica Neue"/>
+          <w:color w:val="000000"/>
+          <w:kern w:val="0"/>
+          <w:lang w:val="nl-NL"/>
+        </w:rPr>
+        <w:t>requirement</w:t>
+      </w:r>
+      <w:proofErr w:type="spellEnd"/>
+      <w:r>
+        <w:rPr>
+          <w:rFonts w:cs="Helvetica Neue"/>
+          <w:color w:val="000000"/>
+          <w:kern w:val="0"/>
+          <w:lang w:val="nl-NL"/>
+        </w:rPr>
+        <w:t xml:space="preserve"> verwijst naar een eis van de opdrachtgever die is uitgewerkt in </w:t>
       </w:r>
       <w:r>
         <w:rPr>
@@ -3196,8 +3563,22 @@
           <w:u w:val="single"/>
           <w:lang w:val="nl-NL"/>
         </w:rPr>
-        <w:t>Product Backlog</w:t>
-      </w:r>
+        <w:t xml:space="preserve">Product </w:t>
+      </w:r>
+      <w:proofErr w:type="spellStart"/>
+      <w:r>
+        <w:rPr>
+          <w:rFonts w:cs="Helvetica Neue"/>
+          <w:b/>
+          <w:bCs/>
+          <w:color w:val="000000"/>
+          <w:kern w:val="0"/>
+          <w:u w:val="single"/>
+          <w:lang w:val="nl-NL"/>
+        </w:rPr>
+        <w:t>Backlog</w:t>
+      </w:r>
+      <w:proofErr w:type="spellEnd"/>
       <w:r>
         <w:rPr>
           <w:rFonts w:cs="Helvetica Neue"/>
@@ -3251,7 +3632,7 @@
     </w:p>
     <w:p>
       <w:pPr>
-        <w:pStyle w:val="Lijstalinea"/>
+        <w:pStyle w:val="ListParagraph"/>
         <w:numPr>
           <w:ilvl w:val="0"/>
           <w:numId w:val="19"/>
@@ -3275,12 +3656,66 @@
           <w:color w:val="000000"/>
           <w:kern w:val="0"/>
         </w:rPr>
-        <w:t>Camera (Arducam of Waveshare stereocamera)</w:t>
-      </w:r>
-    </w:p>
-    <w:p>
-      <w:pPr>
-        <w:pStyle w:val="Lijstalinea"/>
+        <w:t>Camera (</w:t>
+      </w:r>
+      <w:proofErr w:type="spellStart"/>
+      <w:r>
+        <w:rPr>
+          <w:rFonts w:cs="Helvetica Neue"/>
+          <w:color w:val="000000"/>
+          <w:kern w:val="0"/>
+        </w:rPr>
+        <w:t>Arducam</w:t>
+      </w:r>
+      <w:proofErr w:type="spellEnd"/>
+      <w:r>
+        <w:rPr>
+          <w:rFonts w:cs="Helvetica Neue"/>
+          <w:color w:val="000000"/>
+          <w:kern w:val="0"/>
+        </w:rPr>
+        <w:t xml:space="preserve"> of </w:t>
+      </w:r>
+      <w:proofErr w:type="spellStart"/>
+      <w:r>
+        <w:rPr>
+          <w:rFonts w:cs="Helvetica Neue"/>
+          <w:color w:val="000000"/>
+          <w:kern w:val="0"/>
+        </w:rPr>
+        <w:t>Waveshare</w:t>
+      </w:r>
+      <w:proofErr w:type="spellEnd"/>
+      <w:r>
+        <w:rPr>
+          <w:rFonts w:cs="Helvetica Neue"/>
+          <w:color w:val="000000"/>
+          <w:kern w:val="0"/>
+        </w:rPr>
+        <w:t xml:space="preserve"> </w:t>
+      </w:r>
+      <w:proofErr w:type="spellStart"/>
+      <w:r>
+        <w:rPr>
+          <w:rFonts w:cs="Helvetica Neue"/>
+          <w:color w:val="000000"/>
+          <w:kern w:val="0"/>
+        </w:rPr>
+        <w:t>stereocamera</w:t>
+      </w:r>
+      <w:proofErr w:type="spellEnd"/>
+      <w:r>
+        <w:rPr>
+          <w:rFonts w:cs="Helvetica Neue"/>
+          <w:color w:val="000000"/>
+          <w:kern w:val="0"/>
+        </w:rPr>
+        <w:t>)</w:t>
+      </w:r>
+    </w:p>
+    <w:p>
+      <w:pPr>
+        <w:pStyle w:val="ListParagraph"/>
         <w:numPr>
           <w:ilvl w:val="0"/>
           <w:numId w:val="19"/>
@@ -3299,19 +3734,30 @@
           <w:lang w:val="nl-NL"/>
         </w:rPr>
       </w:pPr>
-      <w:r>
-        <w:rPr>
-          <w:rFonts w:cs="Helvetica Neue"/>
-          <w:color w:val="000000"/>
-          <w:kern w:val="0"/>
-          <w:lang w:val="nl-NL"/>
-        </w:rPr>
-        <w:t>Raspberry Pi 5</w:t>
-      </w:r>
-    </w:p>
-    <w:p>
-      <w:pPr>
-        <w:pStyle w:val="Lijstalinea"/>
+      <w:proofErr w:type="spellStart"/>
+      <w:r>
+        <w:rPr>
+          <w:rFonts w:cs="Helvetica Neue"/>
+          <w:color w:val="000000"/>
+          <w:kern w:val="0"/>
+          <w:lang w:val="nl-NL"/>
+        </w:rPr>
+        <w:t>Raspberry</w:t>
+      </w:r>
+      <w:proofErr w:type="spellEnd"/>
+      <w:r>
+        <w:rPr>
+          <w:rFonts w:cs="Helvetica Neue"/>
+          <w:color w:val="000000"/>
+          <w:kern w:val="0"/>
+          <w:lang w:val="nl-NL"/>
+        </w:rPr>
+        <w:t xml:space="preserve"> Pi 5</w:t>
+      </w:r>
+    </w:p>
+    <w:p>
+      <w:pPr>
+        <w:pStyle w:val="ListParagraph"/>
         <w:numPr>
           <w:ilvl w:val="0"/>
           <w:numId w:val="19"/>
@@ -3337,8 +3783,19 @@
           <w:kern w:val="0"/>
           <w:lang w:val="nl-NL"/>
         </w:rPr>
-        <w:t>Python met Opencv</w:t>
-      </w:r>
+        <w:t xml:space="preserve">Python met </w:t>
+      </w:r>
+      <w:proofErr w:type="spellStart"/>
+      <w:r>
+        <w:rPr>
+          <w:rFonts w:cs="Helvetica Neue"/>
+          <w:color w:val="000000"/>
+          <w:kern w:val="0"/>
+          <w:lang w:val="nl-NL"/>
+        </w:rPr>
+        <w:t>Opencv</w:t>
+      </w:r>
+      <w:proofErr w:type="spellEnd"/>
     </w:p>
     <w:p>
       <w:pPr>
@@ -3477,7 +3934,31 @@
           <w:kern w:val="0"/>
           <w:lang w:val="nl-NL"/>
         </w:rPr>
-        <w:t>In de GUI staat een 2D grafiek die bestaat uit lengte en breedte (x, y) die gebruik maakt van de feed van de 2 camera’s waarin de locatie van een bewegend object in realtime wordt weergegeven door het middelpunt te nemen van de detectiekader die over het object zit en dat als constante punt weer te geven in de grafiek waarvan de positie elke 0,5s wordt bijgewerkt.</w:t>
+        <w:t xml:space="preserve">In de GUI staat een 2D grafiek die bestaat uit lengte en breedte (x, y) die gebruik maakt van de feed van de 2 camera’s waarin de locatie van een bewegend object in </w:t>
+      </w:r>
+      <w:proofErr w:type="spellStart"/>
+      <w:r>
+        <w:rPr>
+          <w:rFonts w:cs="Helvetica Neue"/>
+          <w:i/>
+          <w:iCs/>
+          <w:color w:val="000000"/>
+          <w:kern w:val="0"/>
+          <w:lang w:val="nl-NL"/>
+        </w:rPr>
+        <w:t>realtime</w:t>
+      </w:r>
+      <w:proofErr w:type="spellEnd"/>
+      <w:r>
+        <w:rPr>
+          <w:rFonts w:cs="Helvetica Neue"/>
+          <w:i/>
+          <w:iCs/>
+          <w:color w:val="000000"/>
+          <w:kern w:val="0"/>
+          <w:lang w:val="nl-NL"/>
+        </w:rPr>
+        <w:t xml:space="preserve"> wordt weergegeven door het middelpunt te nemen van de detectiekader die over het object zit en dat als constante punt weer te geven in de grafiek waarvan de positie elke 0,5s wordt bijgewerkt.</w:t>
       </w:r>
     </w:p>
     <w:p>
@@ -3503,7 +3984,27 @@
           <w:kern w:val="0"/>
           <w:lang w:val="nl-NL"/>
         </w:rPr>
-        <w:t xml:space="preserve">Deze requirement verwijst naar een eis van de opdrachtgever die is uitgewerkt in </w:t>
+        <w:t xml:space="preserve">Deze </w:t>
+      </w:r>
+      <w:proofErr w:type="spellStart"/>
+      <w:r>
+        <w:rPr>
+          <w:rFonts w:cs="Helvetica Neue"/>
+          <w:color w:val="000000"/>
+          <w:kern w:val="0"/>
+          <w:lang w:val="nl-NL"/>
+        </w:rPr>
+        <w:t>requirement</w:t>
+      </w:r>
+      <w:proofErr w:type="spellEnd"/>
+      <w:r>
+        <w:rPr>
+          <w:rFonts w:cs="Helvetica Neue"/>
+          <w:color w:val="000000"/>
+          <w:kern w:val="0"/>
+          <w:lang w:val="nl-NL"/>
+        </w:rPr>
+        <w:t xml:space="preserve"> verwijst naar een eis van de opdrachtgever die is uitgewerkt in </w:t>
       </w:r>
       <w:r>
         <w:rPr>
@@ -3536,8 +4037,22 @@
           <w:u w:val="single"/>
           <w:lang w:val="nl-NL"/>
         </w:rPr>
-        <w:t>Product Backlog</w:t>
-      </w:r>
+        <w:t xml:space="preserve">Product </w:t>
+      </w:r>
+      <w:proofErr w:type="spellStart"/>
+      <w:r>
+        <w:rPr>
+          <w:rFonts w:cs="Helvetica Neue"/>
+          <w:b/>
+          <w:bCs/>
+          <w:color w:val="000000"/>
+          <w:kern w:val="0"/>
+          <w:u w:val="single"/>
+          <w:lang w:val="nl-NL"/>
+        </w:rPr>
+        <w:t>Backlog</w:t>
+      </w:r>
+      <w:proofErr w:type="spellEnd"/>
       <w:r>
         <w:rPr>
           <w:rFonts w:cs="Helvetica Neue"/>
@@ -3591,7 +4106,7 @@
     </w:p>
     <w:p>
       <w:pPr>
-        <w:pStyle w:val="Lijstalinea"/>
+        <w:pStyle w:val="ListParagraph"/>
         <w:numPr>
           <w:ilvl w:val="0"/>
           <w:numId w:val="19"/>
@@ -3615,12 +4130,66 @@
           <w:color w:val="000000"/>
           <w:kern w:val="0"/>
         </w:rPr>
-        <w:t>Camera (Arducam of Waveshare stereocamera)</w:t>
-      </w:r>
-    </w:p>
-    <w:p>
-      <w:pPr>
-        <w:pStyle w:val="Lijstalinea"/>
+        <w:t>Camera (</w:t>
+      </w:r>
+      <w:proofErr w:type="spellStart"/>
+      <w:r>
+        <w:rPr>
+          <w:rFonts w:cs="Helvetica Neue"/>
+          <w:color w:val="000000"/>
+          <w:kern w:val="0"/>
+        </w:rPr>
+        <w:t>Arducam</w:t>
+      </w:r>
+      <w:proofErr w:type="spellEnd"/>
+      <w:r>
+        <w:rPr>
+          <w:rFonts w:cs="Helvetica Neue"/>
+          <w:color w:val="000000"/>
+          <w:kern w:val="0"/>
+        </w:rPr>
+        <w:t xml:space="preserve"> of </w:t>
+      </w:r>
+      <w:proofErr w:type="spellStart"/>
+      <w:r>
+        <w:rPr>
+          <w:rFonts w:cs="Helvetica Neue"/>
+          <w:color w:val="000000"/>
+          <w:kern w:val="0"/>
+        </w:rPr>
+        <w:t>Waveshare</w:t>
+      </w:r>
+      <w:proofErr w:type="spellEnd"/>
+      <w:r>
+        <w:rPr>
+          <w:rFonts w:cs="Helvetica Neue"/>
+          <w:color w:val="000000"/>
+          <w:kern w:val="0"/>
+        </w:rPr>
+        <w:t xml:space="preserve"> </w:t>
+      </w:r>
+      <w:proofErr w:type="spellStart"/>
+      <w:r>
+        <w:rPr>
+          <w:rFonts w:cs="Helvetica Neue"/>
+          <w:color w:val="000000"/>
+          <w:kern w:val="0"/>
+        </w:rPr>
+        <w:t>stereocamera</w:t>
+      </w:r>
+      <w:proofErr w:type="spellEnd"/>
+      <w:r>
+        <w:rPr>
+          <w:rFonts w:cs="Helvetica Neue"/>
+          <w:color w:val="000000"/>
+          <w:kern w:val="0"/>
+        </w:rPr>
+        <w:t>)</w:t>
+      </w:r>
+    </w:p>
+    <w:p>
+      <w:pPr>
+        <w:pStyle w:val="ListParagraph"/>
         <w:numPr>
           <w:ilvl w:val="0"/>
           <w:numId w:val="19"/>
@@ -3651,7 +4220,7 @@
     </w:p>
     <w:p>
       <w:pPr>
-        <w:pStyle w:val="Lijstalinea"/>
+        <w:pStyle w:val="ListParagraph"/>
         <w:numPr>
           <w:ilvl w:val="0"/>
           <w:numId w:val="19"/>
@@ -3677,8 +4246,19 @@
           <w:kern w:val="0"/>
           <w:lang w:val="nl-NL"/>
         </w:rPr>
-        <w:t>Python met Opencv</w:t>
-      </w:r>
+        <w:t xml:space="preserve">Python met </w:t>
+      </w:r>
+      <w:proofErr w:type="spellStart"/>
+      <w:r>
+        <w:rPr>
+          <w:rFonts w:cs="Helvetica Neue"/>
+          <w:color w:val="000000"/>
+          <w:kern w:val="0"/>
+          <w:lang w:val="nl-NL"/>
+        </w:rPr>
+        <w:t>Opencv</w:t>
+      </w:r>
+      <w:proofErr w:type="spellEnd"/>
     </w:p>
     <w:p>
       <w:pPr>
@@ -3843,7 +4423,27 @@
           <w:kern w:val="0"/>
           <w:lang w:val="nl-NL"/>
         </w:rPr>
-        <w:t xml:space="preserve">Deze requirement verwijst naar een eis van de opdrachtgever die is uitgewerkt in </w:t>
+        <w:t xml:space="preserve">Deze </w:t>
+      </w:r>
+      <w:proofErr w:type="spellStart"/>
+      <w:r>
+        <w:rPr>
+          <w:rFonts w:cs="Helvetica Neue"/>
+          <w:color w:val="000000"/>
+          <w:kern w:val="0"/>
+          <w:lang w:val="nl-NL"/>
+        </w:rPr>
+        <w:t>requirement</w:t>
+      </w:r>
+      <w:proofErr w:type="spellEnd"/>
+      <w:r>
+        <w:rPr>
+          <w:rFonts w:cs="Helvetica Neue"/>
+          <w:color w:val="000000"/>
+          <w:kern w:val="0"/>
+          <w:lang w:val="nl-NL"/>
+        </w:rPr>
+        <w:t xml:space="preserve"> verwijst naar een eis van de opdrachtgever die is uitgewerkt in </w:t>
       </w:r>
       <w:r>
         <w:rPr>
@@ -3876,8 +4476,22 @@
           <w:u w:val="single"/>
           <w:lang w:val="nl-NL"/>
         </w:rPr>
-        <w:t>Product Backlog</w:t>
-      </w:r>
+        <w:t xml:space="preserve">Product </w:t>
+      </w:r>
+      <w:proofErr w:type="spellStart"/>
+      <w:r>
+        <w:rPr>
+          <w:rFonts w:cs="Helvetica Neue"/>
+          <w:b/>
+          <w:bCs/>
+          <w:color w:val="000000"/>
+          <w:kern w:val="0"/>
+          <w:u w:val="single"/>
+          <w:lang w:val="nl-NL"/>
+        </w:rPr>
+        <w:t>Backlog</w:t>
+      </w:r>
+      <w:proofErr w:type="spellEnd"/>
       <w:r>
         <w:rPr>
           <w:rFonts w:cs="Helvetica Neue"/>
@@ -3931,7 +4545,7 @@
     </w:p>
     <w:p>
       <w:pPr>
-        <w:pStyle w:val="Lijstalinea"/>
+        <w:pStyle w:val="ListParagraph"/>
         <w:numPr>
           <w:ilvl w:val="0"/>
           <w:numId w:val="19"/>
@@ -3955,12 +4569,66 @@
           <w:color w:val="000000"/>
           <w:kern w:val="0"/>
         </w:rPr>
-        <w:t>Camera (Arducam of Waveshare stereocamera)</w:t>
-      </w:r>
-    </w:p>
-    <w:p>
-      <w:pPr>
-        <w:pStyle w:val="Lijstalinea"/>
+        <w:t>Camera (</w:t>
+      </w:r>
+      <w:proofErr w:type="spellStart"/>
+      <w:r>
+        <w:rPr>
+          <w:rFonts w:cs="Helvetica Neue"/>
+          <w:color w:val="000000"/>
+          <w:kern w:val="0"/>
+        </w:rPr>
+        <w:t>Arducam</w:t>
+      </w:r>
+      <w:proofErr w:type="spellEnd"/>
+      <w:r>
+        <w:rPr>
+          <w:rFonts w:cs="Helvetica Neue"/>
+          <w:color w:val="000000"/>
+          <w:kern w:val="0"/>
+        </w:rPr>
+        <w:t xml:space="preserve"> of </w:t>
+      </w:r>
+      <w:proofErr w:type="spellStart"/>
+      <w:r>
+        <w:rPr>
+          <w:rFonts w:cs="Helvetica Neue"/>
+          <w:color w:val="000000"/>
+          <w:kern w:val="0"/>
+        </w:rPr>
+        <w:t>Waveshare</w:t>
+      </w:r>
+      <w:proofErr w:type="spellEnd"/>
+      <w:r>
+        <w:rPr>
+          <w:rFonts w:cs="Helvetica Neue"/>
+          <w:color w:val="000000"/>
+          <w:kern w:val="0"/>
+        </w:rPr>
+        <w:t xml:space="preserve"> </w:t>
+      </w:r>
+      <w:proofErr w:type="spellStart"/>
+      <w:r>
+        <w:rPr>
+          <w:rFonts w:cs="Helvetica Neue"/>
+          <w:color w:val="000000"/>
+          <w:kern w:val="0"/>
+        </w:rPr>
+        <w:t>stereocamera</w:t>
+      </w:r>
+      <w:proofErr w:type="spellEnd"/>
+      <w:r>
+        <w:rPr>
+          <w:rFonts w:cs="Helvetica Neue"/>
+          <w:color w:val="000000"/>
+          <w:kern w:val="0"/>
+        </w:rPr>
+        <w:t>)</w:t>
+      </w:r>
+    </w:p>
+    <w:p>
+      <w:pPr>
+        <w:pStyle w:val="ListParagraph"/>
         <w:numPr>
           <w:ilvl w:val="0"/>
           <w:numId w:val="19"/>
@@ -3979,19 +4647,30 @@
           <w:lang w:val="nl-NL"/>
         </w:rPr>
       </w:pPr>
-      <w:r>
-        <w:rPr>
-          <w:rFonts w:cs="Helvetica Neue"/>
-          <w:color w:val="000000"/>
-          <w:kern w:val="0"/>
-          <w:lang w:val="nl-NL"/>
-        </w:rPr>
-        <w:t>Raspberry Pi 5</w:t>
-      </w:r>
-    </w:p>
-    <w:p>
-      <w:pPr>
-        <w:pStyle w:val="Lijstalinea"/>
+      <w:proofErr w:type="spellStart"/>
+      <w:r>
+        <w:rPr>
+          <w:rFonts w:cs="Helvetica Neue"/>
+          <w:color w:val="000000"/>
+          <w:kern w:val="0"/>
+          <w:lang w:val="nl-NL"/>
+        </w:rPr>
+        <w:t>Raspberry</w:t>
+      </w:r>
+      <w:proofErr w:type="spellEnd"/>
+      <w:r>
+        <w:rPr>
+          <w:rFonts w:cs="Helvetica Neue"/>
+          <w:color w:val="000000"/>
+          <w:kern w:val="0"/>
+          <w:lang w:val="nl-NL"/>
+        </w:rPr>
+        <w:t xml:space="preserve"> Pi 5</w:t>
+      </w:r>
+    </w:p>
+    <w:p>
+      <w:pPr>
+        <w:pStyle w:val="ListParagraph"/>
         <w:numPr>
           <w:ilvl w:val="0"/>
           <w:numId w:val="19"/>
@@ -4189,7 +4868,27 @@
           <w:kern w:val="0"/>
           <w:lang w:val="nl-NL"/>
         </w:rPr>
-        <w:t xml:space="preserve">Deze requirement verwijst naar een eis van de opdrachtgever die is uitgewerkt in </w:t>
+        <w:t xml:space="preserve">Deze </w:t>
+      </w:r>
+      <w:proofErr w:type="spellStart"/>
+      <w:r>
+        <w:rPr>
+          <w:rFonts w:cs="Helvetica Neue"/>
+          <w:color w:val="000000"/>
+          <w:kern w:val="0"/>
+          <w:lang w:val="nl-NL"/>
+        </w:rPr>
+        <w:t>requirement</w:t>
+      </w:r>
+      <w:proofErr w:type="spellEnd"/>
+      <w:r>
+        <w:rPr>
+          <w:rFonts w:cs="Helvetica Neue"/>
+          <w:color w:val="000000"/>
+          <w:kern w:val="0"/>
+          <w:lang w:val="nl-NL"/>
+        </w:rPr>
+        <w:t xml:space="preserve"> verwijst naar een eis van de opdrachtgever die is uitgewerkt in </w:t>
       </w:r>
       <w:r>
         <w:rPr>
@@ -4222,8 +4921,22 @@
           <w:u w:val="single"/>
           <w:lang w:val="nl-NL"/>
         </w:rPr>
-        <w:t>Product Backlog</w:t>
-      </w:r>
+        <w:t xml:space="preserve">Product </w:t>
+      </w:r>
+      <w:proofErr w:type="spellStart"/>
+      <w:r>
+        <w:rPr>
+          <w:rFonts w:cs="Helvetica Neue"/>
+          <w:b/>
+          <w:bCs/>
+          <w:color w:val="000000"/>
+          <w:kern w:val="0"/>
+          <w:u w:val="single"/>
+          <w:lang w:val="nl-NL"/>
+        </w:rPr>
+        <w:t>Backlog</w:t>
+      </w:r>
+      <w:proofErr w:type="spellEnd"/>
       <w:r>
         <w:rPr>
           <w:rFonts w:cs="Helvetica Neue"/>
@@ -4277,7 +4990,7 @@
     </w:p>
     <w:p>
       <w:pPr>
-        <w:pStyle w:val="Lijstalinea"/>
+        <w:pStyle w:val="ListParagraph"/>
         <w:numPr>
           <w:ilvl w:val="0"/>
           <w:numId w:val="19"/>
@@ -4308,7 +5021,7 @@
     </w:p>
     <w:p>
       <w:pPr>
-        <w:pStyle w:val="Lijstalinea"/>
+        <w:pStyle w:val="ListParagraph"/>
         <w:numPr>
           <w:ilvl w:val="0"/>
           <w:numId w:val="19"/>
@@ -4326,7 +5039,7 @@
     </w:p>
     <w:p>
       <w:pPr>
-        <w:pStyle w:val="Lijstalinea"/>
+        <w:pStyle w:val="ListParagraph"/>
         <w:numPr>
           <w:ilvl w:val="0"/>
           <w:numId w:val="19"/>
@@ -4383,7 +5096,7 @@
     </w:p>
     <w:p>
       <w:pPr>
-        <w:pStyle w:val="Kop2"/>
+        <w:pStyle w:val="Heading2"/>
         <w:rPr>
           <w:b/>
           <w:bCs/>
@@ -4462,7 +5175,27 @@
           <w:kern w:val="0"/>
           <w:lang w:val="nl-NL"/>
         </w:rPr>
-        <w:t xml:space="preserve">Deze requirement verwijst naar een </w:t>
+        <w:t xml:space="preserve">Deze </w:t>
+      </w:r>
+      <w:proofErr w:type="spellStart"/>
+      <w:r>
+        <w:rPr>
+          <w:rFonts w:cs="Helvetica Neue"/>
+          <w:color w:val="000000"/>
+          <w:kern w:val="0"/>
+          <w:lang w:val="nl-NL"/>
+        </w:rPr>
+        <w:t>requirement</w:t>
+      </w:r>
+      <w:proofErr w:type="spellEnd"/>
+      <w:r>
+        <w:rPr>
+          <w:rFonts w:cs="Helvetica Neue"/>
+          <w:color w:val="000000"/>
+          <w:kern w:val="0"/>
+          <w:lang w:val="nl-NL"/>
+        </w:rPr>
+        <w:t xml:space="preserve"> verwijst naar een </w:t>
       </w:r>
       <w:r>
         <w:rPr>
@@ -4531,8 +5264,22 @@
           <w:u w:val="single"/>
           <w:lang w:val="nl-NL"/>
         </w:rPr>
-        <w:t>Product Backlog</w:t>
-      </w:r>
+        <w:t xml:space="preserve">Product </w:t>
+      </w:r>
+      <w:proofErr w:type="spellStart"/>
+      <w:r>
+        <w:rPr>
+          <w:rFonts w:cs="Helvetica Neue"/>
+          <w:b/>
+          <w:bCs/>
+          <w:color w:val="000000"/>
+          <w:kern w:val="0"/>
+          <w:u w:val="single"/>
+          <w:lang w:val="nl-NL"/>
+        </w:rPr>
+        <w:t>Backlog</w:t>
+      </w:r>
+      <w:proofErr w:type="spellEnd"/>
       <w:r>
         <w:rPr>
           <w:rFonts w:cs="Helvetica Neue"/>
@@ -4634,7 +5381,55 @@
           <w:kern w:val="0"/>
           <w:lang w:val="nl-NL"/>
         </w:rPr>
-        <w:t>In de GUI staat een 3D grafiek die bestaat uit lengte, breedte en diepte (x, y, z) die gebruik maakt van de feed van de 2 camera’s waarin de locatie van een bewegend object in realtime wordt weergegeven door het middelpunt te nemen van de detectiekader die over het object zit en dat als constante punt weer te geven in de grafiek waarvan de positie elke 0,5s wordt bijgewerkt en met een afwijking van ≤ 10cm voor het bepalen van de diepte.</w:t>
+        <w:t xml:space="preserve">In de GUI staat een 3D grafiek die bestaat uit lengte, breedte en diepte (x, y, </w:t>
+      </w:r>
+      <w:proofErr w:type="spellStart"/>
+      <w:r>
+        <w:rPr>
+          <w:rFonts w:cs="Helvetica Neue"/>
+          <w:i/>
+          <w:iCs/>
+          <w:color w:val="000000"/>
+          <w:kern w:val="0"/>
+          <w:lang w:val="nl-NL"/>
+        </w:rPr>
+        <w:t>z</w:t>
+      </w:r>
+      <w:proofErr w:type="spellEnd"/>
+      <w:r>
+        <w:rPr>
+          <w:rFonts w:cs="Helvetica Neue"/>
+          <w:i/>
+          <w:iCs/>
+          <w:color w:val="000000"/>
+          <w:kern w:val="0"/>
+          <w:lang w:val="nl-NL"/>
+        </w:rPr>
+        <w:t xml:space="preserve">) die gebruik maakt van de feed van de 2 camera’s waarin de locatie van een bewegend object in </w:t>
+      </w:r>
+      <w:proofErr w:type="spellStart"/>
+      <w:r>
+        <w:rPr>
+          <w:rFonts w:cs="Helvetica Neue"/>
+          <w:i/>
+          <w:iCs/>
+          <w:color w:val="000000"/>
+          <w:kern w:val="0"/>
+          <w:lang w:val="nl-NL"/>
+        </w:rPr>
+        <w:t>realtime</w:t>
+      </w:r>
+      <w:proofErr w:type="spellEnd"/>
+      <w:r>
+        <w:rPr>
+          <w:rFonts w:cs="Helvetica Neue"/>
+          <w:i/>
+          <w:iCs/>
+          <w:color w:val="000000"/>
+          <w:kern w:val="0"/>
+          <w:lang w:val="nl-NL"/>
+        </w:rPr>
+        <w:t xml:space="preserve"> wordt weergegeven door het middelpunt te nemen van de detectiekader die over het object zit en dat als constante punt weer te geven in de grafiek waarvan de positie elke 0,5s wordt bijgewerkt en met een afwijking van ≤ 10cm voor het bepalen van de diepte.</w:t>
       </w:r>
     </w:p>
     <w:p>
@@ -4672,7 +5467,27 @@
           <w:kern w:val="0"/>
           <w:lang w:val="nl-NL"/>
         </w:rPr>
-        <w:t xml:space="preserve">Deze requirement verwijst naar een </w:t>
+        <w:t xml:space="preserve">Deze </w:t>
+      </w:r>
+      <w:proofErr w:type="spellStart"/>
+      <w:r>
+        <w:rPr>
+          <w:rFonts w:cs="Helvetica Neue"/>
+          <w:color w:val="000000"/>
+          <w:kern w:val="0"/>
+          <w:lang w:val="nl-NL"/>
+        </w:rPr>
+        <w:t>requirement</w:t>
+      </w:r>
+      <w:proofErr w:type="spellEnd"/>
+      <w:r>
+        <w:rPr>
+          <w:rFonts w:cs="Helvetica Neue"/>
+          <w:color w:val="000000"/>
+          <w:kern w:val="0"/>
+          <w:lang w:val="nl-NL"/>
+        </w:rPr>
+        <w:t xml:space="preserve"> verwijst naar een </w:t>
       </w:r>
       <w:r>
         <w:rPr>
@@ -4735,8 +5550,22 @@
           <w:u w:val="single"/>
           <w:lang w:val="nl-NL"/>
         </w:rPr>
-        <w:t>Product Backlog</w:t>
-      </w:r>
+        <w:t xml:space="preserve">Product </w:t>
+      </w:r>
+      <w:proofErr w:type="spellStart"/>
+      <w:r>
+        <w:rPr>
+          <w:rFonts w:cs="Helvetica Neue"/>
+          <w:b/>
+          <w:bCs/>
+          <w:color w:val="000000"/>
+          <w:kern w:val="0"/>
+          <w:u w:val="single"/>
+          <w:lang w:val="nl-NL"/>
+        </w:rPr>
+        <w:t>Backlog</w:t>
+      </w:r>
+      <w:proofErr w:type="spellEnd"/>
       <w:r>
         <w:rPr>
           <w:rFonts w:cs="Helvetica Neue"/>
@@ -4790,7 +5619,7 @@
     </w:p>
     <w:p>
       <w:pPr>
-        <w:pStyle w:val="Lijstalinea"/>
+        <w:pStyle w:val="ListParagraph"/>
         <w:numPr>
           <w:ilvl w:val="0"/>
           <w:numId w:val="19"/>
@@ -4814,12 +5643,66 @@
           <w:color w:val="000000"/>
           <w:kern w:val="0"/>
         </w:rPr>
-        <w:t>Camera (Arducam of Waveshare stereocamera)</w:t>
-      </w:r>
-    </w:p>
-    <w:p>
-      <w:pPr>
-        <w:pStyle w:val="Lijstalinea"/>
+        <w:t>Camera (</w:t>
+      </w:r>
+      <w:proofErr w:type="spellStart"/>
+      <w:r>
+        <w:rPr>
+          <w:rFonts w:cs="Helvetica Neue"/>
+          <w:color w:val="000000"/>
+          <w:kern w:val="0"/>
+        </w:rPr>
+        <w:t>Arducam</w:t>
+      </w:r>
+      <w:proofErr w:type="spellEnd"/>
+      <w:r>
+        <w:rPr>
+          <w:rFonts w:cs="Helvetica Neue"/>
+          <w:color w:val="000000"/>
+          <w:kern w:val="0"/>
+        </w:rPr>
+        <w:t xml:space="preserve"> of </w:t>
+      </w:r>
+      <w:proofErr w:type="spellStart"/>
+      <w:r>
+        <w:rPr>
+          <w:rFonts w:cs="Helvetica Neue"/>
+          <w:color w:val="000000"/>
+          <w:kern w:val="0"/>
+        </w:rPr>
+        <w:t>Waveshare</w:t>
+      </w:r>
+      <w:proofErr w:type="spellEnd"/>
+      <w:r>
+        <w:rPr>
+          <w:rFonts w:cs="Helvetica Neue"/>
+          <w:color w:val="000000"/>
+          <w:kern w:val="0"/>
+        </w:rPr>
+        <w:t xml:space="preserve"> </w:t>
+      </w:r>
+      <w:proofErr w:type="spellStart"/>
+      <w:r>
+        <w:rPr>
+          <w:rFonts w:cs="Helvetica Neue"/>
+          <w:color w:val="000000"/>
+          <w:kern w:val="0"/>
+        </w:rPr>
+        <w:t>stereocamera</w:t>
+      </w:r>
+      <w:proofErr w:type="spellEnd"/>
+      <w:r>
+        <w:rPr>
+          <w:rFonts w:cs="Helvetica Neue"/>
+          <w:color w:val="000000"/>
+          <w:kern w:val="0"/>
+        </w:rPr>
+        <w:t>)</w:t>
+      </w:r>
+    </w:p>
+    <w:p>
+      <w:pPr>
+        <w:pStyle w:val="ListParagraph"/>
         <w:numPr>
           <w:ilvl w:val="0"/>
           <w:numId w:val="19"/>
@@ -4838,19 +5721,30 @@
           <w:lang w:val="nl-NL"/>
         </w:rPr>
       </w:pPr>
-      <w:r>
-        <w:rPr>
-          <w:rFonts w:cs="Helvetica Neue"/>
-          <w:color w:val="000000"/>
-          <w:kern w:val="0"/>
-          <w:lang w:val="nl-NL"/>
-        </w:rPr>
-        <w:t>Raspberry Pi 5</w:t>
-      </w:r>
-    </w:p>
-    <w:p>
-      <w:pPr>
-        <w:pStyle w:val="Lijstalinea"/>
+      <w:proofErr w:type="spellStart"/>
+      <w:r>
+        <w:rPr>
+          <w:rFonts w:cs="Helvetica Neue"/>
+          <w:color w:val="000000"/>
+          <w:kern w:val="0"/>
+          <w:lang w:val="nl-NL"/>
+        </w:rPr>
+        <w:t>Raspberry</w:t>
+      </w:r>
+      <w:proofErr w:type="spellEnd"/>
+      <w:r>
+        <w:rPr>
+          <w:rFonts w:cs="Helvetica Neue"/>
+          <w:color w:val="000000"/>
+          <w:kern w:val="0"/>
+          <w:lang w:val="nl-NL"/>
+        </w:rPr>
+        <w:t xml:space="preserve"> Pi 5</w:t>
+      </w:r>
+    </w:p>
+    <w:p>
+      <w:pPr>
+        <w:pStyle w:val="ListParagraph"/>
         <w:numPr>
           <w:ilvl w:val="0"/>
           <w:numId w:val="19"/>
@@ -5077,7 +5971,27 @@
           <w:kern w:val="0"/>
           <w:lang w:val="nl-NL"/>
         </w:rPr>
-        <w:t xml:space="preserve">Deze requirement verwijst naar </w:t>
+        <w:t xml:space="preserve">Deze </w:t>
+      </w:r>
+      <w:proofErr w:type="spellStart"/>
+      <w:r>
+        <w:rPr>
+          <w:rFonts w:cs="Helvetica Neue"/>
+          <w:color w:val="000000"/>
+          <w:kern w:val="0"/>
+          <w:lang w:val="nl-NL"/>
+        </w:rPr>
+        <w:t>requirement</w:t>
+      </w:r>
+      <w:proofErr w:type="spellEnd"/>
+      <w:r>
+        <w:rPr>
+          <w:rFonts w:cs="Helvetica Neue"/>
+          <w:color w:val="000000"/>
+          <w:kern w:val="0"/>
+          <w:lang w:val="nl-NL"/>
+        </w:rPr>
+        <w:t xml:space="preserve"> verwijst naar </w:t>
       </w:r>
       <w:r>
         <w:rPr>
@@ -5140,8 +6054,22 @@
           <w:u w:val="single"/>
           <w:lang w:val="nl-NL"/>
         </w:rPr>
-        <w:t>Product Backlog</w:t>
-      </w:r>
+        <w:t xml:space="preserve">Product </w:t>
+      </w:r>
+      <w:proofErr w:type="spellStart"/>
+      <w:r>
+        <w:rPr>
+          <w:rFonts w:cs="Helvetica Neue"/>
+          <w:b/>
+          <w:bCs/>
+          <w:color w:val="000000"/>
+          <w:kern w:val="0"/>
+          <w:u w:val="single"/>
+          <w:lang w:val="nl-NL"/>
+        </w:rPr>
+        <w:t>Backlog</w:t>
+      </w:r>
+      <w:proofErr w:type="spellEnd"/>
       <w:r>
         <w:rPr>
           <w:rFonts w:cs="Helvetica Neue"/>
@@ -5205,7 +6133,7 @@
     </w:p>
     <w:p>
       <w:pPr>
-        <w:pStyle w:val="Lijstalinea"/>
+        <w:pStyle w:val="ListParagraph"/>
         <w:numPr>
           <w:ilvl w:val="0"/>
           <w:numId w:val="19"/>
@@ -5223,6 +6151,7 @@
           <w:kern w:val="0"/>
         </w:rPr>
       </w:pPr>
+      <w:proofErr w:type="spellStart"/>
       <w:r>
         <w:rPr>
           <w:rFonts w:cs="Helvetica Neue"/>
@@ -5231,10 +6160,11 @@
         </w:rPr>
         <w:t>Nachtzichtcamera</w:t>
       </w:r>
-    </w:p>
-    <w:p>
-      <w:pPr>
-        <w:pStyle w:val="Lijstalinea"/>
+      <w:proofErr w:type="spellEnd"/>
+    </w:p>
+    <w:p>
+      <w:pPr>
+        <w:pStyle w:val="ListParagraph"/>
         <w:numPr>
           <w:ilvl w:val="0"/>
           <w:numId w:val="19"/>
@@ -5253,19 +6183,30 @@
           <w:lang w:val="nl-NL"/>
         </w:rPr>
       </w:pPr>
-      <w:r>
-        <w:rPr>
-          <w:rFonts w:cs="Helvetica Neue"/>
-          <w:color w:val="000000"/>
-          <w:kern w:val="0"/>
-          <w:lang w:val="nl-NL"/>
-        </w:rPr>
-        <w:t>Raspberry Pi 5</w:t>
-      </w:r>
-    </w:p>
-    <w:p>
-      <w:pPr>
-        <w:pStyle w:val="Lijstalinea"/>
+      <w:proofErr w:type="spellStart"/>
+      <w:r>
+        <w:rPr>
+          <w:rFonts w:cs="Helvetica Neue"/>
+          <w:color w:val="000000"/>
+          <w:kern w:val="0"/>
+          <w:lang w:val="nl-NL"/>
+        </w:rPr>
+        <w:t>Raspberry</w:t>
+      </w:r>
+      <w:proofErr w:type="spellEnd"/>
+      <w:r>
+        <w:rPr>
+          <w:rFonts w:cs="Helvetica Neue"/>
+          <w:color w:val="000000"/>
+          <w:kern w:val="0"/>
+          <w:lang w:val="nl-NL"/>
+        </w:rPr>
+        <w:t xml:space="preserve"> Pi 5</w:t>
+      </w:r>
+    </w:p>
+    <w:p>
+      <w:pPr>
+        <w:pStyle w:val="ListParagraph"/>
         <w:numPr>
           <w:ilvl w:val="0"/>
           <w:numId w:val="19"/>
@@ -5291,8 +6232,19 @@
           <w:kern w:val="0"/>
           <w:lang w:val="nl-NL"/>
         </w:rPr>
-        <w:t>Python met Opencv</w:t>
-      </w:r>
+        <w:t xml:space="preserve">Python met </w:t>
+      </w:r>
+      <w:proofErr w:type="spellStart"/>
+      <w:r>
+        <w:rPr>
+          <w:rFonts w:cs="Helvetica Neue"/>
+          <w:color w:val="000000"/>
+          <w:kern w:val="0"/>
+          <w:lang w:val="nl-NL"/>
+        </w:rPr>
+        <w:t>Opencv</w:t>
+      </w:r>
+      <w:proofErr w:type="spellEnd"/>
     </w:p>
     <w:p>
       <w:pPr>
@@ -5364,7 +6316,7 @@
     </w:p>
     <w:p>
       <w:pPr>
-        <w:pStyle w:val="Lijstalinea"/>
+        <w:pStyle w:val="ListParagraph"/>
         <w:numPr>
           <w:ilvl w:val="0"/>
           <w:numId w:val="19"/>
@@ -5419,7 +6371,27 @@
           <w:kern w:val="0"/>
           <w:lang w:val="nl-NL"/>
         </w:rPr>
-        <w:t xml:space="preserve">Sinds deze requirement een prioriteit heeft van </w:t>
+        <w:t xml:space="preserve">Sinds deze </w:t>
+      </w:r>
+      <w:proofErr w:type="spellStart"/>
+      <w:r>
+        <w:rPr>
+          <w:rFonts w:cs="Helvetica Neue"/>
+          <w:color w:val="000000"/>
+          <w:kern w:val="0"/>
+          <w:lang w:val="nl-NL"/>
+        </w:rPr>
+        <w:t>requirement</w:t>
+      </w:r>
+      <w:proofErr w:type="spellEnd"/>
+      <w:r>
+        <w:rPr>
+          <w:rFonts w:cs="Helvetica Neue"/>
+          <w:color w:val="000000"/>
+          <w:kern w:val="0"/>
+          <w:lang w:val="nl-NL"/>
+        </w:rPr>
+        <w:t xml:space="preserve"> een prioriteit heeft van </w:t>
       </w:r>
       <w:r>
         <w:rPr>
@@ -5439,7 +6411,47 @@
           <w:kern w:val="0"/>
           <w:lang w:val="nl-NL"/>
         </w:rPr>
-        <w:t xml:space="preserve"> is er tot nu toe geen toegevoegde eisen gesteld van deze requirement en is er dus ook geen onderzoek afgesteld voor de keuze van geschikte camera, dit zal veranderen als de requirement behandelt zou worden. Deze eisen en keuzes van camera worden dan toegevoegd aan het </w:t>
+        <w:t xml:space="preserve"> is er tot nu toe geen toegevoegde eisen gesteld van deze </w:t>
+      </w:r>
+      <w:proofErr w:type="spellStart"/>
+      <w:r>
+        <w:rPr>
+          <w:rFonts w:cs="Helvetica Neue"/>
+          <w:color w:val="000000"/>
+          <w:kern w:val="0"/>
+          <w:lang w:val="nl-NL"/>
+        </w:rPr>
+        <w:t>requirement</w:t>
+      </w:r>
+      <w:proofErr w:type="spellEnd"/>
+      <w:r>
+        <w:rPr>
+          <w:rFonts w:cs="Helvetica Neue"/>
+          <w:color w:val="000000"/>
+          <w:kern w:val="0"/>
+          <w:lang w:val="nl-NL"/>
+        </w:rPr>
+        <w:t xml:space="preserve"> en is er dus ook geen onderzoek afgesteld voor de keuze van geschikte camera, dit zal veranderen als de </w:t>
+      </w:r>
+      <w:proofErr w:type="spellStart"/>
+      <w:r>
+        <w:rPr>
+          <w:rFonts w:cs="Helvetica Neue"/>
+          <w:color w:val="000000"/>
+          <w:kern w:val="0"/>
+          <w:lang w:val="nl-NL"/>
+        </w:rPr>
+        <w:t>requirement</w:t>
+      </w:r>
+      <w:proofErr w:type="spellEnd"/>
+      <w:r>
+        <w:rPr>
+          <w:rFonts w:cs="Helvetica Neue"/>
+          <w:color w:val="000000"/>
+          <w:kern w:val="0"/>
+          <w:lang w:val="nl-NL"/>
+        </w:rPr>
+        <w:t xml:space="preserve"> behandelt zou worden. Deze eisen en keuzes van camera worden dan toegevoegd aan het </w:t>
       </w:r>
       <w:r>
         <w:rPr>
@@ -5511,6 +6523,7 @@
           <w:lang w:val="nl-NL"/>
         </w:rPr>
       </w:pPr>
+      <w:proofErr w:type="spellStart"/>
       <w:r>
         <w:rPr>
           <w:rFonts w:cs="Helvetica Neue"/>
@@ -5522,7 +6535,21 @@
           <w:szCs w:val="28"/>
           <w:lang w:val="nl-NL"/>
         </w:rPr>
-        <w:t xml:space="preserve">Testing: </w:t>
+        <w:t>Testing</w:t>
+      </w:r>
+      <w:proofErr w:type="spellEnd"/>
+      <w:r>
+        <w:rPr>
+          <w:rFonts w:cs="Helvetica Neue"/>
+          <w:b/>
+          <w:bCs/>
+          <w:color w:val="000000"/>
+          <w:kern w:val="0"/>
+          <w:sz w:val="28"/>
+          <w:szCs w:val="28"/>
+          <w:lang w:val="nl-NL"/>
+        </w:rPr>
+        <w:t xml:space="preserve">: </w:t>
       </w:r>
     </w:p>
     <w:p>
@@ -5570,7 +6597,7 @@
     </w:p>
     <w:p>
       <w:pPr>
-        <w:pStyle w:val="Lijstalinea"/>
+        <w:pStyle w:val="ListParagraph"/>
         <w:numPr>
           <w:ilvl w:val="0"/>
           <w:numId w:val="21"/>
@@ -5760,7 +6787,27 @@
           <w:kern w:val="0"/>
           <w:lang w:val="nl-NL"/>
         </w:rPr>
-        <w:t xml:space="preserve">Deze requirement verwijst naar een </w:t>
+        <w:t xml:space="preserve">Deze </w:t>
+      </w:r>
+      <w:proofErr w:type="spellStart"/>
+      <w:r>
+        <w:rPr>
+          <w:rFonts w:cs="Helvetica Neue"/>
+          <w:color w:val="000000"/>
+          <w:kern w:val="0"/>
+          <w:lang w:val="nl-NL"/>
+        </w:rPr>
+        <w:t>requirement</w:t>
+      </w:r>
+      <w:proofErr w:type="spellEnd"/>
+      <w:r>
+        <w:rPr>
+          <w:rFonts w:cs="Helvetica Neue"/>
+          <w:color w:val="000000"/>
+          <w:kern w:val="0"/>
+          <w:lang w:val="nl-NL"/>
+        </w:rPr>
+        <w:t xml:space="preserve"> verwijst naar een </w:t>
       </w:r>
       <w:r>
         <w:rPr>
@@ -5780,6 +6827,7 @@
         </w:rPr>
         <w:t xml:space="preserve">van de opdrachtgever die is uitgewerkt in </w:t>
       </w:r>
+      <w:proofErr w:type="spellStart"/>
       <w:r>
         <w:rPr>
           <w:rFonts w:cs="Helvetica Neue"/>
@@ -5790,8 +6838,9 @@
           <w:u w:val="single"/>
           <w:lang w:val="nl-NL"/>
         </w:rPr>
-        <w:t xml:space="preserve">UserStory Nr. </w:t>
-      </w:r>
+        <w:t>UserStory</w:t>
+      </w:r>
+      <w:proofErr w:type="spellEnd"/>
       <w:r>
         <w:rPr>
           <w:rFonts w:cs="Helvetica Neue"/>
@@ -5802,16 +6851,7 @@
           <w:u w:val="single"/>
           <w:lang w:val="nl-NL"/>
         </w:rPr>
-        <w:t>10</w:t>
-      </w:r>
-      <w:r>
-        <w:rPr>
-          <w:rFonts w:cs="Helvetica Neue"/>
-          <w:color w:val="000000"/>
-          <w:kern w:val="0"/>
-          <w:lang w:val="nl-NL"/>
-        </w:rPr>
-        <w:t xml:space="preserve"> in de </w:t>
+        <w:t xml:space="preserve"> Nr. </w:t>
       </w:r>
       <w:r>
         <w:rPr>
@@ -5823,8 +6863,43 @@
           <w:u w:val="single"/>
           <w:lang w:val="nl-NL"/>
         </w:rPr>
-        <w:t>Product Backlog</w:t>
-      </w:r>
+        <w:t>10</w:t>
+      </w:r>
+      <w:r>
+        <w:rPr>
+          <w:rFonts w:cs="Helvetica Neue"/>
+          <w:color w:val="000000"/>
+          <w:kern w:val="0"/>
+          <w:lang w:val="nl-NL"/>
+        </w:rPr>
+        <w:t xml:space="preserve"> in de </w:t>
+      </w:r>
+      <w:r>
+        <w:rPr>
+          <w:rFonts w:cs="Helvetica Neue"/>
+          <w:b/>
+          <w:bCs/>
+          <w:color w:val="000000"/>
+          <w:kern w:val="0"/>
+          <w:u w:val="single"/>
+          <w:lang w:val="nl-NL"/>
+        </w:rPr>
+        <w:t xml:space="preserve">Product </w:t>
+      </w:r>
+      <w:proofErr w:type="spellStart"/>
+      <w:r>
+        <w:rPr>
+          <w:rFonts w:cs="Helvetica Neue"/>
+          <w:b/>
+          <w:bCs/>
+          <w:color w:val="000000"/>
+          <w:kern w:val="0"/>
+          <w:u w:val="single"/>
+          <w:lang w:val="nl-NL"/>
+        </w:rPr>
+        <w:t>Backlog</w:t>
+      </w:r>
+      <w:proofErr w:type="spellEnd"/>
       <w:r>
         <w:rPr>
           <w:rFonts w:cs="Helvetica Neue"/>
@@ -5888,7 +6963,7 @@
     </w:p>
     <w:p>
       <w:pPr>
-        <w:pStyle w:val="Lijstalinea"/>
+        <w:pStyle w:val="ListParagraph"/>
         <w:numPr>
           <w:ilvl w:val="0"/>
           <w:numId w:val="19"/>
@@ -5906,6 +6981,7 @@
           <w:kern w:val="0"/>
         </w:rPr>
       </w:pPr>
+      <w:proofErr w:type="spellStart"/>
       <w:r>
         <w:rPr>
           <w:rFonts w:cs="Helvetica Neue"/>
@@ -5914,10 +6990,11 @@
         </w:rPr>
         <w:t>Microfoon</w:t>
       </w:r>
-    </w:p>
-    <w:p>
-      <w:pPr>
-        <w:pStyle w:val="Lijstalinea"/>
+      <w:proofErr w:type="spellEnd"/>
+    </w:p>
+    <w:p>
+      <w:pPr>
+        <w:pStyle w:val="ListParagraph"/>
         <w:numPr>
           <w:ilvl w:val="0"/>
           <w:numId w:val="19"/>
@@ -5936,19 +7013,30 @@
           <w:lang w:val="nl-NL"/>
         </w:rPr>
       </w:pPr>
-      <w:r>
-        <w:rPr>
-          <w:rFonts w:cs="Helvetica Neue"/>
-          <w:color w:val="000000"/>
-          <w:kern w:val="0"/>
-          <w:lang w:val="nl-NL"/>
-        </w:rPr>
-        <w:t>Rasberry Pi 5</w:t>
-      </w:r>
-    </w:p>
-    <w:p>
-      <w:pPr>
-        <w:pStyle w:val="Lijstalinea"/>
+      <w:proofErr w:type="spellStart"/>
+      <w:r>
+        <w:rPr>
+          <w:rFonts w:cs="Helvetica Neue"/>
+          <w:color w:val="000000"/>
+          <w:kern w:val="0"/>
+          <w:lang w:val="nl-NL"/>
+        </w:rPr>
+        <w:t>Rasberry</w:t>
+      </w:r>
+      <w:proofErr w:type="spellEnd"/>
+      <w:r>
+        <w:rPr>
+          <w:rFonts w:cs="Helvetica Neue"/>
+          <w:color w:val="000000"/>
+          <w:kern w:val="0"/>
+          <w:lang w:val="nl-NL"/>
+        </w:rPr>
+        <w:t xml:space="preserve"> Pi 5</w:t>
+      </w:r>
+    </w:p>
+    <w:p>
+      <w:pPr>
+        <w:pStyle w:val="ListParagraph"/>
         <w:numPr>
           <w:ilvl w:val="0"/>
           <w:numId w:val="19"/>
@@ -5974,8 +7062,19 @@
           <w:kern w:val="0"/>
           <w:lang w:val="nl-NL"/>
         </w:rPr>
-        <w:t>Python met Opencv</w:t>
-      </w:r>
+        <w:t xml:space="preserve">Python met </w:t>
+      </w:r>
+      <w:proofErr w:type="spellStart"/>
+      <w:r>
+        <w:rPr>
+          <w:rFonts w:cs="Helvetica Neue"/>
+          <w:color w:val="000000"/>
+          <w:kern w:val="0"/>
+          <w:lang w:val="nl-NL"/>
+        </w:rPr>
+        <w:t>Opencv</w:t>
+      </w:r>
+      <w:proofErr w:type="spellEnd"/>
     </w:p>
     <w:p>
       <w:pPr>
@@ -6047,7 +7146,7 @@
     </w:p>
     <w:p>
       <w:pPr>
-        <w:pStyle w:val="Lijstalinea"/>
+        <w:pStyle w:val="ListParagraph"/>
         <w:numPr>
           <w:ilvl w:val="0"/>
           <w:numId w:val="19"/>
@@ -6102,7 +7201,27 @@
           <w:kern w:val="0"/>
           <w:lang w:val="nl-NL"/>
         </w:rPr>
-        <w:t xml:space="preserve">Sinds deze requirement een prioriteit heeft van </w:t>
+        <w:t xml:space="preserve">Sinds deze </w:t>
+      </w:r>
+      <w:proofErr w:type="spellStart"/>
+      <w:r>
+        <w:rPr>
+          <w:rFonts w:cs="Helvetica Neue"/>
+          <w:color w:val="000000"/>
+          <w:kern w:val="0"/>
+          <w:lang w:val="nl-NL"/>
+        </w:rPr>
+        <w:t>requirement</w:t>
+      </w:r>
+      <w:proofErr w:type="spellEnd"/>
+      <w:r>
+        <w:rPr>
+          <w:rFonts w:cs="Helvetica Neue"/>
+          <w:color w:val="000000"/>
+          <w:kern w:val="0"/>
+          <w:lang w:val="nl-NL"/>
+        </w:rPr>
+        <w:t xml:space="preserve"> een prioriteit heeft van </w:t>
       </w:r>
       <w:r>
         <w:rPr>
@@ -6122,7 +7241,67 @@
           <w:kern w:val="0"/>
           <w:lang w:val="nl-NL"/>
         </w:rPr>
-        <w:t xml:space="preserve"> is er tot nu toe geen toegevoegde eisen gesteld van deze requirement en is er dus ook geen onderzoek afgesteld voor de keuze van geschikte microfoon, dit zal veranderen als de requirement behandelt zou worden. Deze eisen en keuzes van micrfoon worden dan behandelt in het dan aangemaakte verslag: </w:t>
+        <w:t xml:space="preserve"> is er tot nu toe geen toegevoegde eisen gesteld van deze </w:t>
+      </w:r>
+      <w:proofErr w:type="spellStart"/>
+      <w:r>
+        <w:rPr>
+          <w:rFonts w:cs="Helvetica Neue"/>
+          <w:color w:val="000000"/>
+          <w:kern w:val="0"/>
+          <w:lang w:val="nl-NL"/>
+        </w:rPr>
+        <w:t>requirement</w:t>
+      </w:r>
+      <w:proofErr w:type="spellEnd"/>
+      <w:r>
+        <w:rPr>
+          <w:rFonts w:cs="Helvetica Neue"/>
+          <w:color w:val="000000"/>
+          <w:kern w:val="0"/>
+          <w:lang w:val="nl-NL"/>
+        </w:rPr>
+        <w:t xml:space="preserve"> en is er dus ook geen onderzoek afgesteld voor de keuze van geschikte microfoon, dit zal veranderen als de </w:t>
+      </w:r>
+      <w:proofErr w:type="spellStart"/>
+      <w:r>
+        <w:rPr>
+          <w:rFonts w:cs="Helvetica Neue"/>
+          <w:color w:val="000000"/>
+          <w:kern w:val="0"/>
+          <w:lang w:val="nl-NL"/>
+        </w:rPr>
+        <w:t>requirement</w:t>
+      </w:r>
+      <w:proofErr w:type="spellEnd"/>
+      <w:r>
+        <w:rPr>
+          <w:rFonts w:cs="Helvetica Neue"/>
+          <w:color w:val="000000"/>
+          <w:kern w:val="0"/>
+          <w:lang w:val="nl-NL"/>
+        </w:rPr>
+        <w:t xml:space="preserve"> behandelt zou worden. Deze eisen en keuzes van </w:t>
+      </w:r>
+      <w:proofErr w:type="spellStart"/>
+      <w:r>
+        <w:rPr>
+          <w:rFonts w:cs="Helvetica Neue"/>
+          <w:color w:val="000000"/>
+          <w:kern w:val="0"/>
+          <w:lang w:val="nl-NL"/>
+        </w:rPr>
+        <w:t>micrfoon</w:t>
+      </w:r>
+      <w:proofErr w:type="spellEnd"/>
+      <w:r>
+        <w:rPr>
+          <w:rFonts w:cs="Helvetica Neue"/>
+          <w:color w:val="000000"/>
+          <w:kern w:val="0"/>
+          <w:lang w:val="nl-NL"/>
+        </w:rPr>
+        <w:t xml:space="preserve"> worden dan behandelt in het dan aangemaakte verslag: </w:t>
       </w:r>
       <w:r>
         <w:rPr>
@@ -6168,7 +7347,7 @@
     </w:p>
     <w:p>
       <w:pPr>
-        <w:pStyle w:val="Lijstalinea"/>
+        <w:pStyle w:val="ListParagraph"/>
         <w:numPr>
           <w:ilvl w:val="0"/>
           <w:numId w:val="21"/>
@@ -6186,7 +7365,7 @@
     </w:p>
     <w:tbl>
       <w:tblPr>
-        <w:tblStyle w:val="Tabelraster"/>
+        <w:tblStyle w:val="TableGrid"/>
         <w:tblpPr w:leftFromText="141" w:rightFromText="141" w:vertAnchor="text" w:horzAnchor="margin" w:tblpY="585"/>
         <w:tblW w:w="0" w:type="auto"/>
         <w:tblLook w:val="04A0" w:firstRow="1" w:lastRow="0" w:firstColumn="1" w:lastColumn="0" w:noHBand="0" w:noVBand="1"/>
@@ -9747,16 +10926,16 @@
     <w:lsdException w:name="Unresolved Mention" w:semiHidden="1" w:unhideWhenUsed="1"/>
     <w:lsdException w:name="Smart Link" w:semiHidden="1" w:unhideWhenUsed="1"/>
   </w:latentStyles>
-  <w:style w:type="paragraph" w:default="1" w:styleId="Standaard">
+  <w:style w:type="paragraph" w:default="1" w:styleId="Normal">
     <w:name w:val="Normal"/>
     <w:qFormat/>
     <w:rsid w:val="003B3700"/>
   </w:style>
-  <w:style w:type="paragraph" w:styleId="Kop1">
+  <w:style w:type="paragraph" w:styleId="Heading1">
     <w:name w:val="heading 1"/>
-    <w:basedOn w:val="Standaard"/>
-    <w:next w:val="Standaard"/>
-    <w:link w:val="Kop1Char"/>
+    <w:basedOn w:val="Normal"/>
+    <w:next w:val="Normal"/>
+    <w:link w:val="Heading1Char"/>
     <w:uiPriority w:val="9"/>
     <w:qFormat/>
     <w:rsid w:val="00F52705"/>
@@ -9773,11 +10952,11 @@
       <w:szCs w:val="40"/>
     </w:rPr>
   </w:style>
-  <w:style w:type="paragraph" w:styleId="Kop2">
+  <w:style w:type="paragraph" w:styleId="Heading2">
     <w:name w:val="heading 2"/>
-    <w:basedOn w:val="Standaard"/>
-    <w:next w:val="Standaard"/>
-    <w:link w:val="Kop2Char"/>
+    <w:basedOn w:val="Normal"/>
+    <w:next w:val="Normal"/>
+    <w:link w:val="Heading2Char"/>
     <w:uiPriority w:val="9"/>
     <w:unhideWhenUsed/>
     <w:qFormat/>
@@ -9795,11 +10974,11 @@
       <w:szCs w:val="32"/>
     </w:rPr>
   </w:style>
-  <w:style w:type="paragraph" w:styleId="Kop3">
+  <w:style w:type="paragraph" w:styleId="Heading3">
     <w:name w:val="heading 3"/>
-    <w:basedOn w:val="Standaard"/>
-    <w:next w:val="Standaard"/>
-    <w:link w:val="Kop3Char"/>
+    <w:basedOn w:val="Normal"/>
+    <w:next w:val="Normal"/>
+    <w:link w:val="Heading3Char"/>
     <w:uiPriority w:val="9"/>
     <w:semiHidden/>
     <w:unhideWhenUsed/>
@@ -9818,11 +10997,11 @@
       <w:szCs w:val="28"/>
     </w:rPr>
   </w:style>
-  <w:style w:type="paragraph" w:styleId="Kop4">
+  <w:style w:type="paragraph" w:styleId="Heading4">
     <w:name w:val="heading 4"/>
-    <w:basedOn w:val="Standaard"/>
-    <w:next w:val="Standaard"/>
-    <w:link w:val="Kop4Char"/>
+    <w:basedOn w:val="Normal"/>
+    <w:next w:val="Normal"/>
+    <w:link w:val="Heading4Char"/>
     <w:uiPriority w:val="9"/>
     <w:semiHidden/>
     <w:unhideWhenUsed/>
@@ -9841,11 +11020,11 @@
       <w:color w:val="0F4761" w:themeColor="accent1" w:themeShade="BF"/>
     </w:rPr>
   </w:style>
-  <w:style w:type="paragraph" w:styleId="Kop5">
+  <w:style w:type="paragraph" w:styleId="Heading5">
     <w:name w:val="heading 5"/>
-    <w:basedOn w:val="Standaard"/>
-    <w:next w:val="Standaard"/>
-    <w:link w:val="Kop5Char"/>
+    <w:basedOn w:val="Normal"/>
+    <w:next w:val="Normal"/>
+    <w:link w:val="Heading5Char"/>
     <w:uiPriority w:val="9"/>
     <w:semiHidden/>
     <w:unhideWhenUsed/>
@@ -9862,11 +11041,11 @@
       <w:color w:val="0F4761" w:themeColor="accent1" w:themeShade="BF"/>
     </w:rPr>
   </w:style>
-  <w:style w:type="paragraph" w:styleId="Kop6">
+  <w:style w:type="paragraph" w:styleId="Heading6">
     <w:name w:val="heading 6"/>
-    <w:basedOn w:val="Standaard"/>
-    <w:next w:val="Standaard"/>
-    <w:link w:val="Kop6Char"/>
+    <w:basedOn w:val="Normal"/>
+    <w:next w:val="Normal"/>
+    <w:link w:val="Heading6Char"/>
     <w:uiPriority w:val="9"/>
     <w:semiHidden/>
     <w:unhideWhenUsed/>
@@ -9885,11 +11064,11 @@
       <w:color w:val="595959" w:themeColor="text1" w:themeTint="A6"/>
     </w:rPr>
   </w:style>
-  <w:style w:type="paragraph" w:styleId="Kop7">
+  <w:style w:type="paragraph" w:styleId="Heading7">
     <w:name w:val="heading 7"/>
-    <w:basedOn w:val="Standaard"/>
-    <w:next w:val="Standaard"/>
-    <w:link w:val="Kop7Char"/>
+    <w:basedOn w:val="Normal"/>
+    <w:next w:val="Normal"/>
+    <w:link w:val="Heading7Char"/>
     <w:uiPriority w:val="9"/>
     <w:semiHidden/>
     <w:unhideWhenUsed/>
@@ -9906,11 +11085,11 @@
       <w:color w:val="595959" w:themeColor="text1" w:themeTint="A6"/>
     </w:rPr>
   </w:style>
-  <w:style w:type="paragraph" w:styleId="Kop8">
+  <w:style w:type="paragraph" w:styleId="Heading8">
     <w:name w:val="heading 8"/>
-    <w:basedOn w:val="Standaard"/>
-    <w:next w:val="Standaard"/>
-    <w:link w:val="Kop8Char"/>
+    <w:basedOn w:val="Normal"/>
+    <w:next w:val="Normal"/>
+    <w:link w:val="Heading8Char"/>
     <w:uiPriority w:val="9"/>
     <w:semiHidden/>
     <w:unhideWhenUsed/>
@@ -9929,11 +11108,11 @@
       <w:color w:val="272727" w:themeColor="text1" w:themeTint="D8"/>
     </w:rPr>
   </w:style>
-  <w:style w:type="paragraph" w:styleId="Kop9">
+  <w:style w:type="paragraph" w:styleId="Heading9">
     <w:name w:val="heading 9"/>
-    <w:basedOn w:val="Standaard"/>
-    <w:next w:val="Standaard"/>
-    <w:link w:val="Kop9Char"/>
+    <w:basedOn w:val="Normal"/>
+    <w:next w:val="Normal"/>
+    <w:link w:val="Heading9Char"/>
     <w:uiPriority w:val="9"/>
     <w:semiHidden/>
     <w:unhideWhenUsed/>
@@ -9950,13 +11129,13 @@
       <w:color w:val="272727" w:themeColor="text1" w:themeTint="D8"/>
     </w:rPr>
   </w:style>
-  <w:style w:type="character" w:default="1" w:styleId="Standaardalinea-lettertype">
+  <w:style w:type="character" w:default="1" w:styleId="DefaultParagraphFont">
     <w:name w:val="Default Paragraph Font"/>
     <w:uiPriority w:val="1"/>
     <w:semiHidden/>
     <w:unhideWhenUsed/>
   </w:style>
-  <w:style w:type="table" w:default="1" w:styleId="Standaardtabel">
+  <w:style w:type="table" w:default="1" w:styleId="TableNormal">
     <w:name w:val="Normal Table"/>
     <w:uiPriority w:val="99"/>
     <w:semiHidden/>
@@ -9971,16 +11150,16 @@
       </w:tblCellMar>
     </w:tblPr>
   </w:style>
-  <w:style w:type="numbering" w:default="1" w:styleId="Geenlijst">
+  <w:style w:type="numbering" w:default="1" w:styleId="NoList">
     <w:name w:val="No List"/>
     <w:uiPriority w:val="99"/>
     <w:semiHidden/>
     <w:unhideWhenUsed/>
   </w:style>
-  <w:style w:type="character" w:customStyle="1" w:styleId="Kop1Char">
-    <w:name w:val="Kop 1 Char"/>
-    <w:basedOn w:val="Standaardalinea-lettertype"/>
-    <w:link w:val="Kop1"/>
+  <w:style w:type="character" w:customStyle="1" w:styleId="Heading1Char">
+    <w:name w:val="Heading 1 Char"/>
+    <w:basedOn w:val="DefaultParagraphFont"/>
+    <w:link w:val="Heading1"/>
     <w:uiPriority w:val="9"/>
     <w:rsid w:val="00F52705"/>
     <w:rPr>
@@ -9990,10 +11169,10 @@
       <w:szCs w:val="40"/>
     </w:rPr>
   </w:style>
-  <w:style w:type="character" w:customStyle="1" w:styleId="Kop2Char">
-    <w:name w:val="Kop 2 Char"/>
-    <w:basedOn w:val="Standaardalinea-lettertype"/>
-    <w:link w:val="Kop2"/>
+  <w:style w:type="character" w:customStyle="1" w:styleId="Heading2Char">
+    <w:name w:val="Heading 2 Char"/>
+    <w:basedOn w:val="DefaultParagraphFont"/>
+    <w:link w:val="Heading2"/>
     <w:uiPriority w:val="9"/>
     <w:rsid w:val="00F52705"/>
     <w:rPr>
@@ -10003,10 +11182,10 @@
       <w:szCs w:val="32"/>
     </w:rPr>
   </w:style>
-  <w:style w:type="character" w:customStyle="1" w:styleId="Kop3Char">
-    <w:name w:val="Kop 3 Char"/>
-    <w:basedOn w:val="Standaardalinea-lettertype"/>
-    <w:link w:val="Kop3"/>
+  <w:style w:type="character" w:customStyle="1" w:styleId="Heading3Char">
+    <w:name w:val="Heading 3 Char"/>
+    <w:basedOn w:val="DefaultParagraphFont"/>
+    <w:link w:val="Heading3"/>
     <w:uiPriority w:val="9"/>
     <w:semiHidden/>
     <w:rsid w:val="00F52705"/>
@@ -10017,10 +11196,10 @@
       <w:szCs w:val="28"/>
     </w:rPr>
   </w:style>
-  <w:style w:type="character" w:customStyle="1" w:styleId="Kop4Char">
-    <w:name w:val="Kop 4 Char"/>
-    <w:basedOn w:val="Standaardalinea-lettertype"/>
-    <w:link w:val="Kop4"/>
+  <w:style w:type="character" w:customStyle="1" w:styleId="Heading4Char">
+    <w:name w:val="Heading 4 Char"/>
+    <w:basedOn w:val="DefaultParagraphFont"/>
+    <w:link w:val="Heading4"/>
     <w:uiPriority w:val="9"/>
     <w:semiHidden/>
     <w:rsid w:val="00F52705"/>
@@ -10031,10 +11210,10 @@
       <w:color w:val="0F4761" w:themeColor="accent1" w:themeShade="BF"/>
     </w:rPr>
   </w:style>
-  <w:style w:type="character" w:customStyle="1" w:styleId="Kop5Char">
-    <w:name w:val="Kop 5 Char"/>
-    <w:basedOn w:val="Standaardalinea-lettertype"/>
-    <w:link w:val="Kop5"/>
+  <w:style w:type="character" w:customStyle="1" w:styleId="Heading5Char">
+    <w:name w:val="Heading 5 Char"/>
+    <w:basedOn w:val="DefaultParagraphFont"/>
+    <w:link w:val="Heading5"/>
     <w:uiPriority w:val="9"/>
     <w:semiHidden/>
     <w:rsid w:val="00F52705"/>
@@ -10043,10 +11222,10 @@
       <w:color w:val="0F4761" w:themeColor="accent1" w:themeShade="BF"/>
     </w:rPr>
   </w:style>
-  <w:style w:type="character" w:customStyle="1" w:styleId="Kop6Char">
-    <w:name w:val="Kop 6 Char"/>
-    <w:basedOn w:val="Standaardalinea-lettertype"/>
-    <w:link w:val="Kop6"/>
+  <w:style w:type="character" w:customStyle="1" w:styleId="Heading6Char">
+    <w:name w:val="Heading 6 Char"/>
+    <w:basedOn w:val="DefaultParagraphFont"/>
+    <w:link w:val="Heading6"/>
     <w:uiPriority w:val="9"/>
     <w:semiHidden/>
     <w:rsid w:val="00F52705"/>
@@ -10057,10 +11236,10 @@
       <w:color w:val="595959" w:themeColor="text1" w:themeTint="A6"/>
     </w:rPr>
   </w:style>
-  <w:style w:type="character" w:customStyle="1" w:styleId="Kop7Char">
-    <w:name w:val="Kop 7 Char"/>
-    <w:basedOn w:val="Standaardalinea-lettertype"/>
-    <w:link w:val="Kop7"/>
+  <w:style w:type="character" w:customStyle="1" w:styleId="Heading7Char">
+    <w:name w:val="Heading 7 Char"/>
+    <w:basedOn w:val="DefaultParagraphFont"/>
+    <w:link w:val="Heading7"/>
     <w:uiPriority w:val="9"/>
     <w:semiHidden/>
     <w:rsid w:val="00F52705"/>
@@ -10069,10 +11248,10 @@
       <w:color w:val="595959" w:themeColor="text1" w:themeTint="A6"/>
     </w:rPr>
   </w:style>
-  <w:style w:type="character" w:customStyle="1" w:styleId="Kop8Char">
-    <w:name w:val="Kop 8 Char"/>
-    <w:basedOn w:val="Standaardalinea-lettertype"/>
-    <w:link w:val="Kop8"/>
+  <w:style w:type="character" w:customStyle="1" w:styleId="Heading8Char">
+    <w:name w:val="Heading 8 Char"/>
+    <w:basedOn w:val="DefaultParagraphFont"/>
+    <w:link w:val="Heading8"/>
     <w:uiPriority w:val="9"/>
     <w:semiHidden/>
     <w:rsid w:val="00F52705"/>
@@ -10083,10 +11262,10 @@
       <w:color w:val="272727" w:themeColor="text1" w:themeTint="D8"/>
     </w:rPr>
   </w:style>
-  <w:style w:type="character" w:customStyle="1" w:styleId="Kop9Char">
-    <w:name w:val="Kop 9 Char"/>
-    <w:basedOn w:val="Standaardalinea-lettertype"/>
-    <w:link w:val="Kop9"/>
+  <w:style w:type="character" w:customStyle="1" w:styleId="Heading9Char">
+    <w:name w:val="Heading 9 Char"/>
+    <w:basedOn w:val="DefaultParagraphFont"/>
+    <w:link w:val="Heading9"/>
     <w:uiPriority w:val="9"/>
     <w:semiHidden/>
     <w:rsid w:val="00F52705"/>
@@ -10095,11 +11274,11 @@
       <w:color w:val="272727" w:themeColor="text1" w:themeTint="D8"/>
     </w:rPr>
   </w:style>
-  <w:style w:type="paragraph" w:styleId="Titel">
+  <w:style w:type="paragraph" w:styleId="Title">
     <w:name w:val="Title"/>
-    <w:basedOn w:val="Standaard"/>
-    <w:next w:val="Standaard"/>
-    <w:link w:val="TitelChar"/>
+    <w:basedOn w:val="Normal"/>
+    <w:next w:val="Normal"/>
+    <w:link w:val="TitleChar"/>
     <w:uiPriority w:val="10"/>
     <w:qFormat/>
     <w:rsid w:val="00F52705"/>
@@ -10115,10 +11294,10 @@
       <w:szCs w:val="56"/>
     </w:rPr>
   </w:style>
-  <w:style w:type="character" w:customStyle="1" w:styleId="TitelChar">
-    <w:name w:val="Titel Char"/>
-    <w:basedOn w:val="Standaardalinea-lettertype"/>
-    <w:link w:val="Titel"/>
+  <w:style w:type="character" w:customStyle="1" w:styleId="TitleChar">
+    <w:name w:val="Title Char"/>
+    <w:basedOn w:val="DefaultParagraphFont"/>
+    <w:link w:val="Title"/>
     <w:uiPriority w:val="10"/>
     <w:rsid w:val="00F52705"/>
     <w:rPr>
@@ -10129,11 +11308,11 @@
       <w:szCs w:val="56"/>
     </w:rPr>
   </w:style>
-  <w:style w:type="paragraph" w:styleId="Ondertitel">
+  <w:style w:type="paragraph" w:styleId="Subtitle">
     <w:name w:val="Subtitle"/>
-    <w:basedOn w:val="Standaard"/>
-    <w:next w:val="Standaard"/>
-    <w:link w:val="OndertitelChar"/>
+    <w:basedOn w:val="Normal"/>
+    <w:next w:val="Normal"/>
+    <w:link w:val="SubtitleChar"/>
     <w:uiPriority w:val="11"/>
     <w:qFormat/>
     <w:rsid w:val="00F52705"/>
@@ -10150,10 +11329,10 @@
       <w:szCs w:val="28"/>
     </w:rPr>
   </w:style>
-  <w:style w:type="character" w:customStyle="1" w:styleId="OndertitelChar">
-    <w:name w:val="Ondertitel Char"/>
-    <w:basedOn w:val="Standaardalinea-lettertype"/>
-    <w:link w:val="Ondertitel"/>
+  <w:style w:type="character" w:customStyle="1" w:styleId="SubtitleChar">
+    <w:name w:val="Subtitle Char"/>
+    <w:basedOn w:val="DefaultParagraphFont"/>
+    <w:link w:val="Subtitle"/>
     <w:uiPriority w:val="11"/>
     <w:rsid w:val="00F52705"/>
     <w:rPr>
@@ -10164,11 +11343,11 @@
       <w:szCs w:val="28"/>
     </w:rPr>
   </w:style>
-  <w:style w:type="paragraph" w:styleId="Citaat">
+  <w:style w:type="paragraph" w:styleId="Quote">
     <w:name w:val="Quote"/>
-    <w:basedOn w:val="Standaard"/>
-    <w:next w:val="Standaard"/>
-    <w:link w:val="CitaatChar"/>
+    <w:basedOn w:val="Normal"/>
+    <w:next w:val="Normal"/>
+    <w:link w:val="QuoteChar"/>
     <w:uiPriority w:val="29"/>
     <w:qFormat/>
     <w:rsid w:val="00F52705"/>
@@ -10182,10 +11361,10 @@
       <w:color w:val="404040" w:themeColor="text1" w:themeTint="BF"/>
     </w:rPr>
   </w:style>
-  <w:style w:type="character" w:customStyle="1" w:styleId="CitaatChar">
-    <w:name w:val="Citaat Char"/>
-    <w:basedOn w:val="Standaardalinea-lettertype"/>
-    <w:link w:val="Citaat"/>
+  <w:style w:type="character" w:customStyle="1" w:styleId="QuoteChar">
+    <w:name w:val="Quote Char"/>
+    <w:basedOn w:val="DefaultParagraphFont"/>
+    <w:link w:val="Quote"/>
     <w:uiPriority w:val="29"/>
     <w:rsid w:val="00F52705"/>
     <w:rPr>
@@ -10194,9 +11373,9 @@
       <w:color w:val="404040" w:themeColor="text1" w:themeTint="BF"/>
     </w:rPr>
   </w:style>
-  <w:style w:type="paragraph" w:styleId="Lijstalinea">
+  <w:style w:type="paragraph" w:styleId="ListParagraph">
     <w:name w:val="List Paragraph"/>
-    <w:basedOn w:val="Standaard"/>
+    <w:basedOn w:val="Normal"/>
     <w:uiPriority w:val="34"/>
     <w:qFormat/>
     <w:rsid w:val="00F52705"/>
@@ -10205,9 +11384,9 @@
       <w:contextualSpacing/>
     </w:pPr>
   </w:style>
-  <w:style w:type="character" w:styleId="Intensievebenadrukking">
+  <w:style w:type="character" w:styleId="IntenseEmphasis">
     <w:name w:val="Intense Emphasis"/>
-    <w:basedOn w:val="Standaardalinea-lettertype"/>
+    <w:basedOn w:val="DefaultParagraphFont"/>
     <w:uiPriority w:val="21"/>
     <w:qFormat/>
     <w:rsid w:val="00F52705"/>
@@ -10217,11 +11396,11 @@
       <w:color w:val="0F4761" w:themeColor="accent1" w:themeShade="BF"/>
     </w:rPr>
   </w:style>
-  <w:style w:type="paragraph" w:styleId="Duidelijkcitaat">
+  <w:style w:type="paragraph" w:styleId="IntenseQuote">
     <w:name w:val="Intense Quote"/>
-    <w:basedOn w:val="Standaard"/>
-    <w:next w:val="Standaard"/>
-    <w:link w:val="DuidelijkcitaatChar"/>
+    <w:basedOn w:val="Normal"/>
+    <w:next w:val="Normal"/>
+    <w:link w:val="IntenseQuoteChar"/>
     <w:uiPriority w:val="30"/>
     <w:qFormat/>
     <w:rsid w:val="00F52705"/>
@@ -10240,10 +11419,10 @@
       <w:color w:val="0F4761" w:themeColor="accent1" w:themeShade="BF"/>
     </w:rPr>
   </w:style>
-  <w:style w:type="character" w:customStyle="1" w:styleId="DuidelijkcitaatChar">
-    <w:name w:val="Duidelijk citaat Char"/>
-    <w:basedOn w:val="Standaardalinea-lettertype"/>
-    <w:link w:val="Duidelijkcitaat"/>
+  <w:style w:type="character" w:customStyle="1" w:styleId="IntenseQuoteChar">
+    <w:name w:val="Intense Quote Char"/>
+    <w:basedOn w:val="DefaultParagraphFont"/>
+    <w:link w:val="IntenseQuote"/>
     <w:uiPriority w:val="30"/>
     <w:rsid w:val="00F52705"/>
     <w:rPr>
@@ -10252,9 +11431,9 @@
       <w:color w:val="0F4761" w:themeColor="accent1" w:themeShade="BF"/>
     </w:rPr>
   </w:style>
-  <w:style w:type="character" w:styleId="Intensieveverwijzing">
+  <w:style w:type="character" w:styleId="IntenseReference">
     <w:name w:val="Intense Reference"/>
-    <w:basedOn w:val="Standaardalinea-lettertype"/>
+    <w:basedOn w:val="DefaultParagraphFont"/>
     <w:uiPriority w:val="32"/>
     <w:qFormat/>
     <w:rsid w:val="00F52705"/>
@@ -10266,9 +11445,9 @@
       <w:spacing w:val="5"/>
     </w:rPr>
   </w:style>
-  <w:style w:type="table" w:styleId="Tabelraster">
+  <w:style w:type="table" w:styleId="TableGrid">
     <w:name w:val="Table Grid"/>
-    <w:basedOn w:val="Standaardtabel"/>
+    <w:basedOn w:val="TableNormal"/>
     <w:uiPriority w:val="39"/>
     <w:rsid w:val="00F52705"/>
     <w:pPr>
@@ -10285,9 +11464,9 @@
       </w:tblBorders>
     </w:tblPr>
   </w:style>
-  <w:style w:type="table" w:styleId="Tabelrasterlicht">
+  <w:style w:type="table" w:styleId="TableGridLight">
     <w:name w:val="Grid Table Light"/>
-    <w:basedOn w:val="Standaardtabel"/>
+    <w:basedOn w:val="TableNormal"/>
     <w:uiPriority w:val="40"/>
     <w:rsid w:val="00D53FBC"/>
     <w:pPr>
@@ -10304,9 +11483,9 @@
       </w:tblBorders>
     </w:tblPr>
   </w:style>
-  <w:style w:type="table" w:styleId="Onopgemaaktetabel1">
+  <w:style w:type="table" w:styleId="PlainTable1">
     <w:name w:val="Plain Table 1"/>
-    <w:basedOn w:val="Standaardtabel"/>
+    <w:basedOn w:val="TableNormal"/>
     <w:uiPriority w:val="41"/>
     <w:rsid w:val="005D78C6"/>
     <w:pPr>
@@ -10367,9 +11546,9 @@
       </w:tcPr>
     </w:tblStylePr>
   </w:style>
-  <w:style w:type="table" w:styleId="Onopgemaaktetabel2">
+  <w:style w:type="table" w:styleId="PlainTable2">
     <w:name w:val="Plain Table 2"/>
-    <w:basedOn w:val="Standaardtabel"/>
+    <w:basedOn w:val="TableNormal"/>
     <w:uiPriority w:val="42"/>
     <w:rsid w:val="005D78C6"/>
     <w:pPr>
@@ -10447,9 +11626,9 @@
       </w:tcPr>
     </w:tblStylePr>
   </w:style>
-  <w:style w:type="table" w:styleId="Onopgemaaktetabel3">
+  <w:style w:type="table" w:styleId="PlainTable3">
     <w:name w:val="Plain Table 3"/>
-    <w:basedOn w:val="Standaardtabel"/>
+    <w:basedOn w:val="TableNormal"/>
     <w:uiPriority w:val="43"/>
     <w:rsid w:val="005D78C6"/>
     <w:pPr>
@@ -10540,9 +11719,9 @@
       </w:tcPr>
     </w:tblStylePr>
   </w:style>
-  <w:style w:type="table" w:styleId="Onopgemaaktetabel4">
+  <w:style w:type="table" w:styleId="PlainTable4">
     <w:name w:val="Plain Table 4"/>
-    <w:basedOn w:val="Standaardtabel"/>
+    <w:basedOn w:val="TableNormal"/>
     <w:uiPriority w:val="44"/>
     <w:rsid w:val="005D78C6"/>
     <w:pPr>
@@ -10589,9 +11768,9 @@
       </w:tcPr>
     </w:tblStylePr>
   </w:style>
-  <w:style w:type="table" w:styleId="Onopgemaaktetabel5">
+  <w:style w:type="table" w:styleId="PlainTable5">
     <w:name w:val="Plain Table 5"/>
-    <w:basedOn w:val="Standaardtabel"/>
+    <w:basedOn w:val="TableNormal"/>
     <w:uiPriority w:val="45"/>
     <w:rsid w:val="005D78C6"/>
     <w:pPr>
@@ -10709,9 +11888,9 @@
       </w:tcPr>
     </w:tblStylePr>
   </w:style>
-  <w:style w:type="table" w:styleId="Rastertabel1licht">
+  <w:style w:type="table" w:styleId="GridTable1Light">
     <w:name w:val="Grid Table 1 Light"/>
-    <w:basedOn w:val="Standaardtabel"/>
+    <w:basedOn w:val="TableNormal"/>
     <w:uiPriority w:val="46"/>
     <w:rsid w:val="005D78C6"/>
     <w:pPr>
@@ -10766,9 +11945,9 @@
       </w:rPr>
     </w:tblStylePr>
   </w:style>
-  <w:style w:type="table" w:styleId="Rastertabel1licht-Accent1">
+  <w:style w:type="table" w:styleId="GridTable1Light-Accent1">
     <w:name w:val="Grid Table 1 Light Accent 1"/>
-    <w:basedOn w:val="Standaardtabel"/>
+    <w:basedOn w:val="TableNormal"/>
     <w:uiPriority w:val="46"/>
     <w:rsid w:val="005D78C6"/>
     <w:pPr>
@@ -10823,9 +12002,9 @@
       </w:rPr>
     </w:tblStylePr>
   </w:style>
-  <w:style w:type="table" w:styleId="Rastertabel1licht-Accent2">
+  <w:style w:type="table" w:styleId="GridTable1Light-Accent2">
     <w:name w:val="Grid Table 1 Light Accent 2"/>
-    <w:basedOn w:val="Standaardtabel"/>
+    <w:basedOn w:val="TableNormal"/>
     <w:uiPriority w:val="46"/>
     <w:rsid w:val="005D78C6"/>
     <w:pPr>
@@ -10880,9 +12059,9 @@
       </w:rPr>
     </w:tblStylePr>
   </w:style>
-  <w:style w:type="table" w:styleId="Rastertabel3-Accent4">
+  <w:style w:type="table" w:styleId="GridTable3-Accent4">
     <w:name w:val="Grid Table 3 Accent 4"/>
-    <w:basedOn w:val="Standaardtabel"/>
+    <w:basedOn w:val="TableNormal"/>
     <w:uiPriority w:val="48"/>
     <w:rsid w:val="005D78C6"/>
     <w:pPr>
@@ -11016,9 +12195,9 @@
       </w:tcPr>
     </w:tblStylePr>
   </w:style>
-  <w:style w:type="table" w:styleId="Rastertabel5donker">
+  <w:style w:type="table" w:styleId="GridTable5Dark">
     <w:name w:val="Grid Table 5 Dark"/>
-    <w:basedOn w:val="Standaardtabel"/>
+    <w:basedOn w:val="TableNormal"/>
     <w:uiPriority w:val="50"/>
     <w:rsid w:val="005D78C6"/>
     <w:pPr>
@@ -11122,9 +12301,9 @@
       </w:tcPr>
     </w:tblStylePr>
   </w:style>
-  <w:style w:type="table" w:styleId="Lijsttabel1licht">
+  <w:style w:type="table" w:styleId="ListTable1Light">
     <w:name w:val="List Table 1 Light"/>
-    <w:basedOn w:val="Standaardtabel"/>
+    <w:basedOn w:val="TableNormal"/>
     <w:uiPriority w:val="46"/>
     <w:rsid w:val="005D78C6"/>
     <w:pPr>
@@ -11183,9 +12362,9 @@
       </w:tcPr>
     </w:tblStylePr>
   </w:style>
-  <w:style w:type="table" w:styleId="Lijsttabel4">
+  <w:style w:type="table" w:styleId="ListTable4">
     <w:name w:val="List Table 4"/>
-    <w:basedOn w:val="Standaardtabel"/>
+    <w:basedOn w:val="TableNormal"/>
     <w:uiPriority w:val="49"/>
     <w:rsid w:val="005D78C6"/>
     <w:pPr>
@@ -11257,9 +12436,9 @@
       </w:tcPr>
     </w:tblStylePr>
   </w:style>
-  <w:style w:type="table" w:styleId="Lijsttabel5donker">
+  <w:style w:type="table" w:styleId="ListTable5Dark">
     <w:name w:val="List Table 5 Dark"/>
-    <w:basedOn w:val="Standaardtabel"/>
+    <w:basedOn w:val="TableNormal"/>
     <w:uiPriority w:val="50"/>
     <w:rsid w:val="005D78C6"/>
     <w:pPr>
@@ -11391,9 +12570,9 @@
       </w:tcPr>
     </w:tblStylePr>
   </w:style>
-  <w:style w:type="table" w:styleId="Lijsttabel5donker-Accent1">
+  <w:style w:type="table" w:styleId="ListTable5Dark-Accent1">
     <w:name w:val="List Table 5 Dark Accent 1"/>
-    <w:basedOn w:val="Standaardtabel"/>
+    <w:basedOn w:val="TableNormal"/>
     <w:uiPriority w:val="50"/>
     <w:rsid w:val="005D78C6"/>
     <w:pPr>
@@ -11525,9 +12704,9 @@
       </w:tcPr>
     </w:tblStylePr>
   </w:style>
-  <w:style w:type="table" w:styleId="Lijsttabel2">
+  <w:style w:type="table" w:styleId="ListTable2">
     <w:name w:val="List Table 2"/>
-    <w:basedOn w:val="Standaardtabel"/>
+    <w:basedOn w:val="TableNormal"/>
     <w:uiPriority w:val="47"/>
     <w:rsid w:val="005D78C6"/>
     <w:pPr>
@@ -11579,9 +12758,9 @@
       </w:tcPr>
     </w:tblStylePr>
   </w:style>
-  <w:style w:type="table" w:styleId="Rastertabel4">
+  <w:style w:type="table" w:styleId="GridTable4">
     <w:name w:val="Grid Table 4"/>
-    <w:basedOn w:val="Standaardtabel"/>
+    <w:basedOn w:val="TableNormal"/>
     <w:uiPriority w:val="49"/>
     <w:rsid w:val="005D78C6"/>
     <w:pPr>
@@ -11669,8 +12848,8 @@
   </w:style>
   <w:style w:type="paragraph" w:customStyle="1" w:styleId="Style2">
     <w:name w:val="Style2"/>
-    <w:basedOn w:val="Kop1"/>
-    <w:next w:val="Standaard"/>
+    <w:basedOn w:val="Heading1"/>
+    <w:next w:val="Normal"/>
     <w:qFormat/>
     <w:rsid w:val="001A6124"/>
     <w:rPr>
@@ -11680,8 +12859,8 @@
   </w:style>
   <w:style w:type="paragraph" w:customStyle="1" w:styleId="Style3">
     <w:name w:val="Style3"/>
-    <w:basedOn w:val="Kop2"/>
-    <w:next w:val="Standaard"/>
+    <w:basedOn w:val="Heading2"/>
+    <w:next w:val="Normal"/>
     <w:qFormat/>
     <w:rsid w:val="001A6124"/>
     <w:rPr>
@@ -11690,10 +12869,10 @@
       <w:lang w:val="nl-NL"/>
     </w:rPr>
   </w:style>
-  <w:style w:type="paragraph" w:styleId="Kopvaninhoudsopgave">
+  <w:style w:type="paragraph" w:styleId="TOCHeading">
     <w:name w:val="TOC Heading"/>
-    <w:basedOn w:val="Kop1"/>
-    <w:next w:val="Standaard"/>
+    <w:basedOn w:val="Heading1"/>
+    <w:next w:val="Normal"/>
     <w:uiPriority w:val="39"/>
     <w:unhideWhenUsed/>
     <w:qFormat/>
@@ -11711,10 +12890,10 @@
       <w14:ligatures w14:val="none"/>
     </w:rPr>
   </w:style>
-  <w:style w:type="paragraph" w:styleId="Inhopg1">
+  <w:style w:type="paragraph" w:styleId="TOC1">
     <w:name w:val="toc 1"/>
-    <w:basedOn w:val="Standaard"/>
-    <w:next w:val="Standaard"/>
+    <w:basedOn w:val="Normal"/>
+    <w:next w:val="Normal"/>
     <w:autoRedefine/>
     <w:uiPriority w:val="39"/>
     <w:unhideWhenUsed/>
@@ -11729,10 +12908,10 @@
       <w:iCs/>
     </w:rPr>
   </w:style>
-  <w:style w:type="paragraph" w:styleId="Inhopg2">
+  <w:style w:type="paragraph" w:styleId="TOC2">
     <w:name w:val="toc 2"/>
-    <w:basedOn w:val="Standaard"/>
-    <w:next w:val="Standaard"/>
+    <w:basedOn w:val="Normal"/>
+    <w:next w:val="Normal"/>
     <w:autoRedefine/>
     <w:uiPriority w:val="39"/>
     <w:unhideWhenUsed/>
@@ -11750,7 +12929,7 @@
   </w:style>
   <w:style w:type="character" w:styleId="Hyperlink">
     <w:name w:val="Hyperlink"/>
-    <w:basedOn w:val="Standaardalinea-lettertype"/>
+    <w:basedOn w:val="DefaultParagraphFont"/>
     <w:uiPriority w:val="99"/>
     <w:unhideWhenUsed/>
     <w:rsid w:val="00957DC9"/>
@@ -11759,10 +12938,10 @@
       <w:u w:val="single"/>
     </w:rPr>
   </w:style>
-  <w:style w:type="paragraph" w:styleId="Inhopg3">
+  <w:style w:type="paragraph" w:styleId="TOC3">
     <w:name w:val="toc 3"/>
-    <w:basedOn w:val="Standaard"/>
-    <w:next w:val="Standaard"/>
+    <w:basedOn w:val="Normal"/>
+    <w:next w:val="Normal"/>
     <w:autoRedefine/>
     <w:uiPriority w:val="39"/>
     <w:unhideWhenUsed/>
@@ -11776,10 +12955,10 @@
       <w:szCs w:val="20"/>
     </w:rPr>
   </w:style>
-  <w:style w:type="paragraph" w:styleId="Inhopg4">
+  <w:style w:type="paragraph" w:styleId="TOC4">
     <w:name w:val="toc 4"/>
-    <w:basedOn w:val="Standaard"/>
-    <w:next w:val="Standaard"/>
+    <w:basedOn w:val="Normal"/>
+    <w:next w:val="Normal"/>
     <w:autoRedefine/>
     <w:uiPriority w:val="39"/>
     <w:semiHidden/>
@@ -11794,10 +12973,10 @@
       <w:szCs w:val="20"/>
     </w:rPr>
   </w:style>
-  <w:style w:type="paragraph" w:styleId="Inhopg5">
+  <w:style w:type="paragraph" w:styleId="TOC5">
     <w:name w:val="toc 5"/>
-    <w:basedOn w:val="Standaard"/>
-    <w:next w:val="Standaard"/>
+    <w:basedOn w:val="Normal"/>
+    <w:next w:val="Normal"/>
     <w:autoRedefine/>
     <w:uiPriority w:val="39"/>
     <w:semiHidden/>
@@ -11812,10 +12991,10 @@
       <w:szCs w:val="20"/>
     </w:rPr>
   </w:style>
-  <w:style w:type="paragraph" w:styleId="Inhopg6">
+  <w:style w:type="paragraph" w:styleId="TOC6">
     <w:name w:val="toc 6"/>
-    <w:basedOn w:val="Standaard"/>
-    <w:next w:val="Standaard"/>
+    <w:basedOn w:val="Normal"/>
+    <w:next w:val="Normal"/>
     <w:autoRedefine/>
     <w:uiPriority w:val="39"/>
     <w:semiHidden/>
@@ -11830,10 +13009,10 @@
       <w:szCs w:val="20"/>
     </w:rPr>
   </w:style>
-  <w:style w:type="paragraph" w:styleId="Inhopg7">
+  <w:style w:type="paragraph" w:styleId="TOC7">
     <w:name w:val="toc 7"/>
-    <w:basedOn w:val="Standaard"/>
-    <w:next w:val="Standaard"/>
+    <w:basedOn w:val="Normal"/>
+    <w:next w:val="Normal"/>
     <w:autoRedefine/>
     <w:uiPriority w:val="39"/>
     <w:semiHidden/>
@@ -11848,10 +13027,10 @@
       <w:szCs w:val="20"/>
     </w:rPr>
   </w:style>
-  <w:style w:type="paragraph" w:styleId="Inhopg8">
+  <w:style w:type="paragraph" w:styleId="TOC8">
     <w:name w:val="toc 8"/>
-    <w:basedOn w:val="Standaard"/>
-    <w:next w:val="Standaard"/>
+    <w:basedOn w:val="Normal"/>
+    <w:next w:val="Normal"/>
     <w:autoRedefine/>
     <w:uiPriority w:val="39"/>
     <w:semiHidden/>
@@ -11866,10 +13045,10 @@
       <w:szCs w:val="20"/>
     </w:rPr>
   </w:style>
-  <w:style w:type="paragraph" w:styleId="Inhopg9">
+  <w:style w:type="paragraph" w:styleId="TOC9">
     <w:name w:val="toc 9"/>
-    <w:basedOn w:val="Standaard"/>
-    <w:next w:val="Standaard"/>
+    <w:basedOn w:val="Normal"/>
+    <w:next w:val="Normal"/>
     <w:autoRedefine/>
     <w:uiPriority w:val="39"/>
     <w:semiHidden/>

</xml_diff>